<commit_message>
Switch font to Meiryo for process meeting minutes
https://claude.ai/code/session_01HBPuJMpmbrXasqyXKTkHjP
</commit_message>
<xml_diff>
--- a/議事録_工程会議_20260629.docx
+++ b/議事録_工程会議_20260629.docx
@@ -9,7 +9,7 @@
       </w:pPr>
       <w:r>
         <w:rPr>
-          <w:rFonts w:ascii="MS Gothic" w:hAnsi="MS Gothic" w:eastAsia="MS Gothic"/>
+          <w:rFonts w:ascii="メイリオ" w:hAnsi="メイリオ" w:eastAsia="メイリオ"/>
           <w:b/>
           <w:color w:val="1F497D"/>
           <w:sz w:val="36"/>
@@ -24,7 +24,7 @@
       </w:pPr>
       <w:r>
         <w:rPr>
-          <w:rFonts w:ascii="MS Gothic" w:hAnsi="MS Gothic" w:eastAsia="MS Gothic"/>
+          <w:rFonts w:ascii="メイリオ" w:hAnsi="メイリオ" w:eastAsia="メイリオ"/>
           <w:b w:val="0"/>
           <w:color w:val="595959"/>
           <w:sz w:val="19"/>
@@ -53,7 +53,7 @@
             <w:r/>
             <w:r>
               <w:rPr>
-                <w:rFonts w:ascii="MS Gothic" w:hAnsi="MS Gothic" w:eastAsia="MS Gothic"/>
+                <w:rFonts w:ascii="メイリオ" w:hAnsi="メイリオ" w:eastAsia="メイリオ"/>
                 <w:b/>
                 <w:sz w:val="21"/>
               </w:rPr>
@@ -70,7 +70,7 @@
             <w:r/>
             <w:r>
               <w:rPr>
-                <w:rFonts w:ascii="MS Gothic" w:hAnsi="MS Gothic" w:eastAsia="MS Gothic"/>
+                <w:rFonts w:ascii="メイリオ" w:hAnsi="メイリオ" w:eastAsia="メイリオ"/>
                 <w:b w:val="0"/>
                 <w:sz w:val="21"/>
               </w:rPr>
@@ -90,7 +90,7 @@
             <w:r/>
             <w:r>
               <w:rPr>
-                <w:rFonts w:ascii="MS Gothic" w:hAnsi="MS Gothic" w:eastAsia="MS Gothic"/>
+                <w:rFonts w:ascii="メイリオ" w:hAnsi="メイリオ" w:eastAsia="メイリオ"/>
                 <w:b/>
                 <w:sz w:val="21"/>
               </w:rPr>
@@ -107,7 +107,7 @@
             <w:r/>
             <w:r>
               <w:rPr>
-                <w:rFonts w:ascii="MS Gothic" w:hAnsi="MS Gothic" w:eastAsia="MS Gothic"/>
+                <w:rFonts w:ascii="メイリオ" w:hAnsi="メイリオ" w:eastAsia="メイリオ"/>
                 <w:b w:val="0"/>
                 <w:sz w:val="21"/>
               </w:rPr>
@@ -127,7 +127,7 @@
             <w:r/>
             <w:r>
               <w:rPr>
-                <w:rFonts w:ascii="MS Gothic" w:hAnsi="MS Gothic" w:eastAsia="MS Gothic"/>
+                <w:rFonts w:ascii="メイリオ" w:hAnsi="メイリオ" w:eastAsia="メイリオ"/>
                 <w:b/>
                 <w:sz w:val="21"/>
               </w:rPr>
@@ -144,7 +144,7 @@
             <w:r/>
             <w:r>
               <w:rPr>
-                <w:rFonts w:ascii="MS Gothic" w:hAnsi="MS Gothic" w:eastAsia="MS Gothic"/>
+                <w:rFonts w:ascii="メイリオ" w:hAnsi="メイリオ" w:eastAsia="メイリオ"/>
                 <w:b w:val="0"/>
                 <w:sz w:val="21"/>
               </w:rPr>
@@ -161,7 +161,7 @@
       </w:pPr>
       <w:r>
         <w:rPr>
-          <w:rFonts w:ascii="MS Gothic" w:hAnsi="MS Gothic" w:eastAsia="MS Gothic"/>
+          <w:rFonts w:ascii="メイリオ" w:hAnsi="メイリオ" w:eastAsia="メイリオ"/>
           <w:b/>
           <w:color w:val="C00000"/>
           <w:sz w:val="18"/>
@@ -170,7 +170,7 @@
       </w:r>
       <w:r>
         <w:rPr>
-          <w:rFonts w:ascii="MS Gothic" w:hAnsi="MS Gothic" w:eastAsia="MS Gothic"/>
+          <w:rFonts w:ascii="メイリオ" w:hAnsi="メイリオ" w:eastAsia="メイリオ"/>
           <w:b w:val="0"/>
           <w:color w:val="C00000"/>
           <w:sz w:val="18"/>
@@ -179,7 +179,7 @@
       </w:r>
       <w:r>
         <w:rPr>
-          <w:rFonts w:ascii="MS Gothic" w:hAnsi="MS Gothic" w:eastAsia="MS Gothic"/>
+          <w:rFonts w:ascii="メイリオ" w:hAnsi="メイリオ" w:eastAsia="メイリオ"/>
           <w:b/>
           <w:color w:val="C45A11"/>
           <w:sz w:val="18"/>
@@ -188,7 +188,7 @@
       </w:r>
       <w:r>
         <w:rPr>
-          <w:rFonts w:ascii="MS Gothic" w:hAnsi="MS Gothic" w:eastAsia="MS Gothic"/>
+          <w:rFonts w:ascii="メイリオ" w:hAnsi="メイリオ" w:eastAsia="メイリオ"/>
           <w:b w:val="0"/>
           <w:color w:val="C45A11"/>
           <w:sz w:val="18"/>
@@ -205,7 +205,7 @@
       </w:pPr>
       <w:r>
         <w:rPr>
-          <w:rFonts w:ascii="MS Gothic" w:hAnsi="MS Gothic" w:eastAsia="MS Gothic"/>
+          <w:rFonts w:ascii="メイリオ" w:hAnsi="メイリオ" w:eastAsia="メイリオ"/>
           <w:b/>
           <w:color w:val="1F497D"/>
           <w:sz w:val="26"/>
@@ -219,7 +219,7 @@
       </w:pPr>
       <w:r>
         <w:rPr>
-          <w:rFonts w:ascii="MS Gothic" w:hAnsi="MS Gothic" w:eastAsia="MS Gothic"/>
+          <w:rFonts w:ascii="メイリオ" w:hAnsi="メイリオ" w:eastAsia="メイリオ"/>
           <w:b w:val="0"/>
           <w:color w:val="595959"/>
           <w:sz w:val="19"/>
@@ -251,7 +251,7 @@
             <w:r/>
             <w:r>
               <w:rPr>
-                <w:rFonts w:ascii="MS Gothic" w:hAnsi="MS Gothic" w:eastAsia="MS Gothic"/>
+                <w:rFonts w:ascii="メイリオ" w:hAnsi="メイリオ" w:eastAsia="メイリオ"/>
                 <w:b/>
                 <w:sz w:val="20"/>
               </w:rPr>
@@ -272,7 +272,7 @@
             <w:r/>
             <w:r>
               <w:rPr>
-                <w:rFonts w:ascii="MS Gothic" w:hAnsi="MS Gothic" w:eastAsia="MS Gothic"/>
+                <w:rFonts w:ascii="メイリオ" w:hAnsi="メイリオ" w:eastAsia="メイリオ"/>
                 <w:b/>
                 <w:sz w:val="20"/>
               </w:rPr>
@@ -291,7 +291,7 @@
             <w:r/>
             <w:r>
               <w:rPr>
-                <w:rFonts w:ascii="MS Gothic" w:hAnsi="MS Gothic" w:eastAsia="MS Gothic"/>
+                <w:rFonts w:ascii="メイリオ" w:hAnsi="メイリオ" w:eastAsia="メイリオ"/>
                 <w:b w:val="0"/>
                 <w:sz w:val="20"/>
               </w:rPr>
@@ -308,7 +308,7 @@
             <w:r/>
             <w:r>
               <w:rPr>
-                <w:rFonts w:ascii="MS Gothic" w:hAnsi="MS Gothic" w:eastAsia="MS Gothic"/>
+                <w:rFonts w:ascii="メイリオ" w:hAnsi="メイリオ" w:eastAsia="メイリオ"/>
                 <w:b w:val="0"/>
                 <w:sz w:val="20"/>
               </w:rPr>
@@ -327,7 +327,7 @@
             <w:r/>
             <w:r>
               <w:rPr>
-                <w:rFonts w:ascii="MS Gothic" w:hAnsi="MS Gothic" w:eastAsia="MS Gothic"/>
+                <w:rFonts w:ascii="メイリオ" w:hAnsi="メイリオ" w:eastAsia="メイリオ"/>
                 <w:b w:val="0"/>
                 <w:sz w:val="20"/>
               </w:rPr>
@@ -344,7 +344,7 @@
             <w:r/>
             <w:r>
               <w:rPr>
-                <w:rFonts w:ascii="MS Gothic" w:hAnsi="MS Gothic" w:eastAsia="MS Gothic"/>
+                <w:rFonts w:ascii="メイリオ" w:hAnsi="メイリオ" w:eastAsia="メイリオ"/>
                 <w:b w:val="0"/>
                 <w:sz w:val="20"/>
               </w:rPr>
@@ -363,7 +363,7 @@
             <w:r/>
             <w:r>
               <w:rPr>
-                <w:rFonts w:ascii="MS Gothic" w:hAnsi="MS Gothic" w:eastAsia="MS Gothic"/>
+                <w:rFonts w:ascii="メイリオ" w:hAnsi="メイリオ" w:eastAsia="メイリオ"/>
                 <w:b w:val="0"/>
                 <w:sz w:val="20"/>
               </w:rPr>
@@ -380,7 +380,7 @@
             <w:r/>
             <w:r>
               <w:rPr>
-                <w:rFonts w:ascii="MS Gothic" w:hAnsi="MS Gothic" w:eastAsia="MS Gothic"/>
+                <w:rFonts w:ascii="メイリオ" w:hAnsi="メイリオ" w:eastAsia="メイリオ"/>
                 <w:b/>
                 <w:color w:val="C00000"/>
                 <w:sz w:val="20"/>
@@ -400,7 +400,7 @@
             <w:r/>
             <w:r>
               <w:rPr>
-                <w:rFonts w:ascii="MS Gothic" w:hAnsi="MS Gothic" w:eastAsia="MS Gothic"/>
+                <w:rFonts w:ascii="メイリオ" w:hAnsi="メイリオ" w:eastAsia="メイリオ"/>
                 <w:b w:val="0"/>
                 <w:sz w:val="20"/>
               </w:rPr>
@@ -417,7 +417,7 @@
             <w:r/>
             <w:r>
               <w:rPr>
-                <w:rFonts w:ascii="MS Gothic" w:hAnsi="MS Gothic" w:eastAsia="MS Gothic"/>
+                <w:rFonts w:ascii="メイリオ" w:hAnsi="メイリオ" w:eastAsia="メイリオ"/>
                 <w:b/>
                 <w:color w:val="C45A11"/>
                 <w:sz w:val="20"/>
@@ -437,7 +437,7 @@
             <w:r/>
             <w:r>
               <w:rPr>
-                <w:rFonts w:ascii="MS Gothic" w:hAnsi="MS Gothic" w:eastAsia="MS Gothic"/>
+                <w:rFonts w:ascii="メイリオ" w:hAnsi="メイリオ" w:eastAsia="メイリオ"/>
                 <w:b w:val="0"/>
                 <w:sz w:val="20"/>
               </w:rPr>
@@ -454,7 +454,7 @@
             <w:r/>
             <w:r>
               <w:rPr>
-                <w:rFonts w:ascii="MS Gothic" w:hAnsi="MS Gothic" w:eastAsia="MS Gothic"/>
+                <w:rFonts w:ascii="メイリオ" w:hAnsi="メイリオ" w:eastAsia="メイリオ"/>
                 <w:b w:val="0"/>
                 <w:sz w:val="20"/>
               </w:rPr>
@@ -473,7 +473,7 @@
             <w:r/>
             <w:r>
               <w:rPr>
-                <w:rFonts w:ascii="MS Gothic" w:hAnsi="MS Gothic" w:eastAsia="MS Gothic"/>
+                <w:rFonts w:ascii="メイリオ" w:hAnsi="メイリオ" w:eastAsia="メイリオ"/>
                 <w:b w:val="0"/>
                 <w:sz w:val="20"/>
               </w:rPr>
@@ -490,7 +490,7 @@
             <w:r/>
             <w:r>
               <w:rPr>
-                <w:rFonts w:ascii="MS Gothic" w:hAnsi="MS Gothic" w:eastAsia="MS Gothic"/>
+                <w:rFonts w:ascii="メイリオ" w:hAnsi="メイリオ" w:eastAsia="メイリオ"/>
                 <w:b w:val="0"/>
                 <w:sz w:val="20"/>
               </w:rPr>
@@ -509,7 +509,7 @@
             <w:r/>
             <w:r>
               <w:rPr>
-                <w:rFonts w:ascii="MS Gothic" w:hAnsi="MS Gothic" w:eastAsia="MS Gothic"/>
+                <w:rFonts w:ascii="メイリオ" w:hAnsi="メイリオ" w:eastAsia="メイリオ"/>
                 <w:b w:val="0"/>
                 <w:sz w:val="20"/>
               </w:rPr>
@@ -526,7 +526,7 @@
             <w:r/>
             <w:r>
               <w:rPr>
-                <w:rFonts w:ascii="MS Gothic" w:hAnsi="MS Gothic" w:eastAsia="MS Gothic"/>
+                <w:rFonts w:ascii="メイリオ" w:hAnsi="メイリオ" w:eastAsia="メイリオ"/>
                 <w:b w:val="0"/>
                 <w:sz w:val="20"/>
               </w:rPr>
@@ -545,7 +545,7 @@
             <w:r/>
             <w:r>
               <w:rPr>
-                <w:rFonts w:ascii="MS Gothic" w:hAnsi="MS Gothic" w:eastAsia="MS Gothic"/>
+                <w:rFonts w:ascii="メイリオ" w:hAnsi="メイリオ" w:eastAsia="メイリオ"/>
                 <w:b w:val="0"/>
                 <w:sz w:val="20"/>
               </w:rPr>
@@ -562,7 +562,7 @@
             <w:r/>
             <w:r>
               <w:rPr>
-                <w:rFonts w:ascii="MS Gothic" w:hAnsi="MS Gothic" w:eastAsia="MS Gothic"/>
+                <w:rFonts w:ascii="メイリオ" w:hAnsi="メイリオ" w:eastAsia="メイリオ"/>
                 <w:b w:val="0"/>
                 <w:sz w:val="20"/>
               </w:rPr>
@@ -581,7 +581,7 @@
       </w:pPr>
       <w:r>
         <w:rPr>
-          <w:rFonts w:ascii="MS Gothic" w:hAnsi="MS Gothic" w:eastAsia="MS Gothic"/>
+          <w:rFonts w:ascii="メイリオ" w:hAnsi="メイリオ" w:eastAsia="メイリオ"/>
           <w:b/>
           <w:color w:val="1F497D"/>
           <w:sz w:val="26"/>
@@ -613,7 +613,7 @@
             <w:r/>
             <w:r>
               <w:rPr>
-                <w:rFonts w:ascii="MS Gothic" w:hAnsi="MS Gothic" w:eastAsia="MS Gothic"/>
+                <w:rFonts w:ascii="メイリオ" w:hAnsi="メイリオ" w:eastAsia="メイリオ"/>
                 <w:b/>
                 <w:sz w:val="20"/>
               </w:rPr>
@@ -634,7 +634,7 @@
             <w:r/>
             <w:r>
               <w:rPr>
-                <w:rFonts w:ascii="MS Gothic" w:hAnsi="MS Gothic" w:eastAsia="MS Gothic"/>
+                <w:rFonts w:ascii="メイリオ" w:hAnsi="メイリオ" w:eastAsia="メイリオ"/>
                 <w:b/>
                 <w:sz w:val="20"/>
               </w:rPr>
@@ -653,7 +653,7 @@
             <w:r/>
             <w:r>
               <w:rPr>
-                <w:rFonts w:ascii="MS Gothic" w:hAnsi="MS Gothic" w:eastAsia="MS Gothic"/>
+                <w:rFonts w:ascii="メイリオ" w:hAnsi="メイリオ" w:eastAsia="メイリオ"/>
                 <w:b w:val="0"/>
                 <w:sz w:val="20"/>
               </w:rPr>
@@ -670,7 +670,7 @@
             <w:r/>
             <w:r>
               <w:rPr>
-                <w:rFonts w:ascii="MS Gothic" w:hAnsi="MS Gothic" w:eastAsia="MS Gothic"/>
+                <w:rFonts w:ascii="メイリオ" w:hAnsi="メイリオ" w:eastAsia="メイリオ"/>
                 <w:b w:val="0"/>
                 <w:sz w:val="20"/>
               </w:rPr>
@@ -689,7 +689,7 @@
             <w:r/>
             <w:r>
               <w:rPr>
-                <w:rFonts w:ascii="MS Gothic" w:hAnsi="MS Gothic" w:eastAsia="MS Gothic"/>
+                <w:rFonts w:ascii="メイリオ" w:hAnsi="メイリオ" w:eastAsia="メイリオ"/>
                 <w:b w:val="0"/>
                 <w:sz w:val="20"/>
               </w:rPr>
@@ -706,7 +706,7 @@
             <w:r/>
             <w:r>
               <w:rPr>
-                <w:rFonts w:ascii="MS Gothic" w:hAnsi="MS Gothic" w:eastAsia="MS Gothic"/>
+                <w:rFonts w:ascii="メイリオ" w:hAnsi="メイリオ" w:eastAsia="メイリオ"/>
                 <w:b w:val="0"/>
                 <w:sz w:val="20"/>
               </w:rPr>
@@ -725,7 +725,7 @@
             <w:r/>
             <w:r>
               <w:rPr>
-                <w:rFonts w:ascii="MS Gothic" w:hAnsi="MS Gothic" w:eastAsia="MS Gothic"/>
+                <w:rFonts w:ascii="メイリオ" w:hAnsi="メイリオ" w:eastAsia="メイリオ"/>
                 <w:b w:val="0"/>
                 <w:sz w:val="20"/>
               </w:rPr>
@@ -742,7 +742,7 @@
             <w:r/>
             <w:r>
               <w:rPr>
-                <w:rFonts w:ascii="MS Gothic" w:hAnsi="MS Gothic" w:eastAsia="MS Gothic"/>
+                <w:rFonts w:ascii="メイリオ" w:hAnsi="メイリオ" w:eastAsia="メイリオ"/>
                 <w:b w:val="0"/>
                 <w:sz w:val="20"/>
               </w:rPr>
@@ -761,7 +761,7 @@
             <w:r/>
             <w:r>
               <w:rPr>
-                <w:rFonts w:ascii="MS Gothic" w:hAnsi="MS Gothic" w:eastAsia="MS Gothic"/>
+                <w:rFonts w:ascii="メイリオ" w:hAnsi="メイリオ" w:eastAsia="メイリオ"/>
                 <w:b w:val="0"/>
                 <w:sz w:val="20"/>
               </w:rPr>
@@ -778,7 +778,7 @@
             <w:r/>
             <w:r>
               <w:rPr>
-                <w:rFonts w:ascii="MS Gothic" w:hAnsi="MS Gothic" w:eastAsia="MS Gothic"/>
+                <w:rFonts w:ascii="メイリオ" w:hAnsi="メイリオ" w:eastAsia="メイリオ"/>
                 <w:b w:val="0"/>
                 <w:sz w:val="20"/>
               </w:rPr>
@@ -797,7 +797,7 @@
             <w:r/>
             <w:r>
               <w:rPr>
-                <w:rFonts w:ascii="MS Gothic" w:hAnsi="MS Gothic" w:eastAsia="MS Gothic"/>
+                <w:rFonts w:ascii="メイリオ" w:hAnsi="メイリオ" w:eastAsia="メイリオ"/>
                 <w:b w:val="0"/>
                 <w:sz w:val="20"/>
               </w:rPr>
@@ -814,7 +814,7 @@
             <w:r/>
             <w:r>
               <w:rPr>
-                <w:rFonts w:ascii="MS Gothic" w:hAnsi="MS Gothic" w:eastAsia="MS Gothic"/>
+                <w:rFonts w:ascii="メイリオ" w:hAnsi="メイリオ" w:eastAsia="メイリオ"/>
                 <w:b w:val="0"/>
                 <w:sz w:val="20"/>
               </w:rPr>
@@ -833,7 +833,7 @@
             <w:r/>
             <w:r>
               <w:rPr>
-                <w:rFonts w:ascii="MS Gothic" w:hAnsi="MS Gothic" w:eastAsia="MS Gothic"/>
+                <w:rFonts w:ascii="メイリオ" w:hAnsi="メイリオ" w:eastAsia="メイリオ"/>
                 <w:b w:val="0"/>
                 <w:sz w:val="20"/>
               </w:rPr>
@@ -850,7 +850,7 @@
             <w:r/>
             <w:r>
               <w:rPr>
-                <w:rFonts w:ascii="MS Gothic" w:hAnsi="MS Gothic" w:eastAsia="MS Gothic"/>
+                <w:rFonts w:ascii="メイリオ" w:hAnsi="メイリオ" w:eastAsia="メイリオ"/>
                 <w:b w:val="0"/>
                 <w:sz w:val="20"/>
               </w:rPr>
@@ -869,7 +869,7 @@
             <w:r/>
             <w:r>
               <w:rPr>
-                <w:rFonts w:ascii="MS Gothic" w:hAnsi="MS Gothic" w:eastAsia="MS Gothic"/>
+                <w:rFonts w:ascii="メイリオ" w:hAnsi="メイリオ" w:eastAsia="メイリオ"/>
                 <w:b w:val="0"/>
                 <w:sz w:val="20"/>
               </w:rPr>
@@ -886,7 +886,7 @@
             <w:r/>
             <w:r>
               <w:rPr>
-                <w:rFonts w:ascii="MS Gothic" w:hAnsi="MS Gothic" w:eastAsia="MS Gothic"/>
+                <w:rFonts w:ascii="メイリオ" w:hAnsi="メイリオ" w:eastAsia="メイリオ"/>
                 <w:b/>
                 <w:color w:val="C00000"/>
                 <w:sz w:val="20"/>
@@ -906,7 +906,7 @@
             <w:r/>
             <w:r>
               <w:rPr>
-                <w:rFonts w:ascii="MS Gothic" w:hAnsi="MS Gothic" w:eastAsia="MS Gothic"/>
+                <w:rFonts w:ascii="メイリオ" w:hAnsi="メイリオ" w:eastAsia="メイリオ"/>
                 <w:b w:val="0"/>
                 <w:sz w:val="20"/>
               </w:rPr>
@@ -923,7 +923,7 @@
             <w:r/>
             <w:r>
               <w:rPr>
-                <w:rFonts w:ascii="MS Gothic" w:hAnsi="MS Gothic" w:eastAsia="MS Gothic"/>
+                <w:rFonts w:ascii="メイリオ" w:hAnsi="メイリオ" w:eastAsia="メイリオ"/>
                 <w:b w:val="0"/>
                 <w:sz w:val="20"/>
               </w:rPr>
@@ -942,7 +942,7 @@
       </w:pPr>
       <w:r>
         <w:rPr>
-          <w:rFonts w:ascii="MS Gothic" w:hAnsi="MS Gothic" w:eastAsia="MS Gothic"/>
+          <w:rFonts w:ascii="メイリオ" w:hAnsi="メイリオ" w:eastAsia="メイリオ"/>
           <w:b/>
           <w:color w:val="1F497D"/>
           <w:sz w:val="26"/>
@@ -974,7 +974,7 @@
             <w:r/>
             <w:r>
               <w:rPr>
-                <w:rFonts w:ascii="MS Gothic" w:hAnsi="MS Gothic" w:eastAsia="MS Gothic"/>
+                <w:rFonts w:ascii="メイリオ" w:hAnsi="メイリオ" w:eastAsia="メイリオ"/>
                 <w:b/>
                 <w:sz w:val="20"/>
               </w:rPr>
@@ -995,7 +995,7 @@
             <w:r/>
             <w:r>
               <w:rPr>
-                <w:rFonts w:ascii="MS Gothic" w:hAnsi="MS Gothic" w:eastAsia="MS Gothic"/>
+                <w:rFonts w:ascii="メイリオ" w:hAnsi="メイリオ" w:eastAsia="メイリオ"/>
                 <w:b/>
                 <w:sz w:val="20"/>
               </w:rPr>
@@ -1014,7 +1014,7 @@
             <w:r/>
             <w:r>
               <w:rPr>
-                <w:rFonts w:ascii="MS Gothic" w:hAnsi="MS Gothic" w:eastAsia="MS Gothic"/>
+                <w:rFonts w:ascii="メイリオ" w:hAnsi="メイリオ" w:eastAsia="メイリオ"/>
                 <w:b w:val="0"/>
                 <w:sz w:val="20"/>
               </w:rPr>
@@ -1031,7 +1031,7 @@
             <w:r/>
             <w:r>
               <w:rPr>
-                <w:rFonts w:ascii="MS Gothic" w:hAnsi="MS Gothic" w:eastAsia="MS Gothic"/>
+                <w:rFonts w:ascii="メイリオ" w:hAnsi="メイリオ" w:eastAsia="メイリオ"/>
                 <w:b w:val="0"/>
                 <w:sz w:val="20"/>
               </w:rPr>
@@ -1050,7 +1050,7 @@
             <w:r/>
             <w:r>
               <w:rPr>
-                <w:rFonts w:ascii="MS Gothic" w:hAnsi="MS Gothic" w:eastAsia="MS Gothic"/>
+                <w:rFonts w:ascii="メイリオ" w:hAnsi="メイリオ" w:eastAsia="メイリオ"/>
                 <w:b w:val="0"/>
                 <w:sz w:val="20"/>
               </w:rPr>
@@ -1067,7 +1067,7 @@
             <w:r/>
             <w:r>
               <w:rPr>
-                <w:rFonts w:ascii="MS Gothic" w:hAnsi="MS Gothic" w:eastAsia="MS Gothic"/>
+                <w:rFonts w:ascii="メイリオ" w:hAnsi="メイリオ" w:eastAsia="メイリオ"/>
                 <w:b w:val="0"/>
                 <w:sz w:val="20"/>
               </w:rPr>
@@ -1086,7 +1086,7 @@
             <w:r/>
             <w:r>
               <w:rPr>
-                <w:rFonts w:ascii="MS Gothic" w:hAnsi="MS Gothic" w:eastAsia="MS Gothic"/>
+                <w:rFonts w:ascii="メイリオ" w:hAnsi="メイリオ" w:eastAsia="メイリオ"/>
                 <w:b w:val="0"/>
                 <w:sz w:val="20"/>
               </w:rPr>
@@ -1103,7 +1103,7 @@
             <w:r/>
             <w:r>
               <w:rPr>
-                <w:rFonts w:ascii="MS Gothic" w:hAnsi="MS Gothic" w:eastAsia="MS Gothic"/>
+                <w:rFonts w:ascii="メイリオ" w:hAnsi="メイリオ" w:eastAsia="メイリオ"/>
                 <w:b w:val="0"/>
                 <w:sz w:val="20"/>
               </w:rPr>
@@ -1122,7 +1122,7 @@
             <w:r/>
             <w:r>
               <w:rPr>
-                <w:rFonts w:ascii="MS Gothic" w:hAnsi="MS Gothic" w:eastAsia="MS Gothic"/>
+                <w:rFonts w:ascii="メイリオ" w:hAnsi="メイリオ" w:eastAsia="メイリオ"/>
                 <w:b w:val="0"/>
                 <w:sz w:val="20"/>
               </w:rPr>
@@ -1139,7 +1139,7 @@
             <w:r/>
             <w:r>
               <w:rPr>
-                <w:rFonts w:ascii="MS Gothic" w:hAnsi="MS Gothic" w:eastAsia="MS Gothic"/>
+                <w:rFonts w:ascii="メイリオ" w:hAnsi="メイリオ" w:eastAsia="メイリオ"/>
                 <w:b w:val="0"/>
                 <w:sz w:val="20"/>
               </w:rPr>
@@ -1158,7 +1158,7 @@
             <w:r/>
             <w:r>
               <w:rPr>
-                <w:rFonts w:ascii="MS Gothic" w:hAnsi="MS Gothic" w:eastAsia="MS Gothic"/>
+                <w:rFonts w:ascii="メイリオ" w:hAnsi="メイリオ" w:eastAsia="メイリオ"/>
                 <w:b w:val="0"/>
                 <w:sz w:val="20"/>
               </w:rPr>
@@ -1175,7 +1175,7 @@
             <w:r/>
             <w:r>
               <w:rPr>
-                <w:rFonts w:ascii="MS Gothic" w:hAnsi="MS Gothic" w:eastAsia="MS Gothic"/>
+                <w:rFonts w:ascii="メイリオ" w:hAnsi="メイリオ" w:eastAsia="メイリオ"/>
                 <w:b w:val="0"/>
                 <w:sz w:val="20"/>
               </w:rPr>
@@ -1194,7 +1194,7 @@
             <w:r/>
             <w:r>
               <w:rPr>
-                <w:rFonts w:ascii="MS Gothic" w:hAnsi="MS Gothic" w:eastAsia="MS Gothic"/>
+                <w:rFonts w:ascii="メイリオ" w:hAnsi="メイリオ" w:eastAsia="メイリオ"/>
                 <w:b w:val="0"/>
                 <w:sz w:val="20"/>
               </w:rPr>
@@ -1211,7 +1211,7 @@
             <w:r/>
             <w:r>
               <w:rPr>
-                <w:rFonts w:ascii="MS Gothic" w:hAnsi="MS Gothic" w:eastAsia="MS Gothic"/>
+                <w:rFonts w:ascii="メイリオ" w:hAnsi="メイリオ" w:eastAsia="メイリオ"/>
                 <w:b w:val="0"/>
                 <w:sz w:val="20"/>
               </w:rPr>
@@ -1230,7 +1230,7 @@
             <w:r/>
             <w:r>
               <w:rPr>
-                <w:rFonts w:ascii="MS Gothic" w:hAnsi="MS Gothic" w:eastAsia="MS Gothic"/>
+                <w:rFonts w:ascii="メイリオ" w:hAnsi="メイリオ" w:eastAsia="メイリオ"/>
                 <w:b w:val="0"/>
                 <w:sz w:val="20"/>
               </w:rPr>
@@ -1247,7 +1247,7 @@
             <w:r/>
             <w:r>
               <w:rPr>
-                <w:rFonts w:ascii="MS Gothic" w:hAnsi="MS Gothic" w:eastAsia="MS Gothic"/>
+                <w:rFonts w:ascii="メイリオ" w:hAnsi="メイリオ" w:eastAsia="メイリオ"/>
                 <w:b/>
                 <w:color w:val="C45A11"/>
                 <w:sz w:val="20"/>
@@ -1267,7 +1267,7 @@
             <w:r/>
             <w:r>
               <w:rPr>
-                <w:rFonts w:ascii="MS Gothic" w:hAnsi="MS Gothic" w:eastAsia="MS Gothic"/>
+                <w:rFonts w:ascii="メイリオ" w:hAnsi="メイリオ" w:eastAsia="メイリオ"/>
                 <w:b w:val="0"/>
                 <w:sz w:val="20"/>
               </w:rPr>
@@ -1284,7 +1284,7 @@
             <w:r/>
             <w:r>
               <w:rPr>
-                <w:rFonts w:ascii="MS Gothic" w:hAnsi="MS Gothic" w:eastAsia="MS Gothic"/>
+                <w:rFonts w:ascii="メイリオ" w:hAnsi="メイリオ" w:eastAsia="メイリオ"/>
                 <w:b w:val="0"/>
                 <w:sz w:val="20"/>
               </w:rPr>
@@ -1303,7 +1303,7 @@
             <w:r/>
             <w:r>
               <w:rPr>
-                <w:rFonts w:ascii="MS Gothic" w:hAnsi="MS Gothic" w:eastAsia="MS Gothic"/>
+                <w:rFonts w:ascii="メイリオ" w:hAnsi="メイリオ" w:eastAsia="メイリオ"/>
                 <w:b w:val="0"/>
                 <w:sz w:val="20"/>
               </w:rPr>
@@ -1320,7 +1320,7 @@
             <w:r/>
             <w:r>
               <w:rPr>
-                <w:rFonts w:ascii="MS Gothic" w:hAnsi="MS Gothic" w:eastAsia="MS Gothic"/>
+                <w:rFonts w:ascii="メイリオ" w:hAnsi="メイリオ" w:eastAsia="メイリオ"/>
                 <w:b w:val="0"/>
                 <w:sz w:val="20"/>
               </w:rPr>
@@ -1339,7 +1339,7 @@
             <w:r/>
             <w:r>
               <w:rPr>
-                <w:rFonts w:ascii="MS Gothic" w:hAnsi="MS Gothic" w:eastAsia="MS Gothic"/>
+                <w:rFonts w:ascii="メイリオ" w:hAnsi="メイリオ" w:eastAsia="メイリオ"/>
                 <w:b w:val="0"/>
                 <w:sz w:val="20"/>
               </w:rPr>
@@ -1356,7 +1356,7 @@
             <w:r/>
             <w:r>
               <w:rPr>
-                <w:rFonts w:ascii="MS Gothic" w:hAnsi="MS Gothic" w:eastAsia="MS Gothic"/>
+                <w:rFonts w:ascii="メイリオ" w:hAnsi="メイリオ" w:eastAsia="メイリオ"/>
                 <w:b w:val="0"/>
                 <w:sz w:val="20"/>
               </w:rPr>
@@ -1375,7 +1375,7 @@
             <w:r/>
             <w:r>
               <w:rPr>
-                <w:rFonts w:ascii="MS Gothic" w:hAnsi="MS Gothic" w:eastAsia="MS Gothic"/>
+                <w:rFonts w:ascii="メイリオ" w:hAnsi="メイリオ" w:eastAsia="メイリオ"/>
                 <w:b w:val="0"/>
                 <w:sz w:val="20"/>
               </w:rPr>
@@ -1392,7 +1392,7 @@
             <w:r/>
             <w:r>
               <w:rPr>
-                <w:rFonts w:ascii="MS Gothic" w:hAnsi="MS Gothic" w:eastAsia="MS Gothic"/>
+                <w:rFonts w:ascii="メイリオ" w:hAnsi="メイリオ" w:eastAsia="メイリオ"/>
                 <w:b/>
                 <w:color w:val="C45A11"/>
                 <w:sz w:val="20"/>
@@ -1412,7 +1412,7 @@
             <w:r/>
             <w:r>
               <w:rPr>
-                <w:rFonts w:ascii="MS Gothic" w:hAnsi="MS Gothic" w:eastAsia="MS Gothic"/>
+                <w:rFonts w:ascii="メイリオ" w:hAnsi="メイリオ" w:eastAsia="メイリオ"/>
                 <w:b w:val="0"/>
                 <w:sz w:val="20"/>
               </w:rPr>
@@ -1429,7 +1429,7 @@
             <w:r/>
             <w:r>
               <w:rPr>
-                <w:rFonts w:ascii="MS Gothic" w:hAnsi="MS Gothic" w:eastAsia="MS Gothic"/>
+                <w:rFonts w:ascii="メイリオ" w:hAnsi="メイリオ" w:eastAsia="メイリオ"/>
                 <w:b w:val="0"/>
                 <w:sz w:val="20"/>
               </w:rPr>
@@ -1448,7 +1448,7 @@
       </w:pPr>
       <w:r>
         <w:rPr>
-          <w:rFonts w:ascii="MS Gothic" w:hAnsi="MS Gothic" w:eastAsia="MS Gothic"/>
+          <w:rFonts w:ascii="メイリオ" w:hAnsi="メイリオ" w:eastAsia="メイリオ"/>
           <w:b/>
           <w:color w:val="1F497D"/>
           <w:sz w:val="26"/>
@@ -1462,7 +1462,7 @@
       </w:pPr>
       <w:r>
         <w:rPr>
-          <w:rFonts w:ascii="MS Gothic" w:hAnsi="MS Gothic" w:eastAsia="MS Gothic"/>
+          <w:rFonts w:ascii="メイリオ" w:hAnsi="メイリオ" w:eastAsia="メイリオ"/>
           <w:b/>
           <w:color w:val="2E74B5"/>
           <w:sz w:val="21"/>
@@ -1477,7 +1477,7 @@
       </w:pPr>
       <w:r>
         <w:rPr>
-          <w:rFonts w:ascii="MS Gothic" w:hAnsi="MS Gothic" w:eastAsia="MS Gothic"/>
+          <w:rFonts w:ascii="メイリオ" w:hAnsi="メイリオ" w:eastAsia="メイリオ"/>
           <w:b w:val="0"/>
           <w:sz w:val="20"/>
         </w:rPr>
@@ -1490,7 +1490,7 @@
       </w:pPr>
       <w:r>
         <w:rPr>
-          <w:rFonts w:ascii="MS Gothic" w:hAnsi="MS Gothic" w:eastAsia="MS Gothic"/>
+          <w:rFonts w:ascii="メイリオ" w:hAnsi="メイリオ" w:eastAsia="メイリオ"/>
           <w:b/>
           <w:color w:val="2E74B5"/>
           <w:sz w:val="21"/>
@@ -1505,7 +1505,7 @@
       </w:pPr>
       <w:r>
         <w:rPr>
-          <w:rFonts w:ascii="MS Gothic" w:hAnsi="MS Gothic" w:eastAsia="MS Gothic"/>
+          <w:rFonts w:ascii="メイリオ" w:hAnsi="メイリオ" w:eastAsia="メイリオ"/>
           <w:b w:val="0"/>
           <w:sz w:val="20"/>
         </w:rPr>
@@ -1519,7 +1519,7 @@
       </w:pPr>
       <w:r>
         <w:rPr>
-          <w:rFonts w:ascii="MS Gothic" w:hAnsi="MS Gothic" w:eastAsia="MS Gothic"/>
+          <w:rFonts w:ascii="メイリオ" w:hAnsi="メイリオ" w:eastAsia="メイリオ"/>
           <w:b w:val="0"/>
           <w:sz w:val="20"/>
         </w:rPr>
@@ -1533,7 +1533,7 @@
       </w:pPr>
       <w:r>
         <w:rPr>
-          <w:rFonts w:ascii="MS Gothic" w:hAnsi="MS Gothic" w:eastAsia="MS Gothic"/>
+          <w:rFonts w:ascii="メイリオ" w:hAnsi="メイリオ" w:eastAsia="メイリオ"/>
           <w:b w:val="0"/>
           <w:sz w:val="20"/>
         </w:rPr>
@@ -1547,7 +1547,7 @@
       </w:pPr>
       <w:r>
         <w:rPr>
-          <w:rFonts w:ascii="MS Gothic" w:hAnsi="MS Gothic" w:eastAsia="MS Gothic"/>
+          <w:rFonts w:ascii="メイリオ" w:hAnsi="メイリオ" w:eastAsia="メイリオ"/>
           <w:b/>
           <w:color w:val="C45A11"/>
           <w:sz w:val="20"/>
@@ -1562,7 +1562,7 @@
       </w:pPr>
       <w:r>
         <w:rPr>
-          <w:rFonts w:ascii="MS Gothic" w:hAnsi="MS Gothic" w:eastAsia="MS Gothic"/>
+          <w:rFonts w:ascii="メイリオ" w:hAnsi="メイリオ" w:eastAsia="メイリオ"/>
           <w:b w:val="0"/>
           <w:sz w:val="20"/>
         </w:rPr>
@@ -1594,7 +1594,7 @@
             <w:r/>
             <w:r>
               <w:rPr>
-                <w:rFonts w:ascii="MS Gothic" w:hAnsi="MS Gothic" w:eastAsia="MS Gothic"/>
+                <w:rFonts w:ascii="メイリオ" w:hAnsi="メイリオ" w:eastAsia="メイリオ"/>
                 <w:b/>
                 <w:sz w:val="20"/>
               </w:rPr>
@@ -1615,7 +1615,7 @@
             <w:r/>
             <w:r>
               <w:rPr>
-                <w:rFonts w:ascii="MS Gothic" w:hAnsi="MS Gothic" w:eastAsia="MS Gothic"/>
+                <w:rFonts w:ascii="メイリオ" w:hAnsi="メイリオ" w:eastAsia="メイリオ"/>
                 <w:b/>
                 <w:sz w:val="20"/>
               </w:rPr>
@@ -1634,7 +1634,7 @@
             <w:r/>
             <w:r>
               <w:rPr>
-                <w:rFonts w:ascii="MS Gothic" w:hAnsi="MS Gothic" w:eastAsia="MS Gothic"/>
+                <w:rFonts w:ascii="メイリオ" w:hAnsi="メイリオ" w:eastAsia="メイリオ"/>
                 <w:b/>
                 <w:sz w:val="20"/>
               </w:rPr>
@@ -1651,7 +1651,7 @@
             <w:r/>
             <w:r>
               <w:rPr>
-                <w:rFonts w:ascii="MS Gothic" w:hAnsi="MS Gothic" w:eastAsia="MS Gothic"/>
+                <w:rFonts w:ascii="メイリオ" w:hAnsi="メイリオ" w:eastAsia="メイリオ"/>
                 <w:b w:val="0"/>
                 <w:color w:val="C45A11"/>
                 <w:sz w:val="19"/>
@@ -1671,7 +1671,7 @@
             <w:r/>
             <w:r>
               <w:rPr>
-                <w:rFonts w:ascii="MS Gothic" w:hAnsi="MS Gothic" w:eastAsia="MS Gothic"/>
+                <w:rFonts w:ascii="メイリオ" w:hAnsi="メイリオ" w:eastAsia="メイリオ"/>
                 <w:b/>
                 <w:sz w:val="20"/>
               </w:rPr>
@@ -1688,7 +1688,7 @@
             <w:r/>
             <w:r>
               <w:rPr>
-                <w:rFonts w:ascii="MS Gothic" w:hAnsi="MS Gothic" w:eastAsia="MS Gothic"/>
+                <w:rFonts w:ascii="メイリオ" w:hAnsi="メイリオ" w:eastAsia="メイリオ"/>
                 <w:b w:val="0"/>
                 <w:color w:val="C00000"/>
                 <w:sz w:val="19"/>
@@ -1708,7 +1708,7 @@
             <w:r/>
             <w:r>
               <w:rPr>
-                <w:rFonts w:ascii="MS Gothic" w:hAnsi="MS Gothic" w:eastAsia="MS Gothic"/>
+                <w:rFonts w:ascii="メイリオ" w:hAnsi="メイリオ" w:eastAsia="メイリオ"/>
                 <w:b/>
                 <w:sz w:val="20"/>
               </w:rPr>
@@ -1725,7 +1725,7 @@
             <w:r/>
             <w:r>
               <w:rPr>
-                <w:rFonts w:ascii="MS Gothic" w:hAnsi="MS Gothic" w:eastAsia="MS Gothic"/>
+                <w:rFonts w:ascii="メイリオ" w:hAnsi="メイリオ" w:eastAsia="メイリオ"/>
                 <w:b w:val="0"/>
                 <w:sz w:val="19"/>
               </w:rPr>
@@ -1744,7 +1744,7 @@
             <w:r/>
             <w:r>
               <w:rPr>
-                <w:rFonts w:ascii="MS Gothic" w:hAnsi="MS Gothic" w:eastAsia="MS Gothic"/>
+                <w:rFonts w:ascii="メイリオ" w:hAnsi="メイリオ" w:eastAsia="メイリオ"/>
                 <w:b/>
                 <w:sz w:val="20"/>
               </w:rPr>
@@ -1761,7 +1761,7 @@
             <w:r/>
             <w:r>
               <w:rPr>
-                <w:rFonts w:ascii="MS Gothic" w:hAnsi="MS Gothic" w:eastAsia="MS Gothic"/>
+                <w:rFonts w:ascii="メイリオ" w:hAnsi="メイリオ" w:eastAsia="メイリオ"/>
                 <w:b w:val="0"/>
                 <w:color w:val="C45A11"/>
                 <w:sz w:val="19"/>
@@ -1781,7 +1781,7 @@
             <w:r/>
             <w:r>
               <w:rPr>
-                <w:rFonts w:ascii="MS Gothic" w:hAnsi="MS Gothic" w:eastAsia="MS Gothic"/>
+                <w:rFonts w:ascii="メイリオ" w:hAnsi="メイリオ" w:eastAsia="メイリオ"/>
                 <w:b/>
                 <w:sz w:val="20"/>
               </w:rPr>
@@ -1798,7 +1798,7 @@
             <w:r/>
             <w:r>
               <w:rPr>
-                <w:rFonts w:ascii="MS Gothic" w:hAnsi="MS Gothic" w:eastAsia="MS Gothic"/>
+                <w:rFonts w:ascii="メイリオ" w:hAnsi="メイリオ" w:eastAsia="メイリオ"/>
                 <w:b w:val="0"/>
                 <w:color w:val="C45A11"/>
                 <w:sz w:val="19"/>
@@ -1818,7 +1818,7 @@
             <w:r/>
             <w:r>
               <w:rPr>
-                <w:rFonts w:ascii="MS Gothic" w:hAnsi="MS Gothic" w:eastAsia="MS Gothic"/>
+                <w:rFonts w:ascii="メイリオ" w:hAnsi="メイリオ" w:eastAsia="メイリオ"/>
                 <w:b/>
                 <w:sz w:val="20"/>
               </w:rPr>
@@ -1835,7 +1835,7 @@
             <w:r/>
             <w:r>
               <w:rPr>
-                <w:rFonts w:ascii="MS Gothic" w:hAnsi="MS Gothic" w:eastAsia="MS Gothic"/>
+                <w:rFonts w:ascii="メイリオ" w:hAnsi="メイリオ" w:eastAsia="メイリオ"/>
                 <w:b w:val="0"/>
                 <w:color w:val="C45A11"/>
                 <w:sz w:val="19"/>
@@ -1852,7 +1852,7 @@
       </w:pPr>
       <w:r>
         <w:rPr>
-          <w:rFonts w:ascii="MS Gothic" w:hAnsi="MS Gothic" w:eastAsia="MS Gothic"/>
+          <w:rFonts w:ascii="メイリオ" w:hAnsi="メイリオ" w:eastAsia="メイリオ"/>
           <w:b w:val="0"/>
           <w:color w:val="595959"/>
           <w:sz w:val="19"/>
@@ -1869,7 +1869,7 @@
       </w:pPr>
       <w:r>
         <w:rPr>
-          <w:rFonts w:ascii="MS Gothic" w:hAnsi="MS Gothic" w:eastAsia="MS Gothic"/>
+          <w:rFonts w:ascii="メイリオ" w:hAnsi="メイリオ" w:eastAsia="メイリオ"/>
           <w:b/>
           <w:color w:val="1F497D"/>
           <w:sz w:val="26"/>
@@ -1884,7 +1884,7 @@
       </w:pPr>
       <w:r>
         <w:rPr>
-          <w:rFonts w:ascii="MS Gothic" w:hAnsi="MS Gothic" w:eastAsia="MS Gothic"/>
+          <w:rFonts w:ascii="メイリオ" w:hAnsi="メイリオ" w:eastAsia="メイリオ"/>
           <w:b/>
           <w:color w:val="C00000"/>
           <w:sz w:val="21"/>
@@ -1899,7 +1899,7 @@
       </w:pPr>
       <w:r>
         <w:rPr>
-          <w:rFonts w:ascii="MS Gothic" w:hAnsi="MS Gothic" w:eastAsia="MS Gothic"/>
+          <w:rFonts w:ascii="メイリオ" w:hAnsi="メイリオ" w:eastAsia="メイリオ"/>
           <w:b w:val="0"/>
           <w:sz w:val="21"/>
         </w:rPr>
@@ -1913,7 +1913,7 @@
       </w:pPr>
       <w:r>
         <w:rPr>
-          <w:rFonts w:ascii="MS Gothic" w:hAnsi="MS Gothic" w:eastAsia="MS Gothic"/>
+          <w:rFonts w:ascii="メイリオ" w:hAnsi="メイリオ" w:eastAsia="メイリオ"/>
           <w:b w:val="0"/>
           <w:sz w:val="21"/>
         </w:rPr>
@@ -1927,7 +1927,7 @@
       </w:pPr>
       <w:r>
         <w:rPr>
-          <w:rFonts w:ascii="MS Gothic" w:hAnsi="MS Gothic" w:eastAsia="MS Gothic"/>
+          <w:rFonts w:ascii="メイリオ" w:hAnsi="メイリオ" w:eastAsia="メイリオ"/>
           <w:b w:val="0"/>
           <w:sz w:val="21"/>
         </w:rPr>
@@ -1941,7 +1941,7 @@
       </w:pPr>
       <w:r>
         <w:rPr>
-          <w:rFonts w:ascii="MS Gothic" w:hAnsi="MS Gothic" w:eastAsia="MS Gothic"/>
+          <w:rFonts w:ascii="メイリオ" w:hAnsi="メイリオ" w:eastAsia="メイリオ"/>
           <w:b/>
           <w:sz w:val="22"/>
         </w:rPr>
@@ -2322,7 +2322,7 @@
     <w:qFormat/>
     <w:rsid w:val="00FC693F"/>
     <w:rPr>
-      <w:rFonts w:ascii="MS Gothic" w:hAnsi="MS Gothic" w:eastAsia="MS Gothic"/>
+      <w:rFonts w:ascii="メイリオ" w:hAnsi="メイリオ" w:eastAsia="メイリオ"/>
     </w:rPr>
   </w:style>
   <w:style w:type="paragraph" w:styleId="Header">

</xml_diff>

<commit_message>
Redesign process meeting minutes for readability
https://claude.ai/code/session_01HBPuJMpmbrXasqyXKTkHjP
</commit_message>
<xml_diff>
--- a/議事録_工程会議_20260629.docx
+++ b/議事録_工程会議_20260629.docx
@@ -4,7 +4,7 @@
   <w:body>
     <w:p>
       <w:pPr>
-        <w:spacing w:after="200"/>
+        <w:spacing w:after="80"/>
         <w:jc w:val="center"/>
       </w:pPr>
       <w:r>
@@ -12,14 +12,14 @@
           <w:rFonts w:ascii="メイリオ" w:hAnsi="メイリオ" w:eastAsia="メイリオ"/>
           <w:b/>
           <w:color w:val="1F497D"/>
-          <w:sz w:val="36"/>
+          <w:sz w:val="40"/>
         </w:rPr>
         <w:t>工程会議　議事録</w:t>
       </w:r>
     </w:p>
     <w:p>
       <w:pPr>
-        <w:spacing w:after="200"/>
+        <w:spacing w:after="240"/>
         <w:jc w:val="center"/>
       </w:pPr>
       <w:r>
@@ -34,28 +34,42 @@
     </w:p>
     <w:tbl>
       <w:tblPr>
-        <w:tblStyle w:val="TableGrid"/>
         <w:tblW w:type="auto" w:w="0"/>
         <w:tblLook w:firstColumn="1" w:firstRow="1" w:lastColumn="0" w:lastRow="0" w:noHBand="0" w:noVBand="1" w:val="04A0"/>
       </w:tblPr>
       <w:tblGrid>
-        <w:gridCol w:w="1814"/>
-        <w:gridCol w:w="4873"/>
+        <w:gridCol w:w="1701"/>
+        <w:gridCol w:w="4986"/>
       </w:tblGrid>
       <w:tr>
         <w:tc>
           <w:tcPr>
-            <w:tcW w:type="dxa" w:w="4873"/>
+            <w:tcW w:type="dxa" w:w="4986"/>
             <w:vAlign w:val="center"/>
-            <w:shd w:val="clear" w:color="auto" w:fill="D9E1F2"/>
+            <w:shd w:val="clear" w:color="auto" w:fill="EDF2FA"/>
+            <w:tcBorders>
+              <w:top w:val="single" w:sz="4" w:color="BFBFBF"/>
+              <w:bottom w:val="single" w:sz="4" w:color="BFBFBF"/>
+              <w:left w:val="single" w:sz="4" w:color="BFBFBF"/>
+              <w:right w:val="single" w:sz="4" w:color="BFBFBF"/>
+            </w:tcBorders>
+            <w:tcMar>
+              <w:top w:w="80" w:type="dxa"/>
+              <w:bottom w:w="80" w:type="dxa"/>
+              <w:start w:w="120" w:type="dxa"/>
+              <w:end w:w="120" w:type="dxa"/>
+            </w:tcMar>
           </w:tcPr>
           <w:p>
+            <w:pPr>
+              <w:spacing w:after="0"/>
+            </w:pPr>
             <w:r/>
             <w:r>
               <w:rPr>
                 <w:rFonts w:ascii="メイリオ" w:hAnsi="メイリオ" w:eastAsia="メイリオ"/>
                 <w:b/>
-                <w:sz w:val="21"/>
+                <w:sz w:val="22"/>
               </w:rPr>
               <w:t>日　　時</w:t>
             </w:r>
@@ -63,16 +77,31 @@
         </w:tc>
         <w:tc>
           <w:tcPr>
-            <w:tcW w:type="dxa" w:w="4873"/>
+            <w:tcW w:type="dxa" w:w="4986"/>
             <w:vAlign w:val="center"/>
+            <w:tcBorders>
+              <w:top w:val="single" w:sz="4" w:color="BFBFBF"/>
+              <w:bottom w:val="single" w:sz="4" w:color="BFBFBF"/>
+              <w:left w:val="single" w:sz="4" w:color="BFBFBF"/>
+              <w:right w:val="single" w:sz="4" w:color="BFBFBF"/>
+            </w:tcBorders>
+            <w:tcMar>
+              <w:top w:w="80" w:type="dxa"/>
+              <w:bottom w:w="80" w:type="dxa"/>
+              <w:start w:w="120" w:type="dxa"/>
+              <w:end w:w="120" w:type="dxa"/>
+            </w:tcMar>
           </w:tcPr>
           <w:p>
+            <w:pPr>
+              <w:spacing w:after="0"/>
+            </w:pPr>
             <w:r/>
             <w:r>
               <w:rPr>
                 <w:rFonts w:ascii="メイリオ" w:hAnsi="メイリオ" w:eastAsia="メイリオ"/>
                 <w:b w:val="0"/>
-                <w:sz w:val="21"/>
+                <w:sz w:val="22"/>
               </w:rPr>
               <w:t>2026年6月29日（月）　15:10〜17:30</w:t>
             </w:r>
@@ -82,17 +111,32 @@
       <w:tr>
         <w:tc>
           <w:tcPr>
-            <w:tcW w:type="dxa" w:w="4873"/>
+            <w:tcW w:type="dxa" w:w="4986"/>
             <w:vAlign w:val="center"/>
-            <w:shd w:val="clear" w:color="auto" w:fill="D9E1F2"/>
+            <w:shd w:val="clear" w:color="auto" w:fill="EDF2FA"/>
+            <w:tcBorders>
+              <w:top w:val="single" w:sz="4" w:color="BFBFBF"/>
+              <w:bottom w:val="single" w:sz="4" w:color="BFBFBF"/>
+              <w:left w:val="single" w:sz="4" w:color="BFBFBF"/>
+              <w:right w:val="single" w:sz="4" w:color="BFBFBF"/>
+            </w:tcBorders>
+            <w:tcMar>
+              <w:top w:w="80" w:type="dxa"/>
+              <w:bottom w:w="80" w:type="dxa"/>
+              <w:start w:w="120" w:type="dxa"/>
+              <w:end w:w="120" w:type="dxa"/>
+            </w:tcMar>
           </w:tcPr>
           <w:p>
+            <w:pPr>
+              <w:spacing w:after="0"/>
+            </w:pPr>
             <w:r/>
             <w:r>
               <w:rPr>
                 <w:rFonts w:ascii="メイリオ" w:hAnsi="メイリオ" w:eastAsia="メイリオ"/>
                 <w:b/>
-                <w:sz w:val="21"/>
+                <w:sz w:val="22"/>
               </w:rPr>
               <w:t>参　加　者</w:t>
             </w:r>
@@ -100,16 +144,31 @@
         </w:tc>
         <w:tc>
           <w:tcPr>
-            <w:tcW w:type="dxa" w:w="4873"/>
+            <w:tcW w:type="dxa" w:w="4986"/>
             <w:vAlign w:val="center"/>
+            <w:tcBorders>
+              <w:top w:val="single" w:sz="4" w:color="BFBFBF"/>
+              <w:bottom w:val="single" w:sz="4" w:color="BFBFBF"/>
+              <w:left w:val="single" w:sz="4" w:color="BFBFBF"/>
+              <w:right w:val="single" w:sz="4" w:color="BFBFBF"/>
+            </w:tcBorders>
+            <w:tcMar>
+              <w:top w:w="80" w:type="dxa"/>
+              <w:bottom w:w="80" w:type="dxa"/>
+              <w:start w:w="120" w:type="dxa"/>
+              <w:end w:w="120" w:type="dxa"/>
+            </w:tcMar>
           </w:tcPr>
           <w:p>
+            <w:pPr>
+              <w:spacing w:after="0"/>
+            </w:pPr>
             <w:r/>
             <w:r>
               <w:rPr>
                 <w:rFonts w:ascii="メイリオ" w:hAnsi="メイリオ" w:eastAsia="メイリオ"/>
                 <w:b w:val="0"/>
-                <w:sz w:val="21"/>
+                <w:sz w:val="22"/>
               </w:rPr>
               <w:t>社長、宮本、磯田、西口、西原、工場長</w:t>
             </w:r>
@@ -119,17 +178,32 @@
       <w:tr>
         <w:tc>
           <w:tcPr>
-            <w:tcW w:type="dxa" w:w="4873"/>
+            <w:tcW w:type="dxa" w:w="4986"/>
             <w:vAlign w:val="center"/>
-            <w:shd w:val="clear" w:color="auto" w:fill="D9E1F2"/>
+            <w:shd w:val="clear" w:color="auto" w:fill="EDF2FA"/>
+            <w:tcBorders>
+              <w:top w:val="single" w:sz="4" w:color="BFBFBF"/>
+              <w:bottom w:val="single" w:sz="4" w:color="BFBFBF"/>
+              <w:left w:val="single" w:sz="4" w:color="BFBFBF"/>
+              <w:right w:val="single" w:sz="4" w:color="BFBFBF"/>
+            </w:tcBorders>
+            <w:tcMar>
+              <w:top w:w="80" w:type="dxa"/>
+              <w:bottom w:w="80" w:type="dxa"/>
+              <w:start w:w="120" w:type="dxa"/>
+              <w:end w:w="120" w:type="dxa"/>
+            </w:tcMar>
           </w:tcPr>
           <w:p>
+            <w:pPr>
+              <w:spacing w:after="0"/>
+            </w:pPr>
             <w:r/>
             <w:r>
               <w:rPr>
                 <w:rFonts w:ascii="メイリオ" w:hAnsi="メイリオ" w:eastAsia="メイリオ"/>
                 <w:b/>
-                <w:sz w:val="21"/>
+                <w:sz w:val="22"/>
               </w:rPr>
               <w:t>議　　題</w:t>
             </w:r>
@@ -137,18 +211,170 @@
         </w:tc>
         <w:tc>
           <w:tcPr>
-            <w:tcW w:type="dxa" w:w="4873"/>
+            <w:tcW w:type="dxa" w:w="4986"/>
             <w:vAlign w:val="center"/>
+            <w:tcBorders>
+              <w:top w:val="single" w:sz="4" w:color="BFBFBF"/>
+              <w:bottom w:val="single" w:sz="4" w:color="BFBFBF"/>
+              <w:left w:val="single" w:sz="4" w:color="BFBFBF"/>
+              <w:right w:val="single" w:sz="4" w:color="BFBFBF"/>
+            </w:tcBorders>
+            <w:tcMar>
+              <w:top w:w="80" w:type="dxa"/>
+              <w:bottom w:w="80" w:type="dxa"/>
+              <w:start w:w="120" w:type="dxa"/>
+              <w:end w:w="120" w:type="dxa"/>
+            </w:tcMar>
           </w:tcPr>
           <w:p>
+            <w:pPr>
+              <w:spacing w:after="0"/>
+            </w:pPr>
             <w:r/>
             <w:r>
               <w:rPr>
                 <w:rFonts w:ascii="メイリオ" w:hAnsi="メイリオ" w:eastAsia="メイリオ"/>
                 <w:b w:val="0"/>
+                <w:sz w:val="22"/>
+              </w:rPr>
+              <w:t>①層間絶縁紙の調達　②鉄心工場工程　③コイル工場工程　④日鉄テックスエンジ・桑原電工　⑤懸念事項</w:t>
+            </w:r>
+          </w:p>
+        </w:tc>
+      </w:tr>
+    </w:tbl>
+    <w:p/>
+    <w:tbl>
+      <w:tblPr>
+        <w:tblW w:type="auto" w:w="0"/>
+        <w:tblLook w:firstColumn="1" w:firstRow="1" w:lastColumn="0" w:lastRow="0" w:noHBand="0" w:noVBand="1" w:val="04A0"/>
+      </w:tblPr>
+      <w:tblGrid>
+        <w:gridCol w:w="9972"/>
+      </w:tblGrid>
+      <w:tr>
+        <w:tc>
+          <w:tcPr>
+            <w:tcW w:type="dxa" w:w="9972"/>
+            <w:shd w:val="clear" w:color="auto" w:fill="FFF2CC"/>
+            <w:tcBorders>
+              <w:top w:val="single" w:sz="8" w:color="BF8F00"/>
+              <w:bottom w:val="single" w:sz="8" w:color="BF8F00"/>
+              <w:left w:val="single" w:sz="8" w:color="BF8F00"/>
+              <w:right w:val="single" w:sz="8" w:color="BF8F00"/>
+            </w:tcBorders>
+            <w:tcMar>
+              <w:top w:w="160" w:type="dxa"/>
+              <w:bottom w:w="160" w:type="dxa"/>
+              <w:start w:w="200" w:type="dxa"/>
+              <w:end w:w="200" w:type="dxa"/>
+            </w:tcMar>
+          </w:tcPr>
+          <w:p>
+            <w:pPr>
+              <w:spacing w:after="80"/>
+            </w:pPr>
+            <w:r/>
+            <w:r>
+              <w:rPr>
+                <w:rFonts w:ascii="メイリオ" w:hAnsi="メイリオ" w:eastAsia="メイリオ"/>
+                <w:b/>
+                <w:color w:val="7F6000"/>
+                <w:sz w:val="24"/>
+              </w:rPr>
+              <w:t>★ 今回の重要ポイント（サマリー）</w:t>
+            </w:r>
+          </w:p>
+          <w:p>
+            <w:pPr>
+              <w:spacing w:after="40"/>
+            </w:pPr>
+            <w:r>
+              <w:rPr>
+                <w:rFonts w:ascii="メイリオ" w:hAnsi="メイリオ" w:eastAsia="メイリオ"/>
+                <w:b/>
+                <w:color w:val="7F6000"/>
                 <w:sz w:val="21"/>
               </w:rPr>
-              <w:t>①層間絶縁紙の調達状況　②鉄心工場工程　③コイル工場工程　④日鉄テックスエンジ・桑原電工　⑤懸念事項</w:t>
+              <w:t>・</w:t>
+            </w:r>
+            <w:r>
+              <w:rPr>
+                <w:rFonts w:ascii="メイリオ" w:hAnsi="メイリオ" w:eastAsia="メイリオ"/>
+                <w:b w:val="0"/>
+                <w:color w:val="403000"/>
+                <w:sz w:val="21"/>
+              </w:rPr>
+              <w:t>夜明：層間絶縁紙が材料ショート。今後の工程に影響する可能性あり</w:t>
+            </w:r>
+          </w:p>
+          <w:p>
+            <w:pPr>
+              <w:spacing w:after="40"/>
+            </w:pPr>
+            <w:r>
+              <w:rPr>
+                <w:rFonts w:ascii="メイリオ" w:hAnsi="メイリオ" w:eastAsia="メイリオ"/>
+                <w:b/>
+                <w:color w:val="7F6000"/>
+                <w:sz w:val="21"/>
+              </w:rPr>
+              <w:t>・</w:t>
+            </w:r>
+            <w:r>
+              <w:rPr>
+                <w:rFonts w:ascii="メイリオ" w:hAnsi="メイリオ" w:eastAsia="メイリオ"/>
+                <w:b w:val="0"/>
+                <w:color w:val="403000"/>
+                <w:sz w:val="21"/>
+              </w:rPr>
+              <w:t>白沢：鉄心端板が客先支給遅延中（素材完成は10月中旬予定）</w:t>
+            </w:r>
+          </w:p>
+          <w:p>
+            <w:pPr>
+              <w:spacing w:after="40"/>
+            </w:pPr>
+            <w:r>
+              <w:rPr>
+                <w:rFonts w:ascii="メイリオ" w:hAnsi="メイリオ" w:eastAsia="メイリオ"/>
+                <w:b/>
+                <w:color w:val="7F6000"/>
+                <w:sz w:val="21"/>
+              </w:rPr>
+              <w:t>・</w:t>
+            </w:r>
+            <w:r>
+              <w:rPr>
+                <w:rFonts w:ascii="メイリオ" w:hAnsi="メイリオ" w:eastAsia="メイリオ"/>
+                <w:b w:val="0"/>
+                <w:color w:val="403000"/>
+                <w:sz w:val="21"/>
+              </w:rPr>
+              <w:t>F1〜3 補極：コア板が入荷済みのはずだが現物が見当たらず、問い合わせ中</w:t>
+            </w:r>
+          </w:p>
+          <w:p>
+            <w:pPr>
+              <w:spacing w:after="40"/>
+            </w:pPr>
+            <w:r>
+              <w:rPr>
+                <w:rFonts w:ascii="メイリオ" w:hAnsi="メイリオ" w:eastAsia="メイリオ"/>
+                <w:b/>
+                <w:color w:val="7F6000"/>
+                <w:sz w:val="21"/>
+              </w:rPr>
+              <w:t>・</w:t>
+            </w:r>
+            <w:r>
+              <w:rPr>
+                <w:rFonts w:ascii="メイリオ" w:hAnsi="メイリオ" w:eastAsia="メイリオ"/>
+                <w:b w:val="0"/>
+                <w:color w:val="403000"/>
+                <w:sz w:val="21"/>
+              </w:rPr>
+              <w:t>板室組立／成瀬、志比内／白沢：それぞれ工程タイミングが重なり現場の負荷が高い見込み</w:t>
             </w:r>
           </w:p>
         </w:tc>
@@ -163,59 +389,79 @@
         <w:rPr>
           <w:rFonts w:ascii="メイリオ" w:hAnsi="メイリオ" w:eastAsia="メイリオ"/>
           <w:b/>
-          <w:color w:val="C00000"/>
-          <w:sz w:val="18"/>
+          <w:color w:val="FFFFFF"/>
+          <w:sz w:val="19"/>
+          <w:shd w:val="clear" w:color="auto" w:fill="8B0000"/>
         </w:rPr>
-        <w:t xml:space="preserve">■ </w:t>
+        <w:t xml:space="preserve">  要注意  </w:t>
       </w:r>
       <w:r>
         <w:rPr>
           <w:rFonts w:ascii="メイリオ" w:hAnsi="メイリオ" w:eastAsia="メイリオ"/>
           <w:b w:val="0"/>
-          <w:color w:val="C00000"/>
-          <w:sz w:val="18"/>
+          <w:color w:val="595959"/>
+          <w:sz w:val="19"/>
         </w:rPr>
-        <w:t xml:space="preserve">赤＝要注意（遅延・材料ショート等）　</w:t>
+        <w:t xml:space="preserve">　遅延・材料ショートなど対応が必要　　</w:t>
       </w:r>
       <w:r>
         <w:rPr>
           <w:rFonts w:ascii="メイリオ" w:hAnsi="メイリオ" w:eastAsia="メイリオ"/>
           <w:b/>
-          <w:color w:val="C45A11"/>
-          <w:sz w:val="18"/>
+          <w:color w:val="FFFFFF"/>
+          <w:sz w:val="19"/>
+          <w:shd w:val="clear" w:color="auto" w:fill="C45A11"/>
         </w:rPr>
-        <w:t xml:space="preserve">■ </w:t>
+        <w:t xml:space="preserve">  経過観察  </w:t>
       </w:r>
       <w:r>
         <w:rPr>
           <w:rFonts w:ascii="メイリオ" w:hAnsi="メイリオ" w:eastAsia="メイリオ"/>
           <w:b w:val="0"/>
-          <w:color w:val="C45A11"/>
-          <w:sz w:val="18"/>
+          <w:color w:val="595959"/>
+          <w:sz w:val="19"/>
         </w:rPr>
-        <w:t>オレンジ＝経過観察（負荷集中・支給待ち等）</w:t>
+        <w:t xml:space="preserve">　負荷集中・支給待ちなど注視が必要　　</w:t>
+      </w:r>
+      <w:r>
+        <w:rPr>
+          <w:rFonts w:ascii="メイリオ" w:hAnsi="メイリオ" w:eastAsia="メイリオ"/>
+          <w:b/>
+          <w:color w:val="FFFFFF"/>
+          <w:sz w:val="19"/>
+          <w:shd w:val="clear" w:color="auto" w:fill="375623"/>
+        </w:rPr>
+        <w:t xml:space="preserve">  順調  </w:t>
+      </w:r>
+      <w:r>
+        <w:rPr>
+          <w:rFonts w:ascii="メイリオ" w:hAnsi="メイリオ" w:eastAsia="メイリオ"/>
+          <w:b w:val="0"/>
+          <w:color w:val="595959"/>
+          <w:sz w:val="19"/>
+        </w:rPr>
+        <w:t xml:space="preserve">　現状問題なし</w:t>
       </w:r>
     </w:p>
     <w:p>
       <w:pPr>
-        <w:spacing w:after="120" w:before="240"/>
-        <w:pBdr>
-          <w:bottom w:val="single" w:sz="6" w:space="1" w:color="1F497D"/>
-        </w:pBdr>
+        <w:spacing w:before="360" w:after="160"/>
+        <w:shd w:val="clear" w:color="auto" w:fill="1F4E78"/>
+        <w:ind w:left="40"/>
       </w:pPr>
       <w:r>
         <w:rPr>
           <w:rFonts w:ascii="メイリオ" w:hAnsi="メイリオ" w:eastAsia="メイリオ"/>
           <w:b/>
-          <w:color w:val="1F497D"/>
-          <w:sz w:val="26"/>
+          <w:color w:val="FFFFFF"/>
+          <w:sz w:val="28"/>
         </w:rPr>
-        <w:t>1．層間絶縁紙について（材料調達状況）</w:t>
+        <w:t xml:space="preserve">　1　層間絶縁紙について（材料調達状況）</w:t>
       </w:r>
     </w:p>
     <w:p>
       <w:pPr>
-        <w:spacing w:after="120"/>
+        <w:spacing w:after="160" w:before="40"/>
       </w:pPr>
       <w:r>
         <w:rPr>
@@ -224,28 +470,41 @@
           <w:color w:val="595959"/>
           <w:sz w:val="19"/>
         </w:rPr>
-        <w:t>太平商工と宮本さんで打ち合わせ済み。中東情勢の影響により材料調達のリードタイムが大幅に悪化（従来2〜3ヵ月 → 現在6ヵ月）しています。</w:t>
+        <w:t>太平商工と宮本さんで打ち合わせ済み。中東情勢の影響で材料調達のリードタイムが悪化（従来2〜3ヵ月 → 現在6ヵ月）。</w:t>
       </w:r>
     </w:p>
     <w:tbl>
       <w:tblPr>
-        <w:tblStyle w:val="TableGrid"/>
         <w:tblW w:type="auto" w:w="0"/>
         <w:tblLook w:firstColumn="1" w:firstRow="1" w:lastColumn="0" w:lastRow="0" w:noHBand="0" w:noVBand="1" w:val="04A0"/>
       </w:tblPr>
       <w:tblGrid>
-        <w:gridCol w:w="1984"/>
-        <w:gridCol w:w="4873"/>
+        <w:gridCol w:w="1587"/>
+        <w:gridCol w:w="1417"/>
+        <w:gridCol w:w="3324"/>
       </w:tblGrid>
       <w:tr>
         <w:tc>
           <w:tcPr>
-            <w:tcW w:type="dxa" w:w="4873"/>
+            <w:tcW w:type="dxa" w:w="3324"/>
             <w:vAlign w:val="center"/>
-            <w:shd w:val="clear" w:color="auto" w:fill="D9E1F2"/>
+            <w:shd w:val="clear" w:color="auto" w:fill="1F4E78"/>
+            <w:tcBorders>
+              <w:top w:val="single" w:sz="4" w:color="BFBFBF"/>
+              <w:bottom w:val="single" w:sz="4" w:color="BFBFBF"/>
+              <w:left w:val="single" w:sz="4" w:color="BFBFBF"/>
+              <w:right w:val="single" w:sz="4" w:color="BFBFBF"/>
+            </w:tcBorders>
+            <w:tcMar>
+              <w:top w:w="80" w:type="dxa"/>
+              <w:bottom w:w="80" w:type="dxa"/>
+              <w:start w:w="120" w:type="dxa"/>
+              <w:end w:w="120" w:type="dxa"/>
+            </w:tcMar>
           </w:tcPr>
           <w:p>
             <w:pPr>
+              <w:spacing w:after="0"/>
               <w:jc w:val="center"/>
             </w:pPr>
             <w:r/>
@@ -253,7 +512,8 @@
               <w:rPr>
                 <w:rFonts w:ascii="メイリオ" w:hAnsi="メイリオ" w:eastAsia="メイリオ"/>
                 <w:b/>
-                <w:sz w:val="20"/>
+                <w:color w:val="FFFFFF"/>
+                <w:sz w:val="21"/>
               </w:rPr>
               <w:t>案件</w:t>
             </w:r>
@@ -261,12 +521,25 @@
         </w:tc>
         <w:tc>
           <w:tcPr>
-            <w:tcW w:type="dxa" w:w="4873"/>
+            <w:tcW w:type="dxa" w:w="3324"/>
             <w:vAlign w:val="center"/>
-            <w:shd w:val="clear" w:color="auto" w:fill="D9E1F2"/>
+            <w:shd w:val="clear" w:color="auto" w:fill="1F4E78"/>
+            <w:tcBorders>
+              <w:top w:val="single" w:sz="4" w:color="BFBFBF"/>
+              <w:bottom w:val="single" w:sz="4" w:color="BFBFBF"/>
+              <w:left w:val="single" w:sz="4" w:color="BFBFBF"/>
+              <w:right w:val="single" w:sz="4" w:color="BFBFBF"/>
+            </w:tcBorders>
+            <w:tcMar>
+              <w:top w:w="80" w:type="dxa"/>
+              <w:bottom w:w="80" w:type="dxa"/>
+              <w:start w:w="120" w:type="dxa"/>
+              <w:end w:w="120" w:type="dxa"/>
+            </w:tcMar>
           </w:tcPr>
           <w:p>
             <w:pPr>
+              <w:spacing w:after="0"/>
               <w:jc w:val="center"/>
             </w:pPr>
             <w:r/>
@@ -274,7 +547,370 @@
               <w:rPr>
                 <w:rFonts w:ascii="メイリオ" w:hAnsi="メイリオ" w:eastAsia="メイリオ"/>
                 <w:b/>
+                <w:color w:val="FFFFFF"/>
+                <w:sz w:val="21"/>
+              </w:rPr>
+              <w:t>ステータス</w:t>
+            </w:r>
+          </w:p>
+        </w:tc>
+        <w:tc>
+          <w:tcPr>
+            <w:tcW w:type="dxa" w:w="3324"/>
+            <w:vAlign w:val="center"/>
+            <w:shd w:val="clear" w:color="auto" w:fill="1F4E78"/>
+            <w:tcBorders>
+              <w:top w:val="single" w:sz="4" w:color="BFBFBF"/>
+              <w:bottom w:val="single" w:sz="4" w:color="BFBFBF"/>
+              <w:left w:val="single" w:sz="4" w:color="BFBFBF"/>
+              <w:right w:val="single" w:sz="4" w:color="BFBFBF"/>
+            </w:tcBorders>
+            <w:tcMar>
+              <w:top w:w="80" w:type="dxa"/>
+              <w:bottom w:w="80" w:type="dxa"/>
+              <w:start w:w="120" w:type="dxa"/>
+              <w:end w:w="120" w:type="dxa"/>
+            </w:tcMar>
+          </w:tcPr>
+          <w:p>
+            <w:pPr>
+              <w:spacing w:after="0"/>
+              <w:jc w:val="center"/>
+            </w:pPr>
+            <w:r/>
+            <w:r>
+              <w:rPr>
+                <w:rFonts w:ascii="メイリオ" w:hAnsi="メイリオ" w:eastAsia="メイリオ"/>
+                <w:b/>
+                <w:color w:val="FFFFFF"/>
+                <w:sz w:val="21"/>
+              </w:rPr>
+              <w:t>詳細</w:t>
+            </w:r>
+          </w:p>
+        </w:tc>
+      </w:tr>
+      <w:tr>
+        <w:tc>
+          <w:tcPr>
+            <w:tcW w:type="dxa" w:w="3324"/>
+            <w:vAlign w:val="center"/>
+            <w:tcBorders>
+              <w:top w:val="single" w:sz="4" w:color="BFBFBF"/>
+              <w:bottom w:val="single" w:sz="4" w:color="BFBFBF"/>
+              <w:left w:val="single" w:sz="4" w:color="BFBFBF"/>
+              <w:right w:val="single" w:sz="4" w:color="BFBFBF"/>
+            </w:tcBorders>
+            <w:tcMar>
+              <w:top w:w="80" w:type="dxa"/>
+              <w:bottom w:w="80" w:type="dxa"/>
+              <w:start w:w="120" w:type="dxa"/>
+              <w:end w:w="120" w:type="dxa"/>
+            </w:tcMar>
+          </w:tcPr>
+          <w:p>
+            <w:pPr>
+              <w:spacing w:after="0"/>
+            </w:pPr>
+            <w:r/>
+            <w:r>
+              <w:rPr>
+                <w:rFonts w:ascii="メイリオ" w:hAnsi="メイリオ" w:eastAsia="メイリオ"/>
+                <w:b/>
+                <w:sz w:val="21"/>
+              </w:rPr>
+              <w:t>夜明</w:t>
+            </w:r>
+          </w:p>
+        </w:tc>
+        <w:tc>
+          <w:tcPr>
+            <w:tcW w:type="dxa" w:w="3324"/>
+            <w:vAlign w:val="center"/>
+            <w:shd w:val="clear" w:color="auto" w:fill="8B0000"/>
+            <w:tcBorders>
+              <w:top w:val="single" w:sz="4" w:color="BFBFBF"/>
+              <w:bottom w:val="single" w:sz="4" w:color="BFBFBF"/>
+              <w:left w:val="single" w:sz="4" w:color="BFBFBF"/>
+              <w:right w:val="single" w:sz="4" w:color="BFBFBF"/>
+            </w:tcBorders>
+            <w:tcMar>
+              <w:top w:w="80" w:type="dxa"/>
+              <w:bottom w:w="80" w:type="dxa"/>
+              <w:start w:w="120" w:type="dxa"/>
+              <w:end w:w="120" w:type="dxa"/>
+            </w:tcMar>
+          </w:tcPr>
+          <w:p>
+            <w:pPr>
+              <w:spacing w:after="0"/>
+              <w:jc w:val="center"/>
+            </w:pPr>
+            <w:r/>
+            <w:r>
+              <w:rPr>
+                <w:rFonts w:ascii="メイリオ" w:hAnsi="メイリオ" w:eastAsia="メイリオ"/>
+                <w:b/>
+                <w:color w:val="FFFFFF"/>
                 <w:sz w:val="20"/>
+              </w:rPr>
+              <w:t>要注意</w:t>
+            </w:r>
+          </w:p>
+        </w:tc>
+        <w:tc>
+          <w:tcPr>
+            <w:tcW w:type="dxa" w:w="3324"/>
+            <w:vAlign w:val="center"/>
+            <w:tcBorders>
+              <w:top w:val="single" w:sz="4" w:color="BFBFBF"/>
+              <w:bottom w:val="single" w:sz="4" w:color="BFBFBF"/>
+              <w:left w:val="single" w:sz="4" w:color="BFBFBF"/>
+              <w:right w:val="single" w:sz="4" w:color="BFBFBF"/>
+            </w:tcBorders>
+            <w:tcMar>
+              <w:top w:w="80" w:type="dxa"/>
+              <w:bottom w:w="80" w:type="dxa"/>
+              <w:start w:w="120" w:type="dxa"/>
+              <w:end w:w="120" w:type="dxa"/>
+            </w:tcMar>
+          </w:tcPr>
+          <w:p>
+            <w:pPr>
+              <w:spacing w:after="40"/>
+            </w:pPr>
+            <w:r/>
+            <w:r>
+              <w:rPr>
+                <w:rFonts w:ascii="メイリオ" w:hAnsi="メイリオ" w:eastAsia="メイリオ"/>
+                <w:b w:val="0"/>
+                <w:sz w:val="20"/>
+              </w:rPr>
+              <w:t>ここで材料がショートする</w:t>
+            </w:r>
+          </w:p>
+        </w:tc>
+      </w:tr>
+      <w:tr>
+        <w:tc>
+          <w:tcPr>
+            <w:tcW w:type="dxa" w:w="3324"/>
+            <w:vAlign w:val="center"/>
+            <w:tcBorders>
+              <w:top w:val="single" w:sz="4" w:color="BFBFBF"/>
+              <w:bottom w:val="single" w:sz="4" w:color="BFBFBF"/>
+              <w:left w:val="single" w:sz="4" w:color="BFBFBF"/>
+              <w:right w:val="single" w:sz="4" w:color="BFBFBF"/>
+            </w:tcBorders>
+            <w:tcMar>
+              <w:top w:w="80" w:type="dxa"/>
+              <w:bottom w:w="80" w:type="dxa"/>
+              <w:start w:w="120" w:type="dxa"/>
+              <w:end w:w="120" w:type="dxa"/>
+            </w:tcMar>
+          </w:tcPr>
+          <w:p>
+            <w:pPr>
+              <w:spacing w:after="0"/>
+            </w:pPr>
+            <w:r/>
+            <w:r>
+              <w:rPr>
+                <w:rFonts w:ascii="メイリオ" w:hAnsi="メイリオ" w:eastAsia="メイリオ"/>
+                <w:b/>
+                <w:sz w:val="21"/>
+              </w:rPr>
+              <w:t>成瀬</w:t>
+            </w:r>
+          </w:p>
+        </w:tc>
+        <w:tc>
+          <w:tcPr>
+            <w:tcW w:type="dxa" w:w="3324"/>
+            <w:vAlign w:val="center"/>
+            <w:shd w:val="clear" w:color="auto" w:fill="C45A11"/>
+            <w:tcBorders>
+              <w:top w:val="single" w:sz="4" w:color="BFBFBF"/>
+              <w:bottom w:val="single" w:sz="4" w:color="BFBFBF"/>
+              <w:left w:val="single" w:sz="4" w:color="BFBFBF"/>
+              <w:right w:val="single" w:sz="4" w:color="BFBFBF"/>
+            </w:tcBorders>
+            <w:tcMar>
+              <w:top w:w="80" w:type="dxa"/>
+              <w:bottom w:w="80" w:type="dxa"/>
+              <w:start w:w="120" w:type="dxa"/>
+              <w:end w:w="120" w:type="dxa"/>
+            </w:tcMar>
+          </w:tcPr>
+          <w:p>
+            <w:pPr>
+              <w:spacing w:after="0"/>
+              <w:jc w:val="center"/>
+            </w:pPr>
+            <w:r/>
+            <w:r>
+              <w:rPr>
+                <w:rFonts w:ascii="メイリオ" w:hAnsi="メイリオ" w:eastAsia="メイリオ"/>
+                <w:b/>
+                <w:color w:val="FFFFFF"/>
+                <w:sz w:val="20"/>
+              </w:rPr>
+              <w:t>経過観察</w:t>
+            </w:r>
+          </w:p>
+        </w:tc>
+        <w:tc>
+          <w:tcPr>
+            <w:tcW w:type="dxa" w:w="3324"/>
+            <w:vAlign w:val="center"/>
+            <w:tcBorders>
+              <w:top w:val="single" w:sz="4" w:color="BFBFBF"/>
+              <w:bottom w:val="single" w:sz="4" w:color="BFBFBF"/>
+              <w:left w:val="single" w:sz="4" w:color="BFBFBF"/>
+              <w:right w:val="single" w:sz="4" w:color="BFBFBF"/>
+            </w:tcBorders>
+            <w:tcMar>
+              <w:top w:w="80" w:type="dxa"/>
+              <w:bottom w:w="80" w:type="dxa"/>
+              <w:start w:w="120" w:type="dxa"/>
+              <w:end w:w="120" w:type="dxa"/>
+            </w:tcMar>
+          </w:tcPr>
+          <w:p>
+            <w:pPr>
+              <w:spacing w:after="40"/>
+            </w:pPr>
+            <w:r/>
+            <w:r>
+              <w:rPr>
+                <w:rFonts w:ascii="メイリオ" w:hAnsi="メイリオ" w:eastAsia="メイリオ"/>
+                <w:b w:val="0"/>
+                <w:sz w:val="20"/>
+              </w:rPr>
+              <w:t>・新しい材料を手配中</w:t>
+            </w:r>
+          </w:p>
+          <w:p>
+            <w:pPr>
+              <w:spacing w:after="40"/>
+            </w:pPr>
+            <w:r>
+              <w:rPr>
+                <w:rFonts w:ascii="メイリオ" w:hAnsi="メイリオ" w:eastAsia="メイリオ"/>
+                <w:b w:val="0"/>
+                <w:sz w:val="20"/>
+              </w:rPr>
+              <w:t>・9/15に材料完成（そこから抜き加工に約2週間）</w:t>
+            </w:r>
+          </w:p>
+        </w:tc>
+      </w:tr>
+    </w:tbl>
+    <w:p>
+      <w:pPr>
+        <w:spacing w:after="160" w:before="40"/>
+      </w:pPr>
+      <w:r>
+        <w:rPr>
+          <w:rFonts w:ascii="メイリオ" w:hAnsi="メイリオ" w:eastAsia="メイリオ"/>
+          <w:b w:val="0"/>
+          <w:color w:val="595959"/>
+          <w:sz w:val="19"/>
+        </w:rPr>
+        <w:t>上記以外（シンフォ・黒川・白沢・志比内・飯豊川＃1＃2・岩本＃2＃1）は特記事項なし。</w:t>
+      </w:r>
+    </w:p>
+    <w:p>
+      <w:pPr>
+        <w:spacing w:before="360" w:after="160"/>
+        <w:shd w:val="clear" w:color="auto" w:fill="1F4E78"/>
+        <w:ind w:left="40"/>
+      </w:pPr>
+      <w:r>
+        <w:rPr>
+          <w:rFonts w:ascii="メイリオ" w:hAnsi="メイリオ" w:eastAsia="メイリオ"/>
+          <w:b/>
+          <w:color w:val="FFFFFF"/>
+          <w:sz w:val="28"/>
+        </w:rPr>
+        <w:t xml:space="preserve">　2　鉄心工場での工程（宮本　報告）</w:t>
+      </w:r>
+    </w:p>
+    <w:tbl>
+      <w:tblPr>
+        <w:tblW w:type="auto" w:w="0"/>
+        <w:tblLook w:firstColumn="1" w:firstRow="1" w:lastColumn="0" w:lastRow="0" w:noHBand="0" w:noVBand="1" w:val="04A0"/>
+      </w:tblPr>
+      <w:tblGrid>
+        <w:gridCol w:w="1984"/>
+        <w:gridCol w:w="4986"/>
+      </w:tblGrid>
+      <w:tr>
+        <w:tc>
+          <w:tcPr>
+            <w:tcW w:type="dxa" w:w="4986"/>
+            <w:vAlign w:val="center"/>
+            <w:shd w:val="clear" w:color="auto" w:fill="1F4E78"/>
+            <w:tcBorders>
+              <w:top w:val="single" w:sz="4" w:color="BFBFBF"/>
+              <w:bottom w:val="single" w:sz="4" w:color="BFBFBF"/>
+              <w:left w:val="single" w:sz="4" w:color="BFBFBF"/>
+              <w:right w:val="single" w:sz="4" w:color="BFBFBF"/>
+            </w:tcBorders>
+            <w:tcMar>
+              <w:top w:w="80" w:type="dxa"/>
+              <w:bottom w:w="80" w:type="dxa"/>
+              <w:start w:w="120" w:type="dxa"/>
+              <w:end w:w="120" w:type="dxa"/>
+            </w:tcMar>
+          </w:tcPr>
+          <w:p>
+            <w:pPr>
+              <w:spacing w:after="0"/>
+              <w:jc w:val="center"/>
+            </w:pPr>
+            <w:r/>
+            <w:r>
+              <w:rPr>
+                <w:rFonts w:ascii="メイリオ" w:hAnsi="メイリオ" w:eastAsia="メイリオ"/>
+                <w:b/>
+                <w:color w:val="FFFFFF"/>
+                <w:sz w:val="21"/>
+              </w:rPr>
+              <w:t>案件</w:t>
+            </w:r>
+          </w:p>
+        </w:tc>
+        <w:tc>
+          <w:tcPr>
+            <w:tcW w:type="dxa" w:w="4986"/>
+            <w:vAlign w:val="center"/>
+            <w:shd w:val="clear" w:color="auto" w:fill="1F4E78"/>
+            <w:tcBorders>
+              <w:top w:val="single" w:sz="4" w:color="BFBFBF"/>
+              <w:bottom w:val="single" w:sz="4" w:color="BFBFBF"/>
+              <w:left w:val="single" w:sz="4" w:color="BFBFBF"/>
+              <w:right w:val="single" w:sz="4" w:color="BFBFBF"/>
+            </w:tcBorders>
+            <w:tcMar>
+              <w:top w:w="80" w:type="dxa"/>
+              <w:bottom w:w="80" w:type="dxa"/>
+              <w:start w:w="120" w:type="dxa"/>
+              <w:end w:w="120" w:type="dxa"/>
+            </w:tcMar>
+          </w:tcPr>
+          <w:p>
+            <w:pPr>
+              <w:spacing w:after="0"/>
+              <w:jc w:val="center"/>
+            </w:pPr>
+            <w:r/>
+            <w:r>
+              <w:rPr>
+                <w:rFonts w:ascii="メイリオ" w:hAnsi="メイリオ" w:eastAsia="メイリオ"/>
+                <w:b/>
+                <w:color w:val="FFFFFF"/>
+                <w:sz w:val="21"/>
               </w:rPr>
               <w:t>状況</w:t>
             </w:r>
@@ -284,389 +920,58 @@
       <w:tr>
         <w:tc>
           <w:tcPr>
-            <w:tcW w:type="dxa" w:w="4873"/>
+            <w:tcW w:type="dxa" w:w="4986"/>
             <w:vAlign w:val="center"/>
-          </w:tcPr>
-          <w:p>
-            <w:r/>
-            <w:r>
-              <w:rPr>
-                <w:rFonts w:ascii="メイリオ" w:hAnsi="メイリオ" w:eastAsia="メイリオ"/>
-                <w:b w:val="0"/>
-                <w:sz w:val="20"/>
-              </w:rPr>
-              <w:t>1　シンフォ</w:t>
-            </w:r>
-          </w:p>
-        </w:tc>
-        <w:tc>
-          <w:tcPr>
-            <w:tcW w:type="dxa" w:w="4873"/>
-            <w:vAlign w:val="center"/>
-          </w:tcPr>
-          <w:p>
-            <w:r/>
-            <w:r>
-              <w:rPr>
-                <w:rFonts w:ascii="メイリオ" w:hAnsi="メイリオ" w:eastAsia="メイリオ"/>
-                <w:b w:val="0"/>
-                <w:sz w:val="20"/>
-              </w:rPr>
-              <w:t>特記事項なし</w:t>
-            </w:r>
-          </w:p>
-        </w:tc>
-      </w:tr>
-      <w:tr>
-        <w:tc>
-          <w:tcPr>
-            <w:tcW w:type="dxa" w:w="4873"/>
-            <w:vAlign w:val="center"/>
-          </w:tcPr>
-          <w:p>
-            <w:r/>
-            <w:r>
-              <w:rPr>
-                <w:rFonts w:ascii="メイリオ" w:hAnsi="メイリオ" w:eastAsia="メイリオ"/>
-                <w:b w:val="0"/>
-                <w:sz w:val="20"/>
-              </w:rPr>
-              <w:t>2　黒川</w:t>
-            </w:r>
-          </w:p>
-        </w:tc>
-        <w:tc>
-          <w:tcPr>
-            <w:tcW w:type="dxa" w:w="4873"/>
-            <w:vAlign w:val="center"/>
-          </w:tcPr>
-          <w:p>
-            <w:r/>
-            <w:r>
-              <w:rPr>
-                <w:rFonts w:ascii="メイリオ" w:hAnsi="メイリオ" w:eastAsia="メイリオ"/>
-                <w:b w:val="0"/>
-                <w:sz w:val="20"/>
-              </w:rPr>
-              <w:t>特記事項なし</w:t>
-            </w:r>
-          </w:p>
-        </w:tc>
-      </w:tr>
-      <w:tr>
-        <w:tc>
-          <w:tcPr>
-            <w:tcW w:type="dxa" w:w="4873"/>
-            <w:vAlign w:val="center"/>
-          </w:tcPr>
-          <w:p>
-            <w:r/>
-            <w:r>
-              <w:rPr>
-                <w:rFonts w:ascii="メイリオ" w:hAnsi="メイリオ" w:eastAsia="メイリオ"/>
-                <w:b w:val="0"/>
-                <w:sz w:val="20"/>
-              </w:rPr>
-              <w:t>3　夜明</w:t>
-            </w:r>
-          </w:p>
-        </w:tc>
-        <w:tc>
-          <w:tcPr>
-            <w:tcW w:type="dxa" w:w="4873"/>
-            <w:vAlign w:val="center"/>
-          </w:tcPr>
-          <w:p>
-            <w:r/>
-            <w:r>
-              <w:rPr>
-                <w:rFonts w:ascii="メイリオ" w:hAnsi="メイリオ" w:eastAsia="メイリオ"/>
-                <w:b/>
-                <w:color w:val="C00000"/>
-                <w:sz w:val="20"/>
-              </w:rPr>
-              <w:t>★ここで材料がショートする</w:t>
-            </w:r>
-          </w:p>
-        </w:tc>
-      </w:tr>
-      <w:tr>
-        <w:tc>
-          <w:tcPr>
-            <w:tcW w:type="dxa" w:w="4873"/>
-            <w:vAlign w:val="center"/>
-          </w:tcPr>
-          <w:p>
-            <w:r/>
-            <w:r>
-              <w:rPr>
-                <w:rFonts w:ascii="メイリオ" w:hAnsi="メイリオ" w:eastAsia="メイリオ"/>
-                <w:b w:val="0"/>
-                <w:sz w:val="20"/>
-              </w:rPr>
-              <w:t>4　成瀬</w:t>
-            </w:r>
-          </w:p>
-        </w:tc>
-        <w:tc>
-          <w:tcPr>
-            <w:tcW w:type="dxa" w:w="4873"/>
-            <w:vAlign w:val="center"/>
-          </w:tcPr>
-          <w:p>
-            <w:r/>
-            <w:r>
-              <w:rPr>
-                <w:rFonts w:ascii="メイリオ" w:hAnsi="メイリオ" w:eastAsia="メイリオ"/>
-                <w:b/>
-                <w:color w:val="C45A11"/>
-                <w:sz w:val="20"/>
-              </w:rPr>
-              <w:t>新しい材料を手配中。9/15に材料完成（そこから抜き加工に約2週間）</w:t>
-            </w:r>
-          </w:p>
-        </w:tc>
-      </w:tr>
-      <w:tr>
-        <w:tc>
-          <w:tcPr>
-            <w:tcW w:type="dxa" w:w="4873"/>
-            <w:vAlign w:val="center"/>
-          </w:tcPr>
-          <w:p>
-            <w:r/>
-            <w:r>
-              <w:rPr>
-                <w:rFonts w:ascii="メイリオ" w:hAnsi="メイリオ" w:eastAsia="メイリオ"/>
-                <w:b w:val="0"/>
-                <w:sz w:val="20"/>
-              </w:rPr>
-              <w:t>5　白沢</w:t>
-            </w:r>
-          </w:p>
-        </w:tc>
-        <w:tc>
-          <w:tcPr>
-            <w:tcW w:type="dxa" w:w="4873"/>
-            <w:vAlign w:val="center"/>
-          </w:tcPr>
-          <w:p>
-            <w:r/>
-            <w:r>
-              <w:rPr>
-                <w:rFonts w:ascii="メイリオ" w:hAnsi="メイリオ" w:eastAsia="メイリオ"/>
-                <w:b w:val="0"/>
-                <w:sz w:val="20"/>
-              </w:rPr>
-              <w:t>特記事項なし</w:t>
-            </w:r>
-          </w:p>
-        </w:tc>
-      </w:tr>
-      <w:tr>
-        <w:tc>
-          <w:tcPr>
-            <w:tcW w:type="dxa" w:w="4873"/>
-            <w:vAlign w:val="center"/>
-          </w:tcPr>
-          <w:p>
-            <w:r/>
-            <w:r>
-              <w:rPr>
-                <w:rFonts w:ascii="メイリオ" w:hAnsi="メイリオ" w:eastAsia="メイリオ"/>
-                <w:b w:val="0"/>
-                <w:sz w:val="20"/>
-              </w:rPr>
-              <w:t>6　志比内</w:t>
-            </w:r>
-          </w:p>
-        </w:tc>
-        <w:tc>
-          <w:tcPr>
-            <w:tcW w:type="dxa" w:w="4873"/>
-            <w:vAlign w:val="center"/>
-          </w:tcPr>
-          <w:p>
-            <w:r/>
-            <w:r>
-              <w:rPr>
-                <w:rFonts w:ascii="メイリオ" w:hAnsi="メイリオ" w:eastAsia="メイリオ"/>
-                <w:b w:val="0"/>
-                <w:sz w:val="20"/>
-              </w:rPr>
-              <w:t>特記事項なし</w:t>
-            </w:r>
-          </w:p>
-        </w:tc>
-      </w:tr>
-      <w:tr>
-        <w:tc>
-          <w:tcPr>
-            <w:tcW w:type="dxa" w:w="4873"/>
-            <w:vAlign w:val="center"/>
-          </w:tcPr>
-          <w:p>
-            <w:r/>
-            <w:r>
-              <w:rPr>
-                <w:rFonts w:ascii="メイリオ" w:hAnsi="メイリオ" w:eastAsia="メイリオ"/>
-                <w:b w:val="0"/>
-                <w:sz w:val="20"/>
-              </w:rPr>
-              <w:t>7　飯豊川＃1・＃2</w:t>
-            </w:r>
-          </w:p>
-        </w:tc>
-        <w:tc>
-          <w:tcPr>
-            <w:tcW w:type="dxa" w:w="4873"/>
-            <w:vAlign w:val="center"/>
-          </w:tcPr>
-          <w:p>
-            <w:r/>
-            <w:r>
-              <w:rPr>
-                <w:rFonts w:ascii="メイリオ" w:hAnsi="メイリオ" w:eastAsia="メイリオ"/>
-                <w:b w:val="0"/>
-                <w:sz w:val="20"/>
-              </w:rPr>
-              <w:t>特記事項なし</w:t>
-            </w:r>
-          </w:p>
-        </w:tc>
-      </w:tr>
-      <w:tr>
-        <w:tc>
-          <w:tcPr>
-            <w:tcW w:type="dxa" w:w="4873"/>
-            <w:vAlign w:val="center"/>
-          </w:tcPr>
-          <w:p>
-            <w:r/>
-            <w:r>
-              <w:rPr>
-                <w:rFonts w:ascii="メイリオ" w:hAnsi="メイリオ" w:eastAsia="メイリオ"/>
-                <w:b w:val="0"/>
-                <w:sz w:val="20"/>
-              </w:rPr>
-              <w:t>8　岩本＃2・＃1</w:t>
-            </w:r>
-          </w:p>
-        </w:tc>
-        <w:tc>
-          <w:tcPr>
-            <w:tcW w:type="dxa" w:w="4873"/>
-            <w:vAlign w:val="center"/>
-          </w:tcPr>
-          <w:p>
-            <w:r/>
-            <w:r>
-              <w:rPr>
-                <w:rFonts w:ascii="メイリオ" w:hAnsi="メイリオ" w:eastAsia="メイリオ"/>
-                <w:b w:val="0"/>
-                <w:sz w:val="20"/>
-              </w:rPr>
-              <w:t>特記事項なし</w:t>
-            </w:r>
-          </w:p>
-        </w:tc>
-      </w:tr>
-    </w:tbl>
-    <w:p>
-      <w:pPr>
-        <w:spacing w:after="120" w:before="240"/>
-        <w:pBdr>
-          <w:bottom w:val="single" w:sz="6" w:space="1" w:color="1F497D"/>
-        </w:pBdr>
-      </w:pPr>
-      <w:r>
-        <w:rPr>
-          <w:rFonts w:ascii="メイリオ" w:hAnsi="メイリオ" w:eastAsia="メイリオ"/>
-          <w:b/>
-          <w:color w:val="1F497D"/>
-          <w:sz w:val="26"/>
-        </w:rPr>
-        <w:t>2．鉄心工場での工程（宮本　報告）</w:t>
-      </w:r>
-    </w:p>
-    <w:tbl>
-      <w:tblPr>
-        <w:tblStyle w:val="TableGrid"/>
-        <w:tblW w:type="auto" w:w="0"/>
-        <w:tblLook w:firstColumn="1" w:firstRow="1" w:lastColumn="0" w:lastRow="0" w:noHBand="0" w:noVBand="1" w:val="04A0"/>
-      </w:tblPr>
-      <w:tblGrid>
-        <w:gridCol w:w="1984"/>
-        <w:gridCol w:w="4873"/>
-      </w:tblGrid>
-      <w:tr>
-        <w:tc>
-          <w:tcPr>
-            <w:tcW w:type="dxa" w:w="4873"/>
-            <w:vAlign w:val="center"/>
-            <w:shd w:val="clear" w:color="auto" w:fill="D9E1F2"/>
+            <w:shd w:val="clear" w:color="auto" w:fill="EDF2FA"/>
+            <w:tcBorders>
+              <w:top w:val="single" w:sz="4" w:color="BFBFBF"/>
+              <w:bottom w:val="single" w:sz="4" w:color="BFBFBF"/>
+              <w:left w:val="single" w:sz="4" w:color="BFBFBF"/>
+              <w:right w:val="single" w:sz="4" w:color="BFBFBF"/>
+            </w:tcBorders>
+            <w:tcMar>
+              <w:top w:w="80" w:type="dxa"/>
+              <w:bottom w:w="80" w:type="dxa"/>
+              <w:start w:w="120" w:type="dxa"/>
+              <w:end w:w="120" w:type="dxa"/>
+            </w:tcMar>
           </w:tcPr>
           <w:p>
             <w:pPr>
-              <w:jc w:val="center"/>
+              <w:spacing w:after="0"/>
             </w:pPr>
             <w:r/>
             <w:r>
               <w:rPr>
                 <w:rFonts w:ascii="メイリオ" w:hAnsi="メイリオ" w:eastAsia="メイリオ"/>
                 <w:b/>
-                <w:sz w:val="20"/>
+                <w:sz w:val="21"/>
               </w:rPr>
-              <w:t>案件</w:t>
+              <w:t>平巻き用ポールピース</w:t>
             </w:r>
           </w:p>
         </w:tc>
         <w:tc>
           <w:tcPr>
-            <w:tcW w:type="dxa" w:w="4873"/>
+            <w:tcW w:type="dxa" w:w="4986"/>
             <w:vAlign w:val="center"/>
-            <w:shd w:val="clear" w:color="auto" w:fill="D9E1F2"/>
+            <w:tcBorders>
+              <w:top w:val="single" w:sz="4" w:color="BFBFBF"/>
+              <w:bottom w:val="single" w:sz="4" w:color="BFBFBF"/>
+              <w:left w:val="single" w:sz="4" w:color="BFBFBF"/>
+              <w:right w:val="single" w:sz="4" w:color="BFBFBF"/>
+            </w:tcBorders>
+            <w:tcMar>
+              <w:top w:w="80" w:type="dxa"/>
+              <w:bottom w:w="80" w:type="dxa"/>
+              <w:start w:w="120" w:type="dxa"/>
+              <w:end w:w="120" w:type="dxa"/>
+            </w:tcMar>
           </w:tcPr>
           <w:p>
             <w:pPr>
-              <w:jc w:val="center"/>
+              <w:spacing w:after="40"/>
             </w:pPr>
-            <w:r/>
-            <w:r>
-              <w:rPr>
-                <w:rFonts w:ascii="メイリオ" w:hAnsi="メイリオ" w:eastAsia="メイリオ"/>
-                <w:b/>
-                <w:sz w:val="20"/>
-              </w:rPr>
-              <w:t>状況</w:t>
-            </w:r>
-          </w:p>
-        </w:tc>
-      </w:tr>
-      <w:tr>
-        <w:tc>
-          <w:tcPr>
-            <w:tcW w:type="dxa" w:w="4873"/>
-            <w:vAlign w:val="center"/>
-          </w:tcPr>
-          <w:p>
-            <w:r/>
-            <w:r>
-              <w:rPr>
-                <w:rFonts w:ascii="メイリオ" w:hAnsi="メイリオ" w:eastAsia="メイリオ"/>
-                <w:b w:val="0"/>
-                <w:sz w:val="20"/>
-              </w:rPr>
-              <w:t>1　平巻き用ポールピース</w:t>
-            </w:r>
-          </w:p>
-        </w:tc>
-        <w:tc>
-          <w:tcPr>
-            <w:tcW w:type="dxa" w:w="4873"/>
-            <w:vAlign w:val="center"/>
-          </w:tcPr>
-          <w:p>
             <w:r/>
             <w:r>
               <w:rPr>
@@ -682,10 +987,58 @@
       <w:tr>
         <w:tc>
           <w:tcPr>
-            <w:tcW w:type="dxa" w:w="4873"/>
+            <w:tcW w:type="dxa" w:w="4986"/>
             <w:vAlign w:val="center"/>
+            <w:shd w:val="clear" w:color="auto" w:fill="EDF2FA"/>
+            <w:tcBorders>
+              <w:top w:val="single" w:sz="4" w:color="BFBFBF"/>
+              <w:bottom w:val="single" w:sz="4" w:color="BFBFBF"/>
+              <w:left w:val="single" w:sz="4" w:color="BFBFBF"/>
+              <w:right w:val="single" w:sz="4" w:color="BFBFBF"/>
+            </w:tcBorders>
+            <w:tcMar>
+              <w:top w:w="80" w:type="dxa"/>
+              <w:bottom w:w="80" w:type="dxa"/>
+              <w:start w:w="120" w:type="dxa"/>
+              <w:end w:w="120" w:type="dxa"/>
+            </w:tcMar>
           </w:tcPr>
           <w:p>
+            <w:pPr>
+              <w:spacing w:after="0"/>
+            </w:pPr>
+            <w:r/>
+            <w:r>
+              <w:rPr>
+                <w:rFonts w:ascii="メイリオ" w:hAnsi="メイリオ" w:eastAsia="メイリオ"/>
+                <w:b/>
+                <w:sz w:val="21"/>
+              </w:rPr>
+              <w:t>夜明</w:t>
+            </w:r>
+          </w:p>
+        </w:tc>
+        <w:tc>
+          <w:tcPr>
+            <w:tcW w:type="dxa" w:w="4986"/>
+            <w:vAlign w:val="center"/>
+            <w:tcBorders>
+              <w:top w:val="single" w:sz="4" w:color="BFBFBF"/>
+              <w:bottom w:val="single" w:sz="4" w:color="BFBFBF"/>
+              <w:left w:val="single" w:sz="4" w:color="BFBFBF"/>
+              <w:right w:val="single" w:sz="4" w:color="BFBFBF"/>
+            </w:tcBorders>
+            <w:tcMar>
+              <w:top w:w="80" w:type="dxa"/>
+              <w:bottom w:w="80" w:type="dxa"/>
+              <w:start w:w="120" w:type="dxa"/>
+              <w:end w:w="120" w:type="dxa"/>
+            </w:tcMar>
+          </w:tcPr>
+          <w:p>
+            <w:pPr>
+              <w:spacing w:after="40"/>
+            </w:pPr>
             <w:r/>
             <w:r>
               <w:rPr>
@@ -693,24 +1046,33 @@
                 <w:b w:val="0"/>
                 <w:sz w:val="20"/>
               </w:rPr>
-              <w:t>2　夜明</w:t>
+              <w:t>・端板の加工は分納でPT検査（客先納品予定）</w:t>
             </w:r>
           </w:p>
-        </w:tc>
-        <w:tc>
-          <w:tcPr>
-            <w:tcW w:type="dxa" w:w="4873"/>
-            <w:vAlign w:val="center"/>
-          </w:tcPr>
           <w:p>
-            <w:r/>
+            <w:pPr>
+              <w:spacing w:after="40"/>
+            </w:pPr>
             <w:r>
               <w:rPr>
                 <w:rFonts w:ascii="メイリオ" w:hAnsi="メイリオ" w:eastAsia="メイリオ"/>
                 <w:b w:val="0"/>
                 <w:sz w:val="20"/>
               </w:rPr>
-              <w:t>端板の加工は分納でPT検査（客先納品予定）。7/1より加工スタート予定、8/31完了予定（40日程）。コイルに渡せるのはお盆前位</w:t>
+              <w:t>・7/1より加工スタート予定、8/31完了予定（40日程）</w:t>
+            </w:r>
+          </w:p>
+          <w:p>
+            <w:pPr>
+              <w:spacing w:after="40"/>
+            </w:pPr>
+            <w:r>
+              <w:rPr>
+                <w:rFonts w:ascii="メイリオ" w:hAnsi="メイリオ" w:eastAsia="メイリオ"/>
+                <w:b w:val="0"/>
+                <w:sz w:val="20"/>
+              </w:rPr>
+              <w:t>・コイルに渡せるのはお盆前位</w:t>
             </w:r>
           </w:p>
         </w:tc>
@@ -718,27 +1080,58 @@
       <w:tr>
         <w:tc>
           <w:tcPr>
-            <w:tcW w:type="dxa" w:w="4873"/>
+            <w:tcW w:type="dxa" w:w="4986"/>
             <w:vAlign w:val="center"/>
+            <w:shd w:val="clear" w:color="auto" w:fill="EDF2FA"/>
+            <w:tcBorders>
+              <w:top w:val="single" w:sz="4" w:color="BFBFBF"/>
+              <w:bottom w:val="single" w:sz="4" w:color="BFBFBF"/>
+              <w:left w:val="single" w:sz="4" w:color="BFBFBF"/>
+              <w:right w:val="single" w:sz="4" w:color="BFBFBF"/>
+            </w:tcBorders>
+            <w:tcMar>
+              <w:top w:w="80" w:type="dxa"/>
+              <w:bottom w:w="80" w:type="dxa"/>
+              <w:start w:w="120" w:type="dxa"/>
+              <w:end w:w="120" w:type="dxa"/>
+            </w:tcMar>
           </w:tcPr>
           <w:p>
+            <w:pPr>
+              <w:spacing w:after="0"/>
+            </w:pPr>
             <w:r/>
             <w:r>
               <w:rPr>
                 <w:rFonts w:ascii="メイリオ" w:hAnsi="メイリオ" w:eastAsia="メイリオ"/>
-                <w:b w:val="0"/>
-                <w:sz w:val="20"/>
+                <w:b/>
+                <w:sz w:val="21"/>
               </w:rPr>
-              <w:t>3　黒川</w:t>
+              <w:t>黒川</w:t>
             </w:r>
           </w:p>
         </w:tc>
         <w:tc>
           <w:tcPr>
-            <w:tcW w:type="dxa" w:w="4873"/>
+            <w:tcW w:type="dxa" w:w="4986"/>
             <w:vAlign w:val="center"/>
+            <w:tcBorders>
+              <w:top w:val="single" w:sz="4" w:color="BFBFBF"/>
+              <w:bottom w:val="single" w:sz="4" w:color="BFBFBF"/>
+              <w:left w:val="single" w:sz="4" w:color="BFBFBF"/>
+              <w:right w:val="single" w:sz="4" w:color="BFBFBF"/>
+            </w:tcBorders>
+            <w:tcMar>
+              <w:top w:w="80" w:type="dxa"/>
+              <w:bottom w:w="80" w:type="dxa"/>
+              <w:start w:w="120" w:type="dxa"/>
+              <w:end w:w="120" w:type="dxa"/>
+            </w:tcMar>
           </w:tcPr>
           <w:p>
+            <w:pPr>
+              <w:spacing w:after="40"/>
+            </w:pPr>
             <w:r/>
             <w:r>
               <w:rPr>
@@ -754,27 +1147,58 @@
       <w:tr>
         <w:tc>
           <w:tcPr>
-            <w:tcW w:type="dxa" w:w="4873"/>
+            <w:tcW w:type="dxa" w:w="4986"/>
             <w:vAlign w:val="center"/>
+            <w:shd w:val="clear" w:color="auto" w:fill="EDF2FA"/>
+            <w:tcBorders>
+              <w:top w:val="single" w:sz="4" w:color="BFBFBF"/>
+              <w:bottom w:val="single" w:sz="4" w:color="BFBFBF"/>
+              <w:left w:val="single" w:sz="4" w:color="BFBFBF"/>
+              <w:right w:val="single" w:sz="4" w:color="BFBFBF"/>
+            </w:tcBorders>
+            <w:tcMar>
+              <w:top w:w="80" w:type="dxa"/>
+              <w:bottom w:w="80" w:type="dxa"/>
+              <w:start w:w="120" w:type="dxa"/>
+              <w:end w:w="120" w:type="dxa"/>
+            </w:tcMar>
           </w:tcPr>
           <w:p>
+            <w:pPr>
+              <w:spacing w:after="0"/>
+            </w:pPr>
             <w:r/>
             <w:r>
               <w:rPr>
                 <w:rFonts w:ascii="メイリオ" w:hAnsi="メイリオ" w:eastAsia="メイリオ"/>
-                <w:b w:val="0"/>
-                <w:sz w:val="20"/>
+                <w:b/>
+                <w:sz w:val="21"/>
               </w:rPr>
-              <w:t>4　成瀬</w:t>
+              <w:t>成瀬</w:t>
             </w:r>
           </w:p>
         </w:tc>
         <w:tc>
           <w:tcPr>
-            <w:tcW w:type="dxa" w:w="4873"/>
+            <w:tcW w:type="dxa" w:w="4986"/>
             <w:vAlign w:val="center"/>
+            <w:tcBorders>
+              <w:top w:val="single" w:sz="4" w:color="BFBFBF"/>
+              <w:bottom w:val="single" w:sz="4" w:color="BFBFBF"/>
+              <w:left w:val="single" w:sz="4" w:color="BFBFBF"/>
+              <w:right w:val="single" w:sz="4" w:color="BFBFBF"/>
+            </w:tcBorders>
+            <w:tcMar>
+              <w:top w:w="80" w:type="dxa"/>
+              <w:bottom w:w="80" w:type="dxa"/>
+              <w:start w:w="120" w:type="dxa"/>
+              <w:end w:w="120" w:type="dxa"/>
+            </w:tcMar>
           </w:tcPr>
           <w:p>
+            <w:pPr>
+              <w:spacing w:after="40"/>
+            </w:pPr>
             <w:r/>
             <w:r>
               <w:rPr>
@@ -790,27 +1214,58 @@
       <w:tr>
         <w:tc>
           <w:tcPr>
-            <w:tcW w:type="dxa" w:w="4873"/>
+            <w:tcW w:type="dxa" w:w="4986"/>
             <w:vAlign w:val="center"/>
+            <w:shd w:val="clear" w:color="auto" w:fill="EDF2FA"/>
+            <w:tcBorders>
+              <w:top w:val="single" w:sz="4" w:color="BFBFBF"/>
+              <w:bottom w:val="single" w:sz="4" w:color="BFBFBF"/>
+              <w:left w:val="single" w:sz="4" w:color="BFBFBF"/>
+              <w:right w:val="single" w:sz="4" w:color="BFBFBF"/>
+            </w:tcBorders>
+            <w:tcMar>
+              <w:top w:w="80" w:type="dxa"/>
+              <w:bottom w:w="80" w:type="dxa"/>
+              <w:start w:w="120" w:type="dxa"/>
+              <w:end w:w="120" w:type="dxa"/>
+            </w:tcMar>
           </w:tcPr>
           <w:p>
+            <w:pPr>
+              <w:spacing w:after="0"/>
+            </w:pPr>
             <w:r/>
             <w:r>
               <w:rPr>
                 <w:rFonts w:ascii="メイリオ" w:hAnsi="メイリオ" w:eastAsia="メイリオ"/>
-                <w:b w:val="0"/>
-                <w:sz w:val="20"/>
+                <w:b/>
+                <w:sz w:val="21"/>
               </w:rPr>
-              <w:t>5　岩本＃1</w:t>
+              <w:t>岩本＃1・志比内</w:t>
             </w:r>
           </w:p>
         </w:tc>
         <w:tc>
           <w:tcPr>
-            <w:tcW w:type="dxa" w:w="4873"/>
+            <w:tcW w:type="dxa" w:w="4986"/>
             <w:vAlign w:val="center"/>
+            <w:tcBorders>
+              <w:top w:val="single" w:sz="4" w:color="BFBFBF"/>
+              <w:bottom w:val="single" w:sz="4" w:color="BFBFBF"/>
+              <w:left w:val="single" w:sz="4" w:color="BFBFBF"/>
+              <w:right w:val="single" w:sz="4" w:color="BFBFBF"/>
+            </w:tcBorders>
+            <w:tcMar>
+              <w:top w:w="80" w:type="dxa"/>
+              <w:bottom w:w="80" w:type="dxa"/>
+              <w:start w:w="120" w:type="dxa"/>
+              <w:end w:w="120" w:type="dxa"/>
+            </w:tcMar>
           </w:tcPr>
           <w:p>
+            <w:pPr>
+              <w:spacing w:after="40"/>
+            </w:pPr>
             <w:r/>
             <w:r>
               <w:rPr>
@@ -826,69 +1281,64 @@
       <w:tr>
         <w:tc>
           <w:tcPr>
-            <w:tcW w:type="dxa" w:w="4873"/>
+            <w:tcW w:type="dxa" w:w="4986"/>
             <w:vAlign w:val="center"/>
+            <w:tcBorders>
+              <w:top w:val="single" w:sz="4" w:color="BFBFBF"/>
+              <w:bottom w:val="single" w:sz="4" w:color="BFBFBF"/>
+              <w:left w:val="single" w:sz="4" w:color="BFBFBF"/>
+              <w:right w:val="single" w:sz="4" w:color="BFBFBF"/>
+            </w:tcBorders>
+            <w:tcMar>
+              <w:top w:w="80" w:type="dxa"/>
+              <w:bottom w:w="80" w:type="dxa"/>
+              <w:start w:w="120" w:type="dxa"/>
+              <w:end w:w="120" w:type="dxa"/>
+            </w:tcMar>
           </w:tcPr>
           <w:p>
+            <w:pPr>
+              <w:spacing w:after="0"/>
+            </w:pPr>
+            <w:r/>
+            <w:r>
+              <w:rPr>
+                <w:rFonts w:ascii="メイリオ" w:hAnsi="メイリオ" w:eastAsia="メイリオ"/>
+                <w:b/>
+                <w:sz w:val="21"/>
+              </w:rPr>
+              <w:t>白沢</w:t>
+            </w:r>
+          </w:p>
+        </w:tc>
+        <w:tc>
+          <w:tcPr>
+            <w:tcW w:type="dxa" w:w="4986"/>
+            <w:vAlign w:val="center"/>
+            <w:shd w:val="clear" w:color="auto" w:fill="8B0000"/>
+            <w:tcBorders>
+              <w:top w:val="single" w:sz="4" w:color="BFBFBF"/>
+              <w:bottom w:val="single" w:sz="4" w:color="BFBFBF"/>
+              <w:left w:val="single" w:sz="4" w:color="BFBFBF"/>
+              <w:right w:val="single" w:sz="4" w:color="BFBFBF"/>
+            </w:tcBorders>
+            <w:tcMar>
+              <w:top w:w="80" w:type="dxa"/>
+              <w:bottom w:w="80" w:type="dxa"/>
+              <w:start w:w="120" w:type="dxa"/>
+              <w:end w:w="120" w:type="dxa"/>
+            </w:tcMar>
+          </w:tcPr>
+          <w:p>
+            <w:pPr>
+              <w:spacing w:after="40"/>
+            </w:pPr>
             <w:r/>
             <w:r>
               <w:rPr>
                 <w:rFonts w:ascii="メイリオ" w:hAnsi="メイリオ" w:eastAsia="メイリオ"/>
                 <w:b w:val="0"/>
-                <w:sz w:val="20"/>
-              </w:rPr>
-              <w:t>6　志比内</w:t>
-            </w:r>
-          </w:p>
-        </w:tc>
-        <w:tc>
-          <w:tcPr>
-            <w:tcW w:type="dxa" w:w="4873"/>
-            <w:vAlign w:val="center"/>
-          </w:tcPr>
-          <w:p>
-            <w:r/>
-            <w:r>
-              <w:rPr>
-                <w:rFonts w:ascii="メイリオ" w:hAnsi="メイリオ" w:eastAsia="メイリオ"/>
-                <w:b w:val="0"/>
-                <w:sz w:val="20"/>
-              </w:rPr>
-              <w:t>11月頃に進めたい</w:t>
-            </w:r>
-          </w:p>
-        </w:tc>
-      </w:tr>
-      <w:tr>
-        <w:tc>
-          <w:tcPr>
-            <w:tcW w:type="dxa" w:w="4873"/>
-            <w:vAlign w:val="center"/>
-          </w:tcPr>
-          <w:p>
-            <w:r/>
-            <w:r>
-              <w:rPr>
-                <w:rFonts w:ascii="メイリオ" w:hAnsi="メイリオ" w:eastAsia="メイリオ"/>
-                <w:b w:val="0"/>
-                <w:sz w:val="20"/>
-              </w:rPr>
-              <w:t>7　白沢</w:t>
-            </w:r>
-          </w:p>
-        </w:tc>
-        <w:tc>
-          <w:tcPr>
-            <w:tcW w:type="dxa" w:w="4873"/>
-            <w:vAlign w:val="center"/>
-          </w:tcPr>
-          <w:p>
-            <w:r/>
-            <w:r>
-              <w:rPr>
-                <w:rFonts w:ascii="メイリオ" w:hAnsi="メイリオ" w:eastAsia="メイリオ"/>
-                <w:b/>
-                <w:color w:val="C00000"/>
+                <w:color w:val="FFFFFF"/>
                 <w:sz w:val="20"/>
               </w:rPr>
               <w:t>端板素材の客先支給遅延（素材完成は10月中旬ごろ）</w:t>
@@ -896,79 +1346,68 @@
           </w:p>
         </w:tc>
       </w:tr>
-      <w:tr>
-        <w:tc>
-          <w:tcPr>
-            <w:tcW w:type="dxa" w:w="4873"/>
-            <w:vAlign w:val="center"/>
-          </w:tcPr>
-          <w:p>
-            <w:r/>
-            <w:r>
-              <w:rPr>
-                <w:rFonts w:ascii="メイリオ" w:hAnsi="メイリオ" w:eastAsia="メイリオ"/>
-                <w:b w:val="0"/>
-                <w:sz w:val="20"/>
-              </w:rPr>
-              <w:t>8　岩本＃2</w:t>
-            </w:r>
-          </w:p>
-        </w:tc>
-        <w:tc>
-          <w:tcPr>
-            <w:tcW w:type="dxa" w:w="4873"/>
-            <w:vAlign w:val="center"/>
-          </w:tcPr>
-          <w:p>
-            <w:r/>
-            <w:r>
-              <w:rPr>
-                <w:rFonts w:ascii="メイリオ" w:hAnsi="メイリオ" w:eastAsia="メイリオ"/>
-                <w:b w:val="0"/>
-                <w:sz w:val="20"/>
-              </w:rPr>
-              <w:t>特記事項なし</w:t>
-            </w:r>
-          </w:p>
-        </w:tc>
-      </w:tr>
     </w:tbl>
     <w:p>
       <w:pPr>
-        <w:spacing w:after="120" w:before="240"/>
-        <w:pBdr>
-          <w:bottom w:val="single" w:sz="6" w:space="1" w:color="1F497D"/>
-        </w:pBdr>
+        <w:spacing w:after="160" w:before="40"/>
+      </w:pPr>
+      <w:r>
+        <w:rPr>
+          <w:rFonts w:ascii="メイリオ" w:hAnsi="メイリオ" w:eastAsia="メイリオ"/>
+          <w:b w:val="0"/>
+          <w:color w:val="595959"/>
+          <w:sz w:val="19"/>
+        </w:rPr>
+        <w:t>岩本＃2は特記事項なし。</w:t>
+      </w:r>
+    </w:p>
+    <w:p>
+      <w:pPr>
+        <w:spacing w:before="360" w:after="160"/>
+        <w:shd w:val="clear" w:color="auto" w:fill="1F4E78"/>
+        <w:ind w:left="40"/>
       </w:pPr>
       <w:r>
         <w:rPr>
           <w:rFonts w:ascii="メイリオ" w:hAnsi="メイリオ" w:eastAsia="メイリオ"/>
           <w:b/>
-          <w:color w:val="1F497D"/>
-          <w:sz w:val="26"/>
+          <w:color w:val="FFFFFF"/>
+          <w:sz w:val="28"/>
         </w:rPr>
-        <w:t>3．コイル工場での工程（西村　報告）</w:t>
+        <w:t xml:space="preserve">　3　コイル工場での工程（西村　報告）</w:t>
       </w:r>
     </w:p>
     <w:tbl>
       <w:tblPr>
-        <w:tblStyle w:val="TableGrid"/>
         <w:tblW w:type="auto" w:w="0"/>
         <w:tblLook w:firstColumn="1" w:firstRow="1" w:lastColumn="0" w:lastRow="0" w:noHBand="0" w:noVBand="1" w:val="04A0"/>
       </w:tblPr>
       <w:tblGrid>
         <w:gridCol w:w="1984"/>
-        <w:gridCol w:w="4873"/>
+        <w:gridCol w:w="4986"/>
       </w:tblGrid>
       <w:tr>
         <w:tc>
           <w:tcPr>
-            <w:tcW w:type="dxa" w:w="4873"/>
+            <w:tcW w:type="dxa" w:w="4986"/>
             <w:vAlign w:val="center"/>
-            <w:shd w:val="clear" w:color="auto" w:fill="D9E1F2"/>
+            <w:shd w:val="clear" w:color="auto" w:fill="1F4E78"/>
+            <w:tcBorders>
+              <w:top w:val="single" w:sz="4" w:color="BFBFBF"/>
+              <w:bottom w:val="single" w:sz="4" w:color="BFBFBF"/>
+              <w:left w:val="single" w:sz="4" w:color="BFBFBF"/>
+              <w:right w:val="single" w:sz="4" w:color="BFBFBF"/>
+            </w:tcBorders>
+            <w:tcMar>
+              <w:top w:w="80" w:type="dxa"/>
+              <w:bottom w:w="80" w:type="dxa"/>
+              <w:start w:w="120" w:type="dxa"/>
+              <w:end w:w="120" w:type="dxa"/>
+            </w:tcMar>
           </w:tcPr>
           <w:p>
             <w:pPr>
+              <w:spacing w:after="0"/>
               <w:jc w:val="center"/>
             </w:pPr>
             <w:r/>
@@ -976,7 +1415,8 @@
               <w:rPr>
                 <w:rFonts w:ascii="メイリオ" w:hAnsi="メイリオ" w:eastAsia="メイリオ"/>
                 <w:b/>
-                <w:sz w:val="20"/>
+                <w:color w:val="FFFFFF"/>
+                <w:sz w:val="21"/>
               </w:rPr>
               <w:t>案件</w:t>
             </w:r>
@@ -984,12 +1424,25 @@
         </w:tc>
         <w:tc>
           <w:tcPr>
-            <w:tcW w:type="dxa" w:w="4873"/>
+            <w:tcW w:type="dxa" w:w="4986"/>
             <w:vAlign w:val="center"/>
-            <w:shd w:val="clear" w:color="auto" w:fill="D9E1F2"/>
+            <w:shd w:val="clear" w:color="auto" w:fill="1F4E78"/>
+            <w:tcBorders>
+              <w:top w:val="single" w:sz="4" w:color="BFBFBF"/>
+              <w:bottom w:val="single" w:sz="4" w:color="BFBFBF"/>
+              <w:left w:val="single" w:sz="4" w:color="BFBFBF"/>
+              <w:right w:val="single" w:sz="4" w:color="BFBFBF"/>
+            </w:tcBorders>
+            <w:tcMar>
+              <w:top w:w="80" w:type="dxa"/>
+              <w:bottom w:w="80" w:type="dxa"/>
+              <w:start w:w="120" w:type="dxa"/>
+              <w:end w:w="120" w:type="dxa"/>
+            </w:tcMar>
           </w:tcPr>
           <w:p>
             <w:pPr>
+              <w:spacing w:after="0"/>
               <w:jc w:val="center"/>
             </w:pPr>
             <w:r/>
@@ -997,7 +1450,8 @@
               <w:rPr>
                 <w:rFonts w:ascii="メイリオ" w:hAnsi="メイリオ" w:eastAsia="メイリオ"/>
                 <w:b/>
-                <w:sz w:val="20"/>
+                <w:color w:val="FFFFFF"/>
+                <w:sz w:val="21"/>
               </w:rPr>
               <w:t>状況</w:t>
             </w:r>
@@ -1007,27 +1461,58 @@
       <w:tr>
         <w:tc>
           <w:tcPr>
-            <w:tcW w:type="dxa" w:w="4873"/>
+            <w:tcW w:type="dxa" w:w="4986"/>
             <w:vAlign w:val="center"/>
+            <w:shd w:val="clear" w:color="auto" w:fill="EDF2FA"/>
+            <w:tcBorders>
+              <w:top w:val="single" w:sz="4" w:color="BFBFBF"/>
+              <w:bottom w:val="single" w:sz="4" w:color="BFBFBF"/>
+              <w:left w:val="single" w:sz="4" w:color="BFBFBF"/>
+              <w:right w:val="single" w:sz="4" w:color="BFBFBF"/>
+            </w:tcBorders>
+            <w:tcMar>
+              <w:top w:w="80" w:type="dxa"/>
+              <w:bottom w:w="80" w:type="dxa"/>
+              <w:start w:w="120" w:type="dxa"/>
+              <w:end w:w="120" w:type="dxa"/>
+            </w:tcMar>
           </w:tcPr>
           <w:p>
+            <w:pPr>
+              <w:spacing w:after="0"/>
+            </w:pPr>
             <w:r/>
             <w:r>
               <w:rPr>
                 <w:rFonts w:ascii="メイリオ" w:hAnsi="メイリオ" w:eastAsia="メイリオ"/>
-                <w:b w:val="0"/>
-                <w:sz w:val="20"/>
+                <w:b/>
+                <w:sz w:val="21"/>
               </w:rPr>
-              <w:t>1　明電舎</w:t>
+              <w:t>明電舎・板室コイル</w:t>
             </w:r>
           </w:p>
         </w:tc>
         <w:tc>
           <w:tcPr>
-            <w:tcW w:type="dxa" w:w="4873"/>
+            <w:tcW w:type="dxa" w:w="4986"/>
             <w:vAlign w:val="center"/>
+            <w:tcBorders>
+              <w:top w:val="single" w:sz="4" w:color="BFBFBF"/>
+              <w:bottom w:val="single" w:sz="4" w:color="BFBFBF"/>
+              <w:left w:val="single" w:sz="4" w:color="BFBFBF"/>
+              <w:right w:val="single" w:sz="4" w:color="BFBFBF"/>
+            </w:tcBorders>
+            <w:tcMar>
+              <w:top w:w="80" w:type="dxa"/>
+              <w:bottom w:w="80" w:type="dxa"/>
+              <w:start w:w="120" w:type="dxa"/>
+              <w:end w:w="120" w:type="dxa"/>
+            </w:tcMar>
           </w:tcPr>
           <w:p>
+            <w:pPr>
+              <w:spacing w:after="40"/>
+            </w:pPr>
             <w:r/>
             <w:r>
               <w:rPr>
@@ -1043,63 +1528,58 @@
       <w:tr>
         <w:tc>
           <w:tcPr>
-            <w:tcW w:type="dxa" w:w="4873"/>
+            <w:tcW w:type="dxa" w:w="4986"/>
             <w:vAlign w:val="center"/>
+            <w:shd w:val="clear" w:color="auto" w:fill="EDF2FA"/>
+            <w:tcBorders>
+              <w:top w:val="single" w:sz="4" w:color="BFBFBF"/>
+              <w:bottom w:val="single" w:sz="4" w:color="BFBFBF"/>
+              <w:left w:val="single" w:sz="4" w:color="BFBFBF"/>
+              <w:right w:val="single" w:sz="4" w:color="BFBFBF"/>
+            </w:tcBorders>
+            <w:tcMar>
+              <w:top w:w="80" w:type="dxa"/>
+              <w:bottom w:w="80" w:type="dxa"/>
+              <w:start w:w="120" w:type="dxa"/>
+              <w:end w:w="120" w:type="dxa"/>
+            </w:tcMar>
           </w:tcPr>
           <w:p>
+            <w:pPr>
+              <w:spacing w:after="0"/>
+            </w:pPr>
             <w:r/>
             <w:r>
               <w:rPr>
                 <w:rFonts w:ascii="メイリオ" w:hAnsi="メイリオ" w:eastAsia="メイリオ"/>
-                <w:b w:val="0"/>
-                <w:sz w:val="20"/>
+                <w:b/>
+                <w:sz w:val="21"/>
               </w:rPr>
-              <w:t>2　板室コイル</w:t>
+              <w:t>神鋼加古川</w:t>
             </w:r>
           </w:p>
         </w:tc>
         <w:tc>
           <w:tcPr>
-            <w:tcW w:type="dxa" w:w="4873"/>
+            <w:tcW w:type="dxa" w:w="4986"/>
             <w:vAlign w:val="center"/>
+            <w:tcBorders>
+              <w:top w:val="single" w:sz="4" w:color="BFBFBF"/>
+              <w:bottom w:val="single" w:sz="4" w:color="BFBFBF"/>
+              <w:left w:val="single" w:sz="4" w:color="BFBFBF"/>
+              <w:right w:val="single" w:sz="4" w:color="BFBFBF"/>
+            </w:tcBorders>
+            <w:tcMar>
+              <w:top w:w="80" w:type="dxa"/>
+              <w:bottom w:w="80" w:type="dxa"/>
+              <w:start w:w="120" w:type="dxa"/>
+              <w:end w:w="120" w:type="dxa"/>
+            </w:tcMar>
           </w:tcPr>
           <w:p>
-            <w:r/>
-            <w:r>
-              <w:rPr>
-                <w:rFonts w:ascii="メイリオ" w:hAnsi="メイリオ" w:eastAsia="メイリオ"/>
-                <w:b w:val="0"/>
-                <w:sz w:val="20"/>
-              </w:rPr>
-              <w:t>進んでる</w:t>
-            </w:r>
-          </w:p>
-        </w:tc>
-      </w:tr>
-      <w:tr>
-        <w:tc>
-          <w:tcPr>
-            <w:tcW w:type="dxa" w:w="4873"/>
-            <w:vAlign w:val="center"/>
-          </w:tcPr>
-          <w:p>
-            <w:r/>
-            <w:r>
-              <w:rPr>
-                <w:rFonts w:ascii="メイリオ" w:hAnsi="メイリオ" w:eastAsia="メイリオ"/>
-                <w:b w:val="0"/>
-                <w:sz w:val="20"/>
-              </w:rPr>
-              <w:t>3　神鋼加古川</w:t>
-            </w:r>
-          </w:p>
-        </w:tc>
-        <w:tc>
-          <w:tcPr>
-            <w:tcW w:type="dxa" w:w="4873"/>
-            <w:vAlign w:val="center"/>
-          </w:tcPr>
-          <w:p>
+            <w:pPr>
+              <w:spacing w:after="40"/>
+            </w:pPr>
             <w:r/>
             <w:r>
               <w:rPr>
@@ -1115,27 +1595,58 @@
       <w:tr>
         <w:tc>
           <w:tcPr>
-            <w:tcW w:type="dxa" w:w="4873"/>
+            <w:tcW w:type="dxa" w:w="4986"/>
             <w:vAlign w:val="center"/>
+            <w:shd w:val="clear" w:color="auto" w:fill="EDF2FA"/>
+            <w:tcBorders>
+              <w:top w:val="single" w:sz="4" w:color="BFBFBF"/>
+              <w:bottom w:val="single" w:sz="4" w:color="BFBFBF"/>
+              <w:left w:val="single" w:sz="4" w:color="BFBFBF"/>
+              <w:right w:val="single" w:sz="4" w:color="BFBFBF"/>
+            </w:tcBorders>
+            <w:tcMar>
+              <w:top w:w="80" w:type="dxa"/>
+              <w:bottom w:w="80" w:type="dxa"/>
+              <w:start w:w="120" w:type="dxa"/>
+              <w:end w:w="120" w:type="dxa"/>
+            </w:tcMar>
           </w:tcPr>
           <w:p>
+            <w:pPr>
+              <w:spacing w:after="0"/>
+            </w:pPr>
             <w:r/>
             <w:r>
               <w:rPr>
                 <w:rFonts w:ascii="メイリオ" w:hAnsi="メイリオ" w:eastAsia="メイリオ"/>
-                <w:b w:val="0"/>
-                <w:sz w:val="20"/>
+                <w:b/>
+                <w:sz w:val="21"/>
               </w:rPr>
-              <w:t>4　シンフォニア</w:t>
+              <w:t>シンフォニア</w:t>
             </w:r>
           </w:p>
         </w:tc>
         <w:tc>
           <w:tcPr>
-            <w:tcW w:type="dxa" w:w="4873"/>
+            <w:tcW w:type="dxa" w:w="4986"/>
             <w:vAlign w:val="center"/>
+            <w:tcBorders>
+              <w:top w:val="single" w:sz="4" w:color="BFBFBF"/>
+              <w:bottom w:val="single" w:sz="4" w:color="BFBFBF"/>
+              <w:left w:val="single" w:sz="4" w:color="BFBFBF"/>
+              <w:right w:val="single" w:sz="4" w:color="BFBFBF"/>
+            </w:tcBorders>
+            <w:tcMar>
+              <w:top w:w="80" w:type="dxa"/>
+              <w:bottom w:w="80" w:type="dxa"/>
+              <w:start w:w="120" w:type="dxa"/>
+              <w:end w:w="120" w:type="dxa"/>
+            </w:tcMar>
           </w:tcPr>
           <w:p>
+            <w:pPr>
+              <w:spacing w:after="40"/>
+            </w:pPr>
             <w:r/>
             <w:r>
               <w:rPr>
@@ -1151,10 +1662,58 @@
       <w:tr>
         <w:tc>
           <w:tcPr>
-            <w:tcW w:type="dxa" w:w="4873"/>
+            <w:tcW w:type="dxa" w:w="4986"/>
             <w:vAlign w:val="center"/>
+            <w:shd w:val="clear" w:color="auto" w:fill="EDF2FA"/>
+            <w:tcBorders>
+              <w:top w:val="single" w:sz="4" w:color="BFBFBF"/>
+              <w:bottom w:val="single" w:sz="4" w:color="BFBFBF"/>
+              <w:left w:val="single" w:sz="4" w:color="BFBFBF"/>
+              <w:right w:val="single" w:sz="4" w:color="BFBFBF"/>
+            </w:tcBorders>
+            <w:tcMar>
+              <w:top w:w="80" w:type="dxa"/>
+              <w:bottom w:w="80" w:type="dxa"/>
+              <w:start w:w="120" w:type="dxa"/>
+              <w:end w:w="120" w:type="dxa"/>
+            </w:tcMar>
           </w:tcPr>
           <w:p>
+            <w:pPr>
+              <w:spacing w:after="0"/>
+            </w:pPr>
+            <w:r/>
+            <w:r>
+              <w:rPr>
+                <w:rFonts w:ascii="メイリオ" w:hAnsi="メイリオ" w:eastAsia="メイリオ"/>
+                <w:b/>
+                <w:sz w:val="21"/>
+              </w:rPr>
+              <w:t>夜明</w:t>
+            </w:r>
+          </w:p>
+        </w:tc>
+        <w:tc>
+          <w:tcPr>
+            <w:tcW w:type="dxa" w:w="4986"/>
+            <w:vAlign w:val="center"/>
+            <w:tcBorders>
+              <w:top w:val="single" w:sz="4" w:color="BFBFBF"/>
+              <w:bottom w:val="single" w:sz="4" w:color="BFBFBF"/>
+              <w:left w:val="single" w:sz="4" w:color="BFBFBF"/>
+              <w:right w:val="single" w:sz="4" w:color="BFBFBF"/>
+            </w:tcBorders>
+            <w:tcMar>
+              <w:top w:w="80" w:type="dxa"/>
+              <w:bottom w:w="80" w:type="dxa"/>
+              <w:start w:w="120" w:type="dxa"/>
+              <w:end w:w="120" w:type="dxa"/>
+            </w:tcMar>
+          </w:tcPr>
+          <w:p>
+            <w:pPr>
+              <w:spacing w:after="40"/>
+            </w:pPr>
             <w:r/>
             <w:r>
               <w:rPr>
@@ -1162,16 +1721,79 @@
                 <w:b w:val="0"/>
                 <w:sz w:val="20"/>
               </w:rPr>
-              <w:t>5　夜明</w:t>
+              <w:t>・端子が工程通りに入るか要確認（コイル単品では工程通り）</w:t>
+            </w:r>
+          </w:p>
+          <w:p>
+            <w:pPr>
+              <w:spacing w:after="40"/>
+            </w:pPr>
+            <w:r>
+              <w:rPr>
+                <w:rFonts w:ascii="メイリオ" w:hAnsi="メイリオ" w:eastAsia="メイリオ"/>
+                <w:b w:val="0"/>
+                <w:sz w:val="20"/>
+              </w:rPr>
+              <w:t>・絶縁物が8/28頃入荷</w:t>
+            </w:r>
+          </w:p>
+        </w:tc>
+      </w:tr>
+      <w:tr>
+        <w:tc>
+          <w:tcPr>
+            <w:tcW w:type="dxa" w:w="4986"/>
+            <w:vAlign w:val="center"/>
+            <w:shd w:val="clear" w:color="auto" w:fill="EDF2FA"/>
+            <w:tcBorders>
+              <w:top w:val="single" w:sz="4" w:color="BFBFBF"/>
+              <w:bottom w:val="single" w:sz="4" w:color="BFBFBF"/>
+              <w:left w:val="single" w:sz="4" w:color="BFBFBF"/>
+              <w:right w:val="single" w:sz="4" w:color="BFBFBF"/>
+            </w:tcBorders>
+            <w:tcMar>
+              <w:top w:w="80" w:type="dxa"/>
+              <w:bottom w:w="80" w:type="dxa"/>
+              <w:start w:w="120" w:type="dxa"/>
+              <w:end w:w="120" w:type="dxa"/>
+            </w:tcMar>
+          </w:tcPr>
+          <w:p>
+            <w:pPr>
+              <w:spacing w:after="0"/>
+            </w:pPr>
+            <w:r/>
+            <w:r>
+              <w:rPr>
+                <w:rFonts w:ascii="メイリオ" w:hAnsi="メイリオ" w:eastAsia="メイリオ"/>
+                <w:b/>
+                <w:sz w:val="21"/>
+              </w:rPr>
+              <w:t>黒川</w:t>
             </w:r>
           </w:p>
         </w:tc>
         <w:tc>
           <w:tcPr>
-            <w:tcW w:type="dxa" w:w="4873"/>
+            <w:tcW w:type="dxa" w:w="4986"/>
             <w:vAlign w:val="center"/>
+            <w:tcBorders>
+              <w:top w:val="single" w:sz="4" w:color="BFBFBF"/>
+              <w:bottom w:val="single" w:sz="4" w:color="BFBFBF"/>
+              <w:left w:val="single" w:sz="4" w:color="BFBFBF"/>
+              <w:right w:val="single" w:sz="4" w:color="BFBFBF"/>
+            </w:tcBorders>
+            <w:tcMar>
+              <w:top w:w="80" w:type="dxa"/>
+              <w:bottom w:w="80" w:type="dxa"/>
+              <w:start w:w="120" w:type="dxa"/>
+              <w:end w:w="120" w:type="dxa"/>
+            </w:tcMar>
           </w:tcPr>
           <w:p>
+            <w:pPr>
+              <w:spacing w:after="40"/>
+            </w:pPr>
             <w:r/>
             <w:r>
               <w:rPr>
@@ -1179,7 +1801,20 @@
                 <w:b w:val="0"/>
                 <w:sz w:val="20"/>
               </w:rPr>
-              <w:t>端子が工程通りに入るか要確認。コイル単品では工程通り。絶縁物が8/28頃入荷</w:t>
+              <w:t>・端子が工程通りに入るか要確認（コイル単品では工程通り）</w:t>
+            </w:r>
+          </w:p>
+          <w:p>
+            <w:pPr>
+              <w:spacing w:after="40"/>
+            </w:pPr>
+            <w:r>
+              <w:rPr>
+                <w:rFonts w:ascii="メイリオ" w:hAnsi="メイリオ" w:eastAsia="メイリオ"/>
+                <w:b w:val="0"/>
+                <w:sz w:val="20"/>
+              </w:rPr>
+              <w:t>・絶縁物が7/15頃入荷</w:t>
             </w:r>
           </w:p>
         </w:tc>
@@ -1187,10 +1822,126 @@
       <w:tr>
         <w:tc>
           <w:tcPr>
-            <w:tcW w:type="dxa" w:w="4873"/>
+            <w:tcW w:type="dxa" w:w="4986"/>
             <w:vAlign w:val="center"/>
+            <w:tcBorders>
+              <w:top w:val="single" w:sz="4" w:color="BFBFBF"/>
+              <w:bottom w:val="single" w:sz="4" w:color="BFBFBF"/>
+              <w:left w:val="single" w:sz="4" w:color="BFBFBF"/>
+              <w:right w:val="single" w:sz="4" w:color="BFBFBF"/>
+            </w:tcBorders>
+            <w:tcMar>
+              <w:top w:w="80" w:type="dxa"/>
+              <w:bottom w:w="80" w:type="dxa"/>
+              <w:start w:w="120" w:type="dxa"/>
+              <w:end w:w="120" w:type="dxa"/>
+            </w:tcMar>
           </w:tcPr>
           <w:p>
+            <w:pPr>
+              <w:spacing w:after="0"/>
+            </w:pPr>
+            <w:r/>
+            <w:r>
+              <w:rPr>
+                <w:rFonts w:ascii="メイリオ" w:hAnsi="メイリオ" w:eastAsia="メイリオ"/>
+                <w:b/>
+                <w:sz w:val="21"/>
+              </w:rPr>
+              <w:t>板室組立</w:t>
+            </w:r>
+          </w:p>
+        </w:tc>
+        <w:tc>
+          <w:tcPr>
+            <w:tcW w:type="dxa" w:w="4986"/>
+            <w:vAlign w:val="center"/>
+            <w:shd w:val="clear" w:color="auto" w:fill="C45A11"/>
+            <w:tcBorders>
+              <w:top w:val="single" w:sz="4" w:color="BFBFBF"/>
+              <w:bottom w:val="single" w:sz="4" w:color="BFBFBF"/>
+              <w:left w:val="single" w:sz="4" w:color="BFBFBF"/>
+              <w:right w:val="single" w:sz="4" w:color="BFBFBF"/>
+            </w:tcBorders>
+            <w:tcMar>
+              <w:top w:w="80" w:type="dxa"/>
+              <w:bottom w:w="80" w:type="dxa"/>
+              <w:start w:w="120" w:type="dxa"/>
+              <w:end w:w="120" w:type="dxa"/>
+            </w:tcMar>
+          </w:tcPr>
+          <w:p>
+            <w:pPr>
+              <w:spacing w:after="40"/>
+            </w:pPr>
+            <w:r/>
+            <w:r>
+              <w:rPr>
+                <w:rFonts w:ascii="メイリオ" w:hAnsi="メイリオ" w:eastAsia="メイリオ"/>
+                <w:b w:val="0"/>
+                <w:color w:val="FFFFFF"/>
+                <w:sz w:val="20"/>
+              </w:rPr>
+              <w:t>成瀬とほぼ同じタイミング（負荷集中）</w:t>
+            </w:r>
+          </w:p>
+        </w:tc>
+      </w:tr>
+      <w:tr>
+        <w:tc>
+          <w:tcPr>
+            <w:tcW w:type="dxa" w:w="4986"/>
+            <w:vAlign w:val="center"/>
+            <w:shd w:val="clear" w:color="auto" w:fill="EDF2FA"/>
+            <w:tcBorders>
+              <w:top w:val="single" w:sz="4" w:color="BFBFBF"/>
+              <w:bottom w:val="single" w:sz="4" w:color="BFBFBF"/>
+              <w:left w:val="single" w:sz="4" w:color="BFBFBF"/>
+              <w:right w:val="single" w:sz="4" w:color="BFBFBF"/>
+            </w:tcBorders>
+            <w:tcMar>
+              <w:top w:w="80" w:type="dxa"/>
+              <w:bottom w:w="80" w:type="dxa"/>
+              <w:start w:w="120" w:type="dxa"/>
+              <w:end w:w="120" w:type="dxa"/>
+            </w:tcMar>
+          </w:tcPr>
+          <w:p>
+            <w:pPr>
+              <w:spacing w:after="0"/>
+            </w:pPr>
+            <w:r/>
+            <w:r>
+              <w:rPr>
+                <w:rFonts w:ascii="メイリオ" w:hAnsi="メイリオ" w:eastAsia="メイリオ"/>
+                <w:b/>
+                <w:sz w:val="21"/>
+              </w:rPr>
+              <w:t>成瀬</w:t>
+            </w:r>
+          </w:p>
+        </w:tc>
+        <w:tc>
+          <w:tcPr>
+            <w:tcW w:type="dxa" w:w="4986"/>
+            <w:vAlign w:val="center"/>
+            <w:tcBorders>
+              <w:top w:val="single" w:sz="4" w:color="BFBFBF"/>
+              <w:bottom w:val="single" w:sz="4" w:color="BFBFBF"/>
+              <w:left w:val="single" w:sz="4" w:color="BFBFBF"/>
+              <w:right w:val="single" w:sz="4" w:color="BFBFBF"/>
+            </w:tcBorders>
+            <w:tcMar>
+              <w:top w:w="80" w:type="dxa"/>
+              <w:bottom w:w="80" w:type="dxa"/>
+              <w:start w:w="120" w:type="dxa"/>
+              <w:end w:w="120" w:type="dxa"/>
+            </w:tcMar>
+          </w:tcPr>
+          <w:p>
+            <w:pPr>
+              <w:spacing w:after="40"/>
+            </w:pPr>
             <w:r/>
             <w:r>
               <w:rPr>
@@ -1198,24 +1949,20 @@
                 <w:b w:val="0"/>
                 <w:sz w:val="20"/>
               </w:rPr>
-              <w:t>6　黒川</w:t>
+              <w:t>・巻き成型・フィン切まで（仕上げまで）はいける</w:t>
             </w:r>
           </w:p>
-        </w:tc>
-        <w:tc>
-          <w:tcPr>
-            <w:tcW w:type="dxa" w:w="4873"/>
-            <w:vAlign w:val="center"/>
-          </w:tcPr>
           <w:p>
-            <w:r/>
+            <w:pPr>
+              <w:spacing w:after="40"/>
+            </w:pPr>
             <w:r>
               <w:rPr>
                 <w:rFonts w:ascii="メイリオ" w:hAnsi="メイリオ" w:eastAsia="メイリオ"/>
                 <w:b w:val="0"/>
                 <w:sz w:val="20"/>
               </w:rPr>
-              <w:t>端子が工程通りに入るか要確認。コイル単品では工程通り。絶縁物が7/15頃入荷</w:t>
+              <w:t>・その後、層間紙待ち</w:t>
             </w:r>
           </w:p>
         </w:tc>
@@ -1223,217 +1970,67 @@
       <w:tr>
         <w:tc>
           <w:tcPr>
-            <w:tcW w:type="dxa" w:w="4873"/>
+            <w:tcW w:type="dxa" w:w="4986"/>
             <w:vAlign w:val="center"/>
+            <w:tcBorders>
+              <w:top w:val="single" w:sz="4" w:color="BFBFBF"/>
+              <w:bottom w:val="single" w:sz="4" w:color="BFBFBF"/>
+              <w:left w:val="single" w:sz="4" w:color="BFBFBF"/>
+              <w:right w:val="single" w:sz="4" w:color="BFBFBF"/>
+            </w:tcBorders>
+            <w:tcMar>
+              <w:top w:w="80" w:type="dxa"/>
+              <w:bottom w:w="80" w:type="dxa"/>
+              <w:start w:w="120" w:type="dxa"/>
+              <w:end w:w="120" w:type="dxa"/>
+            </w:tcMar>
           </w:tcPr>
           <w:p>
+            <w:pPr>
+              <w:spacing w:after="0"/>
+            </w:pPr>
+            <w:r/>
+            <w:r>
+              <w:rPr>
+                <w:rFonts w:ascii="メイリオ" w:hAnsi="メイリオ" w:eastAsia="メイリオ"/>
+                <w:b/>
+                <w:sz w:val="21"/>
+              </w:rPr>
+              <w:t>志比内</w:t>
+            </w:r>
+          </w:p>
+        </w:tc>
+        <w:tc>
+          <w:tcPr>
+            <w:tcW w:type="dxa" w:w="4986"/>
+            <w:vAlign w:val="center"/>
+            <w:shd w:val="clear" w:color="auto" w:fill="C45A11"/>
+            <w:tcBorders>
+              <w:top w:val="single" w:sz="4" w:color="BFBFBF"/>
+              <w:bottom w:val="single" w:sz="4" w:color="BFBFBF"/>
+              <w:left w:val="single" w:sz="4" w:color="BFBFBF"/>
+              <w:right w:val="single" w:sz="4" w:color="BFBFBF"/>
+            </w:tcBorders>
+            <w:tcMar>
+              <w:top w:w="80" w:type="dxa"/>
+              <w:bottom w:w="80" w:type="dxa"/>
+              <w:start w:w="120" w:type="dxa"/>
+              <w:end w:w="120" w:type="dxa"/>
+            </w:tcMar>
+          </w:tcPr>
+          <w:p>
+            <w:pPr>
+              <w:spacing w:after="40"/>
+            </w:pPr>
             <w:r/>
             <w:r>
               <w:rPr>
                 <w:rFonts w:ascii="メイリオ" w:hAnsi="メイリオ" w:eastAsia="メイリオ"/>
                 <w:b w:val="0"/>
+                <w:color w:val="FFFFFF"/>
                 <w:sz w:val="20"/>
               </w:rPr>
-              <w:t>7　板室組立</w:t>
-            </w:r>
-          </w:p>
-        </w:tc>
-        <w:tc>
-          <w:tcPr>
-            <w:tcW w:type="dxa" w:w="4873"/>
-            <w:vAlign w:val="center"/>
-          </w:tcPr>
-          <w:p>
-            <w:r/>
-            <w:r>
-              <w:rPr>
-                <w:rFonts w:ascii="メイリオ" w:hAnsi="メイリオ" w:eastAsia="メイリオ"/>
-                <w:b/>
-                <w:color w:val="C45A11"/>
-                <w:sz w:val="20"/>
-              </w:rPr>
-              <w:t>成瀬とほぼ同じタイミング（負荷集中・しんどい）</w:t>
-            </w:r>
-          </w:p>
-        </w:tc>
-      </w:tr>
-      <w:tr>
-        <w:tc>
-          <w:tcPr>
-            <w:tcW w:type="dxa" w:w="4873"/>
-            <w:vAlign w:val="center"/>
-          </w:tcPr>
-          <w:p>
-            <w:r/>
-            <w:r>
-              <w:rPr>
-                <w:rFonts w:ascii="メイリオ" w:hAnsi="メイリオ" w:eastAsia="メイリオ"/>
-                <w:b w:val="0"/>
-                <w:sz w:val="20"/>
-              </w:rPr>
-              <w:t>8　成瀬</w:t>
-            </w:r>
-          </w:p>
-        </w:tc>
-        <w:tc>
-          <w:tcPr>
-            <w:tcW w:type="dxa" w:w="4873"/>
-            <w:vAlign w:val="center"/>
-          </w:tcPr>
-          <w:p>
-            <w:r/>
-            <w:r>
-              <w:rPr>
-                <w:rFonts w:ascii="メイリオ" w:hAnsi="メイリオ" w:eastAsia="メイリオ"/>
-                <w:b w:val="0"/>
-                <w:sz w:val="20"/>
-              </w:rPr>
-              <w:t>巻き成型・フィン切まで（仕上げまで）はいける。その後、層間紙待ち</w:t>
-            </w:r>
-          </w:p>
-        </w:tc>
-      </w:tr>
-      <w:tr>
-        <w:tc>
-          <w:tcPr>
-            <w:tcW w:type="dxa" w:w="4873"/>
-            <w:vAlign w:val="center"/>
-          </w:tcPr>
-          <w:p>
-            <w:r/>
-            <w:r>
-              <w:rPr>
-                <w:rFonts w:ascii="メイリオ" w:hAnsi="メイリオ" w:eastAsia="メイリオ"/>
-                <w:b w:val="0"/>
-                <w:sz w:val="20"/>
-              </w:rPr>
-              <w:t>9　岩本＃1</w:t>
-            </w:r>
-          </w:p>
-        </w:tc>
-        <w:tc>
-          <w:tcPr>
-            <w:tcW w:type="dxa" w:w="4873"/>
-            <w:vAlign w:val="center"/>
-          </w:tcPr>
-          <w:p>
-            <w:r/>
-            <w:r>
-              <w:rPr>
-                <w:rFonts w:ascii="メイリオ" w:hAnsi="メイリオ" w:eastAsia="メイリオ"/>
-                <w:b w:val="0"/>
-                <w:sz w:val="20"/>
-              </w:rPr>
-              <w:t>特記事項なし</w:t>
-            </w:r>
-          </w:p>
-        </w:tc>
-      </w:tr>
-      <w:tr>
-        <w:tc>
-          <w:tcPr>
-            <w:tcW w:type="dxa" w:w="4873"/>
-            <w:vAlign w:val="center"/>
-          </w:tcPr>
-          <w:p>
-            <w:r/>
-            <w:r>
-              <w:rPr>
-                <w:rFonts w:ascii="メイリオ" w:hAnsi="メイリオ" w:eastAsia="メイリオ"/>
-                <w:b w:val="0"/>
-                <w:sz w:val="20"/>
-              </w:rPr>
-              <w:t>10　白沢</w:t>
-            </w:r>
-          </w:p>
-        </w:tc>
-        <w:tc>
-          <w:tcPr>
-            <w:tcW w:type="dxa" w:w="4873"/>
-            <w:vAlign w:val="center"/>
-          </w:tcPr>
-          <w:p>
-            <w:r/>
-            <w:r>
-              <w:rPr>
-                <w:rFonts w:ascii="メイリオ" w:hAnsi="メイリオ" w:eastAsia="メイリオ"/>
-                <w:b w:val="0"/>
-                <w:sz w:val="20"/>
-              </w:rPr>
-              <w:t>特記事項なし</w:t>
-            </w:r>
-          </w:p>
-        </w:tc>
-      </w:tr>
-      <w:tr>
-        <w:tc>
-          <w:tcPr>
-            <w:tcW w:type="dxa" w:w="4873"/>
-            <w:vAlign w:val="center"/>
-          </w:tcPr>
-          <w:p>
-            <w:r/>
-            <w:r>
-              <w:rPr>
-                <w:rFonts w:ascii="メイリオ" w:hAnsi="メイリオ" w:eastAsia="メイリオ"/>
-                <w:b w:val="0"/>
-                <w:sz w:val="20"/>
-              </w:rPr>
-              <w:t>11　志比内</w:t>
-            </w:r>
-          </w:p>
-        </w:tc>
-        <w:tc>
-          <w:tcPr>
-            <w:tcW w:type="dxa" w:w="4873"/>
-            <w:vAlign w:val="center"/>
-          </w:tcPr>
-          <w:p>
-            <w:r/>
-            <w:r>
-              <w:rPr>
-                <w:rFonts w:ascii="メイリオ" w:hAnsi="メイリオ" w:eastAsia="メイリオ"/>
-                <w:b/>
-                <w:color w:val="C45A11"/>
-                <w:sz w:val="20"/>
-              </w:rPr>
-              <w:t>白沢とタイミングがラップする（負荷集中・しんどい）</w:t>
-            </w:r>
-          </w:p>
-        </w:tc>
-      </w:tr>
-      <w:tr>
-        <w:tc>
-          <w:tcPr>
-            <w:tcW w:type="dxa" w:w="4873"/>
-            <w:vAlign w:val="center"/>
-          </w:tcPr>
-          <w:p>
-            <w:r/>
-            <w:r>
-              <w:rPr>
-                <w:rFonts w:ascii="メイリオ" w:hAnsi="メイリオ" w:eastAsia="メイリオ"/>
-                <w:b w:val="0"/>
-                <w:sz w:val="20"/>
-              </w:rPr>
-              <w:t>12　岩本＃2</w:t>
-            </w:r>
-          </w:p>
-        </w:tc>
-        <w:tc>
-          <w:tcPr>
-            <w:tcW w:type="dxa" w:w="4873"/>
-            <w:vAlign w:val="center"/>
-          </w:tcPr>
-          <w:p>
-            <w:r/>
-            <w:r>
-              <w:rPr>
-                <w:rFonts w:ascii="メイリオ" w:hAnsi="メイリオ" w:eastAsia="メイリオ"/>
-                <w:b w:val="0"/>
-                <w:sz w:val="20"/>
-              </w:rPr>
-              <w:t>特記事項なし</w:t>
+              <w:t>白沢とタイミングがラップする（負荷集中）</w:t>
             </w:r>
           </w:p>
         </w:tc>
@@ -1441,414 +2038,7 @@
     </w:tbl>
     <w:p>
       <w:pPr>
-        <w:spacing w:after="120" w:before="240"/>
-        <w:pBdr>
-          <w:bottom w:val="single" w:sz="6" w:space="1" w:color="1F497D"/>
-        </w:pBdr>
-      </w:pPr>
-      <w:r>
-        <w:rPr>
-          <w:rFonts w:ascii="メイリオ" w:hAnsi="メイリオ" w:eastAsia="メイリオ"/>
-          <w:b/>
-          <w:color w:val="1F497D"/>
-          <w:sz w:val="26"/>
-        </w:rPr>
-        <w:t>4．日鉄テックスエンジ・桑原電工について</w:t>
-      </w:r>
-    </w:p>
-    <w:p>
-      <w:pPr>
-        <w:spacing w:after="60" w:before="120"/>
-      </w:pPr>
-      <w:r>
-        <w:rPr>
-          <w:rFonts w:ascii="メイリオ" w:hAnsi="メイリオ" w:eastAsia="メイリオ"/>
-          <w:b/>
-          <w:color w:val="2E74B5"/>
-          <w:sz w:val="21"/>
-        </w:rPr>
-        <w:t>【神鋼加古川　主極（鉄心・コンペン）】</w:t>
-      </w:r>
-    </w:p>
-    <w:p>
-      <w:pPr>
-        <w:pStyle w:val="ListBullet"/>
-        <w:spacing w:after="40" w:before="40"/>
-      </w:pPr>
-      <w:r>
-        <w:rPr>
-          <w:rFonts w:ascii="メイリオ" w:hAnsi="メイリオ" w:eastAsia="メイリオ"/>
-          <w:b w:val="0"/>
-          <w:sz w:val="20"/>
-        </w:rPr>
-        <w:t>三谷での作業は終了（現在、電研にて製作中）</w:t>
-      </w:r>
-    </w:p>
-    <w:p>
-      <w:pPr>
-        <w:spacing w:after="60" w:before="120"/>
-      </w:pPr>
-      <w:r>
-        <w:rPr>
-          <w:rFonts w:ascii="メイリオ" w:hAnsi="メイリオ" w:eastAsia="メイリオ"/>
-          <w:b/>
-          <w:color w:val="2E74B5"/>
-          <w:sz w:val="21"/>
-        </w:rPr>
-        <w:t>【神鋼加古川　補極　2極】</w:t>
-      </w:r>
-    </w:p>
-    <w:p>
-      <w:pPr>
-        <w:pStyle w:val="ListBullet"/>
-        <w:spacing w:after="40" w:before="40"/>
-      </w:pPr>
-      <w:r>
-        <w:rPr>
-          <w:rFonts w:ascii="メイリオ" w:hAnsi="メイリオ" w:eastAsia="メイリオ"/>
-          <w:b w:val="0"/>
-          <w:sz w:val="20"/>
-        </w:rPr>
-        <w:t>鉄心の穴あけ加工中（2本目）</w:t>
-      </w:r>
-    </w:p>
-    <w:p>
-      <w:pPr>
-        <w:pStyle w:val="ListBullet"/>
-        <w:spacing w:after="40" w:before="40"/>
-      </w:pPr>
-      <w:r>
-        <w:rPr>
-          <w:rFonts w:ascii="メイリオ" w:hAnsi="メイリオ" w:eastAsia="メイリオ"/>
-          <w:b w:val="0"/>
-          <w:sz w:val="20"/>
-        </w:rPr>
-        <w:t>コイルは現在巻き中（笠戸工場）</w:t>
-      </w:r>
-    </w:p>
-    <w:p>
-      <w:pPr>
-        <w:pStyle w:val="ListBullet"/>
-        <w:spacing w:after="40" w:before="40"/>
-      </w:pPr>
-      <w:r>
-        <w:rPr>
-          <w:rFonts w:ascii="メイリオ" w:hAnsi="メイリオ" w:eastAsia="メイリオ"/>
-          <w:b w:val="0"/>
-          <w:sz w:val="20"/>
-        </w:rPr>
-        <w:t>組立：7/16よりポール組み立て開始予定（7月上旬）</w:t>
-      </w:r>
-    </w:p>
-    <w:p>
-      <w:pPr>
-        <w:pStyle w:val="ListBullet2"/>
-        <w:spacing w:after="40" w:before="40"/>
-      </w:pPr>
-      <w:r>
-        <w:rPr>
-          <w:rFonts w:ascii="メイリオ" w:hAnsi="メイリオ" w:eastAsia="メイリオ"/>
-          <w:b/>
-          <w:color w:val="C45A11"/>
-          <w:sz w:val="20"/>
-        </w:rPr>
-        <w:t xml:space="preserve">　→ マット6に間に合うか、磯田さんが確認</w:t>
-      </w:r>
-    </w:p>
-    <w:p>
-      <w:pPr>
-        <w:pStyle w:val="ListBullet"/>
-        <w:spacing w:after="40" w:before="40"/>
-      </w:pPr>
-      <w:r>
-        <w:rPr>
-          <w:rFonts w:ascii="メイリオ" w:hAnsi="メイリオ" w:eastAsia="メイリオ"/>
-          <w:b w:val="0"/>
-          <w:sz w:val="20"/>
-        </w:rPr>
-        <w:t>細かい部品が入っているか、西原さんが確認</w:t>
-      </w:r>
-    </w:p>
-    <w:p/>
-    <w:tbl>
-      <w:tblPr>
-        <w:tblStyle w:val="TableGrid"/>
-        <w:tblW w:type="auto" w:w="0"/>
-        <w:tblLook w:firstColumn="1" w:firstRow="1" w:lastColumn="0" w:lastRow="0" w:noHBand="0" w:noVBand="1" w:val="04A0"/>
-      </w:tblPr>
-      <w:tblGrid>
-        <w:gridCol w:w="2381"/>
-        <w:gridCol w:w="4873"/>
-      </w:tblGrid>
-      <w:tr>
-        <w:tc>
-          <w:tcPr>
-            <w:tcW w:type="dxa" w:w="4873"/>
-            <w:vAlign w:val="center"/>
-            <w:shd w:val="clear" w:color="auto" w:fill="D9E1F2"/>
-          </w:tcPr>
-          <w:p>
-            <w:pPr>
-              <w:jc w:val="center"/>
-            </w:pPr>
-            <w:r/>
-            <w:r>
-              <w:rPr>
-                <w:rFonts w:ascii="メイリオ" w:hAnsi="メイリオ" w:eastAsia="メイリオ"/>
-                <w:b/>
-                <w:sz w:val="20"/>
-              </w:rPr>
-              <w:t>案件（納期：2026/9/25）</w:t>
-            </w:r>
-          </w:p>
-        </w:tc>
-        <w:tc>
-          <w:tcPr>
-            <w:tcW w:type="dxa" w:w="4873"/>
-            <w:vAlign w:val="center"/>
-            <w:shd w:val="clear" w:color="auto" w:fill="D9E1F2"/>
-          </w:tcPr>
-          <w:p>
-            <w:pPr>
-              <w:jc w:val="center"/>
-            </w:pPr>
-            <w:r/>
-            <w:r>
-              <w:rPr>
-                <w:rFonts w:ascii="メイリオ" w:hAnsi="メイリオ" w:eastAsia="メイリオ"/>
-                <w:b/>
-                <w:sz w:val="20"/>
-              </w:rPr>
-              <w:t>状況</w:t>
-            </w:r>
-          </w:p>
-        </w:tc>
-      </w:tr>
-      <w:tr>
-        <w:tc>
-          <w:tcPr>
-            <w:tcW w:type="dxa" w:w="4873"/>
-            <w:vAlign w:val="center"/>
-          </w:tcPr>
-          <w:p>
-            <w:r/>
-            <w:r>
-              <w:rPr>
-                <w:rFonts w:ascii="メイリオ" w:hAnsi="メイリオ" w:eastAsia="メイリオ"/>
-                <w:b/>
-                <w:sz w:val="20"/>
-              </w:rPr>
-              <w:t>F1〜3　主極　2極</w:t>
-            </w:r>
-          </w:p>
-        </w:tc>
-        <w:tc>
-          <w:tcPr>
-            <w:tcW w:type="dxa" w:w="4873"/>
-            <w:vAlign w:val="center"/>
-          </w:tcPr>
-          <w:p>
-            <w:r/>
-            <w:r>
-              <w:rPr>
-                <w:rFonts w:ascii="メイリオ" w:hAnsi="メイリオ" w:eastAsia="メイリオ"/>
-                <w:b w:val="0"/>
-                <w:color w:val="C45A11"/>
-                <w:sz w:val="19"/>
-              </w:rPr>
-              <w:t>コンペン入荷済（検査未・明日検査予定／バリ有れば鉄心で手仕上げ）。コイル巻き材料・巻き治具・コア板は入荷済み（治具待ち）。焼き付け治具が未手配</w:t>
-            </w:r>
-          </w:p>
-        </w:tc>
-      </w:tr>
-      <w:tr>
-        <w:tc>
-          <w:tcPr>
-            <w:tcW w:type="dxa" w:w="4873"/>
-            <w:vAlign w:val="center"/>
-          </w:tcPr>
-          <w:p>
-            <w:r/>
-            <w:r>
-              <w:rPr>
-                <w:rFonts w:ascii="メイリオ" w:hAnsi="メイリオ" w:eastAsia="メイリオ"/>
-                <w:b/>
-                <w:sz w:val="20"/>
-              </w:rPr>
-              <w:t>F1〜3　補極　1極</w:t>
-            </w:r>
-          </w:p>
-        </w:tc>
-        <w:tc>
-          <w:tcPr>
-            <w:tcW w:type="dxa" w:w="4873"/>
-            <w:vAlign w:val="center"/>
-          </w:tcPr>
-          <w:p>
-            <w:r/>
-            <w:r>
-              <w:rPr>
-                <w:rFonts w:ascii="メイリオ" w:hAnsi="メイリオ" w:eastAsia="メイリオ"/>
-                <w:b w:val="0"/>
-                <w:color w:val="C00000"/>
-                <w:sz w:val="19"/>
-              </w:rPr>
-              <w:t>コア板：入荷済みだが現物行方不明のため問い合わせ中（数量懸念は問題なしと確認済み）。コイル材料7/中旬入荷、治具7/13</w:t>
-            </w:r>
-          </w:p>
-        </w:tc>
-      </w:tr>
-      <w:tr>
-        <w:tc>
-          <w:tcPr>
-            <w:tcW w:type="dxa" w:w="4873"/>
-            <w:vAlign w:val="center"/>
-          </w:tcPr>
-          <w:p>
-            <w:r/>
-            <w:r>
-              <w:rPr>
-                <w:rFonts w:ascii="メイリオ" w:hAnsi="メイリオ" w:eastAsia="メイリオ"/>
-                <w:b/>
-                <w:sz w:val="20"/>
-              </w:rPr>
-              <w:t>F4　主極</w:t>
-            </w:r>
-          </w:p>
-        </w:tc>
-        <w:tc>
-          <w:tcPr>
-            <w:tcW w:type="dxa" w:w="4873"/>
-            <w:vAlign w:val="center"/>
-          </w:tcPr>
-          <w:p>
-            <w:r/>
-            <w:r>
-              <w:rPr>
-                <w:rFonts w:ascii="メイリオ" w:hAnsi="メイリオ" w:eastAsia="メイリオ"/>
-                <w:b w:val="0"/>
-                <w:sz w:val="19"/>
-              </w:rPr>
-              <w:t>コア板7/3予定。コイル巻き材料は入荷済み</w:t>
-            </w:r>
-          </w:p>
-        </w:tc>
-      </w:tr>
-      <w:tr>
-        <w:tc>
-          <w:tcPr>
-            <w:tcW w:type="dxa" w:w="4873"/>
-            <w:vAlign w:val="center"/>
-          </w:tcPr>
-          <w:p>
-            <w:r/>
-            <w:r>
-              <w:rPr>
-                <w:rFonts w:ascii="メイリオ" w:hAnsi="メイリオ" w:eastAsia="メイリオ"/>
-                <w:b/>
-                <w:sz w:val="20"/>
-              </w:rPr>
-              <w:t>F4　補極</w:t>
-            </w:r>
-          </w:p>
-        </w:tc>
-        <w:tc>
-          <w:tcPr>
-            <w:tcW w:type="dxa" w:w="4873"/>
-            <w:vAlign w:val="center"/>
-          </w:tcPr>
-          <w:p>
-            <w:r/>
-            <w:r>
-              <w:rPr>
-                <w:rFonts w:ascii="メイリオ" w:hAnsi="メイリオ" w:eastAsia="メイリオ"/>
-                <w:b w:val="0"/>
-                <w:color w:val="C45A11"/>
-                <w:sz w:val="19"/>
-              </w:rPr>
-              <w:t>コア板まだ。補助コミュコイル材（支給品）未着。コイル材料7/中旬入荷、治具7/13</w:t>
-            </w:r>
-          </w:p>
-        </w:tc>
-      </w:tr>
-      <w:tr>
-        <w:tc>
-          <w:tcPr>
-            <w:tcW w:type="dxa" w:w="4873"/>
-            <w:vAlign w:val="center"/>
-          </w:tcPr>
-          <w:p>
-            <w:r/>
-            <w:r>
-              <w:rPr>
-                <w:rFonts w:ascii="メイリオ" w:hAnsi="メイリオ" w:eastAsia="メイリオ"/>
-                <w:b/>
-                <w:sz w:val="20"/>
-              </w:rPr>
-              <w:t>F5　主極</w:t>
-            </w:r>
-          </w:p>
-        </w:tc>
-        <w:tc>
-          <w:tcPr>
-            <w:tcW w:type="dxa" w:w="4873"/>
-            <w:vAlign w:val="center"/>
-          </w:tcPr>
-          <w:p>
-            <w:r/>
-            <w:r>
-              <w:rPr>
-                <w:rFonts w:ascii="メイリオ" w:hAnsi="メイリオ" w:eastAsia="メイリオ"/>
-                <w:b w:val="0"/>
-                <w:color w:val="C45A11"/>
-                <w:sz w:val="19"/>
-              </w:rPr>
-              <w:t>コア板まだ。コイル巻き材料は入荷済み</w:t>
-            </w:r>
-          </w:p>
-        </w:tc>
-      </w:tr>
-      <w:tr>
-        <w:tc>
-          <w:tcPr>
-            <w:tcW w:type="dxa" w:w="4873"/>
-            <w:vAlign w:val="center"/>
-          </w:tcPr>
-          <w:p>
-            <w:r/>
-            <w:r>
-              <w:rPr>
-                <w:rFonts w:ascii="メイリオ" w:hAnsi="メイリオ" w:eastAsia="メイリオ"/>
-                <w:b/>
-                <w:sz w:val="20"/>
-              </w:rPr>
-              <w:t>F5　補極</w:t>
-            </w:r>
-          </w:p>
-        </w:tc>
-        <w:tc>
-          <w:tcPr>
-            <w:tcW w:type="dxa" w:w="4873"/>
-            <w:vAlign w:val="center"/>
-          </w:tcPr>
-          <w:p>
-            <w:r/>
-            <w:r>
-              <w:rPr>
-                <w:rFonts w:ascii="メイリオ" w:hAnsi="メイリオ" w:eastAsia="メイリオ"/>
-                <w:b w:val="0"/>
-                <w:color w:val="C45A11"/>
-                <w:sz w:val="19"/>
-              </w:rPr>
-              <w:t>コア板まだ。コイル材料7/中旬入荷、治具7/13</w:t>
-            </w:r>
-          </w:p>
-        </w:tc>
-      </w:tr>
-    </w:tbl>
-    <w:p>
-      <w:pPr>
-        <w:spacing w:after="120"/>
+        <w:spacing w:after="160" w:before="40"/>
       </w:pPr>
       <w:r>
         <w:rPr>
@@ -1857,30 +2047,503 @@
           <w:color w:val="595959"/>
           <w:sz w:val="19"/>
         </w:rPr>
-        <w:t>※F1〜F5　主極・補極　全案件　共通納期：2026年9月25日</w:t>
+        <w:t>岩本＃1・白沢・岩本＃2は特記事項なし。</w:t>
       </w:r>
     </w:p>
     <w:p>
       <w:pPr>
-        <w:spacing w:after="120" w:before="240"/>
-        <w:pBdr>
-          <w:bottom w:val="single" w:sz="6" w:space="1" w:color="1F497D"/>
-        </w:pBdr>
+        <w:spacing w:before="360" w:after="160"/>
+        <w:shd w:val="clear" w:color="auto" w:fill="1F4E78"/>
+        <w:ind w:left="40"/>
+      </w:pPr>
+      <w:r>
+        <w:rPr>
+          <w:rFonts w:ascii="メイリオ" w:hAnsi="メイリオ" w:eastAsia="メイリオ"/>
+          <w:b/>
+          <w:color w:val="FFFFFF"/>
+          <w:sz w:val="28"/>
+        </w:rPr>
+        <w:t xml:space="preserve">　4　日鉄テックスエンジ・桑原電工について</w:t>
+      </w:r>
+    </w:p>
+    <w:p>
+      <w:pPr>
+        <w:spacing w:after="80" w:before="200"/>
       </w:pPr>
       <w:r>
         <w:rPr>
           <w:rFonts w:ascii="メイリオ" w:hAnsi="メイリオ" w:eastAsia="メイリオ"/>
           <w:b/>
           <w:color w:val="1F497D"/>
-          <w:sz w:val="26"/>
+          <w:sz w:val="24"/>
         </w:rPr>
-        <w:t>5．気になること（懸念事項・今後のアクション）</w:t>
+        <w:t>神鋼加古川　主極（鉄心・コンペン）</w:t>
       </w:r>
     </w:p>
     <w:p>
       <w:pPr>
         <w:pStyle w:val="ListBullet"/>
-        <w:spacing w:after="40" w:before="40"/>
+        <w:spacing w:after="60" w:before="0" w:line="276" w:lineRule="auto"/>
+      </w:pPr>
+      <w:r>
+        <w:rPr>
+          <w:rFonts w:ascii="メイリオ" w:hAnsi="メイリオ" w:eastAsia="メイリオ"/>
+          <w:b w:val="0"/>
+          <w:sz w:val="21"/>
+        </w:rPr>
+        <w:t>三谷での作業は終了（現在、電研にて製作中）</w:t>
+      </w:r>
+    </w:p>
+    <w:p>
+      <w:pPr>
+        <w:spacing w:after="80" w:before="200"/>
+      </w:pPr>
+      <w:r>
+        <w:rPr>
+          <w:rFonts w:ascii="メイリオ" w:hAnsi="メイリオ" w:eastAsia="メイリオ"/>
+          <w:b/>
+          <w:color w:val="1F497D"/>
+          <w:sz w:val="24"/>
+        </w:rPr>
+        <w:t>神鋼加古川　補極　2極</w:t>
+      </w:r>
+    </w:p>
+    <w:p>
+      <w:pPr>
+        <w:pStyle w:val="ListBullet"/>
+        <w:spacing w:after="60" w:before="0" w:line="276" w:lineRule="auto"/>
+      </w:pPr>
+      <w:r>
+        <w:rPr>
+          <w:rFonts w:ascii="メイリオ" w:hAnsi="メイリオ" w:eastAsia="メイリオ"/>
+          <w:b w:val="0"/>
+          <w:sz w:val="21"/>
+        </w:rPr>
+        <w:t>鉄心の穴あけ加工中（2本目）</w:t>
+      </w:r>
+    </w:p>
+    <w:p>
+      <w:pPr>
+        <w:pStyle w:val="ListBullet"/>
+        <w:spacing w:after="60" w:before="0" w:line="276" w:lineRule="auto"/>
+      </w:pPr>
+      <w:r>
+        <w:rPr>
+          <w:rFonts w:ascii="メイリオ" w:hAnsi="メイリオ" w:eastAsia="メイリオ"/>
+          <w:b w:val="0"/>
+          <w:sz w:val="21"/>
+        </w:rPr>
+        <w:t>コイルは現在巻き中（笠戸工場）</w:t>
+      </w:r>
+    </w:p>
+    <w:p>
+      <w:pPr>
+        <w:pStyle w:val="ListBullet"/>
+        <w:spacing w:after="60" w:before="0" w:line="276" w:lineRule="auto"/>
+      </w:pPr>
+      <w:r>
+        <w:rPr>
+          <w:rFonts w:ascii="メイリオ" w:hAnsi="メイリオ" w:eastAsia="メイリオ"/>
+          <w:b w:val="0"/>
+          <w:sz w:val="21"/>
+        </w:rPr>
+        <w:t>組立：7/16よりポール組み立て開始予定（7月上旬）</w:t>
+      </w:r>
+    </w:p>
+    <w:p>
+      <w:pPr>
+        <w:pStyle w:val="ListBullet2"/>
+        <w:spacing w:after="60" w:before="0" w:line="276" w:lineRule="auto"/>
+      </w:pPr>
+      <w:r>
+        <w:rPr>
+          <w:rFonts w:ascii="メイリオ" w:hAnsi="メイリオ" w:eastAsia="メイリオ"/>
+          <w:b/>
+          <w:color w:val="C45A11"/>
+          <w:sz w:val="21"/>
+        </w:rPr>
+        <w:t xml:space="preserve">　→ マット6に間に合うか、磯田さんが確認</w:t>
+      </w:r>
+    </w:p>
+    <w:p>
+      <w:pPr>
+        <w:pStyle w:val="ListBullet"/>
+        <w:spacing w:after="60" w:before="0" w:line="276" w:lineRule="auto"/>
+      </w:pPr>
+      <w:r>
+        <w:rPr>
+          <w:rFonts w:ascii="メイリオ" w:hAnsi="メイリオ" w:eastAsia="メイリオ"/>
+          <w:b w:val="0"/>
+          <w:sz w:val="21"/>
+        </w:rPr>
+        <w:t>細かい部品が入っているか、西原さんが確認</w:t>
+      </w:r>
+    </w:p>
+    <w:p/>
+    <w:p>
+      <w:pPr>
+        <w:spacing w:after="120"/>
+      </w:pPr>
+      <w:r>
+        <w:rPr>
+          <w:rFonts w:ascii="メイリオ" w:hAnsi="メイリオ" w:eastAsia="メイリオ"/>
+          <w:b/>
+          <w:color w:val="1F497D"/>
+          <w:sz w:val="21"/>
+        </w:rPr>
+        <w:t>以下、F1〜F5の主極・補極　共通納期：2026年9月25日</w:t>
+      </w:r>
+    </w:p>
+    <w:p>
+      <w:pPr>
+        <w:spacing w:before="200" w:after="60"/>
+      </w:pPr>
+      <w:r>
+        <w:rPr>
+          <w:rFonts w:ascii="メイリオ" w:hAnsi="メイリオ" w:eastAsia="メイリオ"/>
+          <w:b/>
+          <w:color w:val="1F497D"/>
+          <w:sz w:val="23"/>
+        </w:rPr>
+        <w:t xml:space="preserve">F1〜3　主極　2極　</w:t>
+      </w:r>
+      <w:r>
+        <w:rPr>
+          <w:rFonts w:ascii="メイリオ" w:hAnsi="メイリオ" w:eastAsia="メイリオ"/>
+          <w:b/>
+          <w:color w:val="FFFFFF"/>
+          <w:sz w:val="19"/>
+          <w:shd w:val="clear" w:color="auto" w:fill="C45A11"/>
+        </w:rPr>
+        <w:t xml:space="preserve">  経過観察  </w:t>
+      </w:r>
+    </w:p>
+    <w:p>
+      <w:pPr>
+        <w:pStyle w:val="ListBullet"/>
+        <w:spacing w:after="60" w:before="0" w:line="276" w:lineRule="auto"/>
+      </w:pPr>
+      <w:r>
+        <w:rPr>
+          <w:rFonts w:ascii="メイリオ" w:hAnsi="メイリオ" w:eastAsia="メイリオ"/>
+          <w:b w:val="0"/>
+          <w:sz w:val="21"/>
+        </w:rPr>
+        <w:t>コンペンは入荷済み（検査未・明日検査予定）。バリがあれば鉄心で手仕上げ</w:t>
+      </w:r>
+    </w:p>
+    <w:p>
+      <w:pPr>
+        <w:pStyle w:val="ListBullet"/>
+        <w:spacing w:after="60" w:before="0" w:line="276" w:lineRule="auto"/>
+      </w:pPr>
+      <w:r>
+        <w:rPr>
+          <w:rFonts w:ascii="メイリオ" w:hAnsi="メイリオ" w:eastAsia="メイリオ"/>
+          <w:b w:val="0"/>
+          <w:sz w:val="21"/>
+        </w:rPr>
+        <w:t>コイル巻き材料・巻き治具・コア板は入荷済み（治具待ち）</w:t>
+      </w:r>
+    </w:p>
+    <w:p>
+      <w:pPr>
+        <w:pStyle w:val="ListBullet"/>
+        <w:spacing w:after="60" w:before="0" w:line="276" w:lineRule="auto"/>
+      </w:pPr>
+      <w:r>
+        <w:rPr>
+          <w:rFonts w:ascii="メイリオ" w:hAnsi="メイリオ" w:eastAsia="メイリオ"/>
+          <w:b w:val="0"/>
+          <w:sz w:val="21"/>
+        </w:rPr>
+        <w:t>焼き付け治具が未手配</w:t>
+      </w:r>
+    </w:p>
+    <w:p>
+      <w:pPr>
+        <w:spacing w:before="200" w:after="60"/>
+      </w:pPr>
+      <w:r>
+        <w:rPr>
+          <w:rFonts w:ascii="メイリオ" w:hAnsi="メイリオ" w:eastAsia="メイリオ"/>
+          <w:b/>
+          <w:color w:val="1F497D"/>
+          <w:sz w:val="23"/>
+        </w:rPr>
+        <w:t xml:space="preserve">F1〜3　補極　1極　</w:t>
+      </w:r>
+      <w:r>
+        <w:rPr>
+          <w:rFonts w:ascii="メイリオ" w:hAnsi="メイリオ" w:eastAsia="メイリオ"/>
+          <w:b/>
+          <w:color w:val="FFFFFF"/>
+          <w:sz w:val="19"/>
+          <w:shd w:val="clear" w:color="auto" w:fill="8B0000"/>
+        </w:rPr>
+        <w:t xml:space="preserve">  要注意  </w:t>
+      </w:r>
+    </w:p>
+    <w:p>
+      <w:pPr>
+        <w:pStyle w:val="ListBullet"/>
+        <w:spacing w:after="60" w:before="0" w:line="276" w:lineRule="auto"/>
+      </w:pPr>
+      <w:r>
+        <w:rPr>
+          <w:rFonts w:ascii="メイリオ" w:hAnsi="メイリオ" w:eastAsia="メイリオ"/>
+          <w:b w:val="0"/>
+          <w:sz w:val="21"/>
+        </w:rPr>
+        <w:t>コア板：数量の懸念は問題なしと確認済みだが、入荷済みのはずの現物が行方不明のため問い合わせ中</w:t>
+      </w:r>
+    </w:p>
+    <w:p>
+      <w:pPr>
+        <w:pStyle w:val="ListBullet"/>
+        <w:spacing w:after="60" w:before="0" w:line="276" w:lineRule="auto"/>
+      </w:pPr>
+      <w:r>
+        <w:rPr>
+          <w:rFonts w:ascii="メイリオ" w:hAnsi="メイリオ" w:eastAsia="メイリオ"/>
+          <w:b w:val="0"/>
+          <w:sz w:val="21"/>
+        </w:rPr>
+        <w:t>コイル材料は7/中旬入荷予定、治具は7/13入荷予定</w:t>
+      </w:r>
+    </w:p>
+    <w:p>
+      <w:pPr>
+        <w:spacing w:before="200" w:after="60"/>
+      </w:pPr>
+      <w:r>
+        <w:rPr>
+          <w:rFonts w:ascii="メイリオ" w:hAnsi="メイリオ" w:eastAsia="メイリオ"/>
+          <w:b/>
+          <w:color w:val="1F497D"/>
+          <w:sz w:val="23"/>
+        </w:rPr>
+        <w:t xml:space="preserve">F4　主極　</w:t>
+      </w:r>
+    </w:p>
+    <w:p>
+      <w:pPr>
+        <w:pStyle w:val="ListBullet"/>
+        <w:spacing w:after="60" w:before="0" w:line="276" w:lineRule="auto"/>
+      </w:pPr>
+      <w:r>
+        <w:rPr>
+          <w:rFonts w:ascii="メイリオ" w:hAnsi="メイリオ" w:eastAsia="メイリオ"/>
+          <w:b w:val="0"/>
+          <w:sz w:val="21"/>
+        </w:rPr>
+        <w:t>コア板は7/3入荷予定</w:t>
+      </w:r>
+    </w:p>
+    <w:p>
+      <w:pPr>
+        <w:pStyle w:val="ListBullet"/>
+        <w:spacing w:after="60" w:before="0" w:line="276" w:lineRule="auto"/>
+      </w:pPr>
+      <w:r>
+        <w:rPr>
+          <w:rFonts w:ascii="メイリオ" w:hAnsi="メイリオ" w:eastAsia="メイリオ"/>
+          <w:b w:val="0"/>
+          <w:sz w:val="21"/>
+        </w:rPr>
+        <w:t>コイル巻き材料は入荷済み</w:t>
+      </w:r>
+    </w:p>
+    <w:p>
+      <w:pPr>
+        <w:spacing w:before="200" w:after="60"/>
+      </w:pPr>
+      <w:r>
+        <w:rPr>
+          <w:rFonts w:ascii="メイリオ" w:hAnsi="メイリオ" w:eastAsia="メイリオ"/>
+          <w:b/>
+          <w:color w:val="1F497D"/>
+          <w:sz w:val="23"/>
+        </w:rPr>
+        <w:t xml:space="preserve">F4　補極　</w:t>
+      </w:r>
+      <w:r>
+        <w:rPr>
+          <w:rFonts w:ascii="メイリオ" w:hAnsi="メイリオ" w:eastAsia="メイリオ"/>
+          <w:b/>
+          <w:color w:val="FFFFFF"/>
+          <w:sz w:val="19"/>
+          <w:shd w:val="clear" w:color="auto" w:fill="C45A11"/>
+        </w:rPr>
+        <w:t xml:space="preserve">  経過観察  </w:t>
+      </w:r>
+    </w:p>
+    <w:p>
+      <w:pPr>
+        <w:pStyle w:val="ListBullet"/>
+        <w:spacing w:after="60" w:before="0" w:line="276" w:lineRule="auto"/>
+      </w:pPr>
+      <w:r>
+        <w:rPr>
+          <w:rFonts w:ascii="メイリオ" w:hAnsi="メイリオ" w:eastAsia="メイリオ"/>
+          <w:b w:val="0"/>
+          <w:sz w:val="21"/>
+        </w:rPr>
+        <w:t>コア板はまだ入荷していない</w:t>
+      </w:r>
+    </w:p>
+    <w:p>
+      <w:pPr>
+        <w:pStyle w:val="ListBullet"/>
+        <w:spacing w:after="60" w:before="0" w:line="276" w:lineRule="auto"/>
+      </w:pPr>
+      <w:r>
+        <w:rPr>
+          <w:rFonts w:ascii="メイリオ" w:hAnsi="メイリオ" w:eastAsia="メイリオ"/>
+          <w:b w:val="0"/>
+          <w:sz w:val="21"/>
+        </w:rPr>
+        <w:t>補助コミュコイル材（支給品）が未着</w:t>
+      </w:r>
+    </w:p>
+    <w:p>
+      <w:pPr>
+        <w:pStyle w:val="ListBullet"/>
+        <w:spacing w:after="60" w:before="0" w:line="276" w:lineRule="auto"/>
+      </w:pPr>
+      <w:r>
+        <w:rPr>
+          <w:rFonts w:ascii="メイリオ" w:hAnsi="メイリオ" w:eastAsia="メイリオ"/>
+          <w:b w:val="0"/>
+          <w:sz w:val="21"/>
+        </w:rPr>
+        <w:t>コイル材料は7/中旬入荷予定、治具は7/13入荷予定</w:t>
+      </w:r>
+    </w:p>
+    <w:p>
+      <w:pPr>
+        <w:spacing w:before="200" w:after="60"/>
+      </w:pPr>
+      <w:r>
+        <w:rPr>
+          <w:rFonts w:ascii="メイリオ" w:hAnsi="メイリオ" w:eastAsia="メイリオ"/>
+          <w:b/>
+          <w:color w:val="1F497D"/>
+          <w:sz w:val="23"/>
+        </w:rPr>
+        <w:t xml:space="preserve">F5　主極　</w:t>
+      </w:r>
+      <w:r>
+        <w:rPr>
+          <w:rFonts w:ascii="メイリオ" w:hAnsi="メイリオ" w:eastAsia="メイリオ"/>
+          <w:b/>
+          <w:color w:val="FFFFFF"/>
+          <w:sz w:val="19"/>
+          <w:shd w:val="clear" w:color="auto" w:fill="C45A11"/>
+        </w:rPr>
+        <w:t xml:space="preserve">  経過観察  </w:t>
+      </w:r>
+    </w:p>
+    <w:p>
+      <w:pPr>
+        <w:pStyle w:val="ListBullet"/>
+        <w:spacing w:after="60" w:before="0" w:line="276" w:lineRule="auto"/>
+      </w:pPr>
+      <w:r>
+        <w:rPr>
+          <w:rFonts w:ascii="メイリオ" w:hAnsi="メイリオ" w:eastAsia="メイリオ"/>
+          <w:b w:val="0"/>
+          <w:sz w:val="21"/>
+        </w:rPr>
+        <w:t>コア板はまだ入荷していない</w:t>
+      </w:r>
+    </w:p>
+    <w:p>
+      <w:pPr>
+        <w:pStyle w:val="ListBullet"/>
+        <w:spacing w:after="60" w:before="0" w:line="276" w:lineRule="auto"/>
+      </w:pPr>
+      <w:r>
+        <w:rPr>
+          <w:rFonts w:ascii="メイリオ" w:hAnsi="メイリオ" w:eastAsia="メイリオ"/>
+          <w:b w:val="0"/>
+          <w:sz w:val="21"/>
+        </w:rPr>
+        <w:t>コイル巻き材料は入荷済み</w:t>
+      </w:r>
+    </w:p>
+    <w:p>
+      <w:pPr>
+        <w:spacing w:before="200" w:after="60"/>
+      </w:pPr>
+      <w:r>
+        <w:rPr>
+          <w:rFonts w:ascii="メイリオ" w:hAnsi="メイリオ" w:eastAsia="メイリオ"/>
+          <w:b/>
+          <w:color w:val="1F497D"/>
+          <w:sz w:val="23"/>
+        </w:rPr>
+        <w:t xml:space="preserve">F5　補極　</w:t>
+      </w:r>
+      <w:r>
+        <w:rPr>
+          <w:rFonts w:ascii="メイリオ" w:hAnsi="メイリオ" w:eastAsia="メイリオ"/>
+          <w:b/>
+          <w:color w:val="FFFFFF"/>
+          <w:sz w:val="19"/>
+          <w:shd w:val="clear" w:color="auto" w:fill="C45A11"/>
+        </w:rPr>
+        <w:t xml:space="preserve">  経過観察  </w:t>
+      </w:r>
+    </w:p>
+    <w:p>
+      <w:pPr>
+        <w:pStyle w:val="ListBullet"/>
+        <w:spacing w:after="60" w:before="0" w:line="276" w:lineRule="auto"/>
+      </w:pPr>
+      <w:r>
+        <w:rPr>
+          <w:rFonts w:ascii="メイリオ" w:hAnsi="メイリオ" w:eastAsia="メイリオ"/>
+          <w:b w:val="0"/>
+          <w:sz w:val="21"/>
+        </w:rPr>
+        <w:t>コア板はまだ入荷していない</w:t>
+      </w:r>
+    </w:p>
+    <w:p>
+      <w:pPr>
+        <w:pStyle w:val="ListBullet"/>
+        <w:spacing w:after="60" w:before="0" w:line="276" w:lineRule="auto"/>
+      </w:pPr>
+      <w:r>
+        <w:rPr>
+          <w:rFonts w:ascii="メイリオ" w:hAnsi="メイリオ" w:eastAsia="メイリオ"/>
+          <w:b w:val="0"/>
+          <w:sz w:val="21"/>
+        </w:rPr>
+        <w:t>コイル材料は7/中旬入荷予定、治具は7/13入荷予定</w:t>
+      </w:r>
+    </w:p>
+    <w:p>
+      <w:pPr>
+        <w:spacing w:before="360" w:after="160"/>
+        <w:shd w:val="clear" w:color="auto" w:fill="1F4E78"/>
+        <w:ind w:left="40"/>
+      </w:pPr>
+      <w:r>
+        <w:rPr>
+          <w:rFonts w:ascii="メイリオ" w:hAnsi="メイリオ" w:eastAsia="メイリオ"/>
+          <w:b/>
+          <w:color w:val="FFFFFF"/>
+          <w:sz w:val="28"/>
+        </w:rPr>
+        <w:t xml:space="preserve">　5　気になること（懸念事項・今後のアクション）</w:t>
+      </w:r>
+    </w:p>
+    <w:p>
+      <w:pPr>
+        <w:pStyle w:val="ListBullet"/>
+        <w:spacing w:after="60" w:before="0" w:line="276" w:lineRule="auto"/>
       </w:pPr>
       <w:r>
         <w:rPr>
@@ -1895,7 +2558,7 @@
     <w:p>
       <w:pPr>
         <w:pStyle w:val="ListBullet"/>
-        <w:spacing w:after="40" w:before="40"/>
+        <w:spacing w:after="60" w:before="0" w:line="276" w:lineRule="auto"/>
       </w:pPr>
       <w:r>
         <w:rPr>
@@ -1909,7 +2572,7 @@
     <w:p>
       <w:pPr>
         <w:pStyle w:val="ListBullet"/>
-        <w:spacing w:after="40" w:before="40"/>
+        <w:spacing w:after="60" w:before="0" w:line="276" w:lineRule="auto"/>
       </w:pPr>
       <w:r>
         <w:rPr>
@@ -1923,7 +2586,7 @@
     <w:p>
       <w:pPr>
         <w:pStyle w:val="ListBullet"/>
-        <w:spacing w:after="40" w:before="40"/>
+        <w:spacing w:after="60" w:before="0" w:line="276" w:lineRule="auto"/>
       </w:pPr>
       <w:r>
         <w:rPr>
@@ -1950,7 +2613,7 @@
     </w:p>
     <w:sectPr>
       <w:pgSz w:w="12240" w:h="15840"/>
-      <w:pgMar w:top="1134" w:right="1247" w:bottom="1134" w:left="1247" w:header="720" w:footer="720" w:gutter="0"/>
+      <w:pgMar w:top="1020" w:right="1134" w:bottom="1020" w:left="1134" w:header="720" w:footer="720" w:gutter="0"/>
       <w:cols w:space="720"/>
       <w:docGrid w:linePitch="360"/>
     </w:sectPr>
@@ -2321,8 +2984,12 @@
     <w:name w:val="Normal"/>
     <w:qFormat/>
     <w:rsid w:val="00FC693F"/>
+    <w:pPr>
+      <w:spacing w:line="276" w:lineRule="auto"/>
+    </w:pPr>
     <w:rPr>
       <w:rFonts w:ascii="メイリオ" w:hAnsi="メイリオ" w:eastAsia="メイリオ"/>
+      <w:sz w:val="22"/>
     </w:rPr>
   </w:style>
   <w:style w:type="paragraph" w:styleId="Header">

</xml_diff>

<commit_message>
Simplify process meeting minutes to plain layout, fix typos
https://claude.ai/code/session_01HBPuJMpmbrXasqyXKTkHjP
</commit_message>
<xml_diff>
--- a/議事録_工程会議_20260629.docx
+++ b/議事録_工程会議_20260629.docx
@@ -2,21 +2,6 @@
 <file path=word/document.xml><?xml version="1.0" encoding="utf-8"?>
 <w:document xmlns:wpc="http://schemas.microsoft.com/office/word/2010/wordprocessingCanvas" xmlns:mo="http://schemas.microsoft.com/office/mac/office/2008/main" xmlns:mc="http://schemas.openxmlformats.org/markup-compatibility/2006" xmlns:mv="urn:schemas-microsoft-com:mac:vml" xmlns:o="urn:schemas-microsoft-com:office:office" xmlns:r="http://schemas.openxmlformats.org/officeDocument/2006/relationships" xmlns:m="http://schemas.openxmlformats.org/officeDocument/2006/math" xmlns:v="urn:schemas-microsoft-com:vml" xmlns:wp14="http://schemas.microsoft.com/office/word/2010/wordprocessingDrawing" xmlns:wp="http://schemas.openxmlformats.org/drawingml/2006/wordprocessingDrawing" xmlns:w10="urn:schemas-microsoft-com:office:word" xmlns:w="http://schemas.openxmlformats.org/wordprocessingml/2006/main" xmlns:w14="http://schemas.microsoft.com/office/word/2010/wordml" xmlns:wpg="http://schemas.microsoft.com/office/word/2010/wordprocessingGroup" xmlns:wpi="http://schemas.microsoft.com/office/word/2010/wordprocessingInk" xmlns:wne="http://schemas.microsoft.com/office/word/2006/wordml" xmlns:wps="http://schemas.microsoft.com/office/word/2010/wordprocessingShape" mc:Ignorable="w14 wp14">
   <w:body>
-    <w:p>
-      <w:pPr>
-        <w:spacing w:after="80"/>
-        <w:jc w:val="center"/>
-      </w:pPr>
-      <w:r>
-        <w:rPr>
-          <w:rFonts w:ascii="メイリオ" w:hAnsi="メイリオ" w:eastAsia="メイリオ"/>
-          <w:b/>
-          <w:color w:val="1F497D"/>
-          <w:sz w:val="40"/>
-        </w:rPr>
-        <w:t>工程会議　議事録</w:t>
-      </w:r>
-    </w:p>
     <w:p>
       <w:pPr>
         <w:spacing w:after="240"/>
@@ -25,51 +10,36 @@
       <w:r>
         <w:rPr>
           <w:rFonts w:ascii="メイリオ" w:hAnsi="メイリオ" w:eastAsia="メイリオ"/>
-          <w:b w:val="0"/>
-          <w:color w:val="595959"/>
-          <w:sz w:val="19"/>
+          <w:b/>
+          <w:color w:val="1F497D"/>
+          <w:sz w:val="36"/>
         </w:rPr>
-        <w:t>※本会議に参加していないリーダーの方にも分かるよう、要点を整理しています</w:t>
+        <w:t>工程会議　議事録</w:t>
       </w:r>
     </w:p>
     <w:tbl>
       <w:tblPr>
+        <w:tblStyle w:val="TableGrid"/>
         <w:tblW w:type="auto" w:w="0"/>
         <w:tblLook w:firstColumn="1" w:firstRow="1" w:lastColumn="0" w:lastRow="0" w:noHBand="0" w:noVBand="1" w:val="04A0"/>
       </w:tblPr>
       <w:tblGrid>
         <w:gridCol w:w="1701"/>
-        <w:gridCol w:w="4986"/>
+        <w:gridCol w:w="4703"/>
       </w:tblGrid>
       <w:tr>
         <w:tc>
           <w:tcPr>
-            <w:tcW w:type="dxa" w:w="4986"/>
-            <w:vAlign w:val="center"/>
-            <w:shd w:val="clear" w:color="auto" w:fill="EDF2FA"/>
-            <w:tcBorders>
-              <w:top w:val="single" w:sz="4" w:color="BFBFBF"/>
-              <w:bottom w:val="single" w:sz="4" w:color="BFBFBF"/>
-              <w:left w:val="single" w:sz="4" w:color="BFBFBF"/>
-              <w:right w:val="single" w:sz="4" w:color="BFBFBF"/>
-            </w:tcBorders>
-            <w:tcMar>
-              <w:top w:w="80" w:type="dxa"/>
-              <w:bottom w:w="80" w:type="dxa"/>
-              <w:start w:w="120" w:type="dxa"/>
-              <w:end w:w="120" w:type="dxa"/>
-            </w:tcMar>
+            <w:tcW w:type="dxa" w:w="4703"/>
+            <w:shd w:val="clear" w:color="auto" w:fill="D9E1F2"/>
           </w:tcPr>
           <w:p>
-            <w:pPr>
-              <w:spacing w:after="0"/>
-            </w:pPr>
             <w:r/>
             <w:r>
               <w:rPr>
                 <w:rFonts w:ascii="メイリオ" w:hAnsi="メイリオ" w:eastAsia="メイリオ"/>
                 <w:b/>
-                <w:sz w:val="22"/>
+                <w:sz w:val="21"/>
               </w:rPr>
               <w:t>日　　時</w:t>
             </w:r>
@@ -77,31 +47,15 @@
         </w:tc>
         <w:tc>
           <w:tcPr>
-            <w:tcW w:type="dxa" w:w="4986"/>
-            <w:vAlign w:val="center"/>
-            <w:tcBorders>
-              <w:top w:val="single" w:sz="4" w:color="BFBFBF"/>
-              <w:bottom w:val="single" w:sz="4" w:color="BFBFBF"/>
-              <w:left w:val="single" w:sz="4" w:color="BFBFBF"/>
-              <w:right w:val="single" w:sz="4" w:color="BFBFBF"/>
-            </w:tcBorders>
-            <w:tcMar>
-              <w:top w:w="80" w:type="dxa"/>
-              <w:bottom w:w="80" w:type="dxa"/>
-              <w:start w:w="120" w:type="dxa"/>
-              <w:end w:w="120" w:type="dxa"/>
-            </w:tcMar>
+            <w:tcW w:type="dxa" w:w="4703"/>
           </w:tcPr>
           <w:p>
-            <w:pPr>
-              <w:spacing w:after="0"/>
-            </w:pPr>
             <w:r/>
             <w:r>
               <w:rPr>
                 <w:rFonts w:ascii="メイリオ" w:hAnsi="メイリオ" w:eastAsia="メイリオ"/>
                 <w:b w:val="0"/>
-                <w:sz w:val="22"/>
+                <w:sz w:val="21"/>
               </w:rPr>
               <w:t>2026年6月29日（月）　15:10〜17:30</w:t>
             </w:r>
@@ -111,32 +65,16 @@
       <w:tr>
         <w:tc>
           <w:tcPr>
-            <w:tcW w:type="dxa" w:w="4986"/>
-            <w:vAlign w:val="center"/>
-            <w:shd w:val="clear" w:color="auto" w:fill="EDF2FA"/>
-            <w:tcBorders>
-              <w:top w:val="single" w:sz="4" w:color="BFBFBF"/>
-              <w:bottom w:val="single" w:sz="4" w:color="BFBFBF"/>
-              <w:left w:val="single" w:sz="4" w:color="BFBFBF"/>
-              <w:right w:val="single" w:sz="4" w:color="BFBFBF"/>
-            </w:tcBorders>
-            <w:tcMar>
-              <w:top w:w="80" w:type="dxa"/>
-              <w:bottom w:w="80" w:type="dxa"/>
-              <w:start w:w="120" w:type="dxa"/>
-              <w:end w:w="120" w:type="dxa"/>
-            </w:tcMar>
+            <w:tcW w:type="dxa" w:w="4703"/>
+            <w:shd w:val="clear" w:color="auto" w:fill="D9E1F2"/>
           </w:tcPr>
           <w:p>
-            <w:pPr>
-              <w:spacing w:after="0"/>
-            </w:pPr>
             <w:r/>
             <w:r>
               <w:rPr>
                 <w:rFonts w:ascii="メイリオ" w:hAnsi="メイリオ" w:eastAsia="メイリオ"/>
                 <w:b/>
-                <w:sz w:val="22"/>
+                <w:sz w:val="21"/>
               </w:rPr>
               <w:t>参　加　者</w:t>
             </w:r>
@@ -144,237 +82,17 @@
         </w:tc>
         <w:tc>
           <w:tcPr>
-            <w:tcW w:type="dxa" w:w="4986"/>
-            <w:vAlign w:val="center"/>
-            <w:tcBorders>
-              <w:top w:val="single" w:sz="4" w:color="BFBFBF"/>
-              <w:bottom w:val="single" w:sz="4" w:color="BFBFBF"/>
-              <w:left w:val="single" w:sz="4" w:color="BFBFBF"/>
-              <w:right w:val="single" w:sz="4" w:color="BFBFBF"/>
-            </w:tcBorders>
-            <w:tcMar>
-              <w:top w:w="80" w:type="dxa"/>
-              <w:bottom w:w="80" w:type="dxa"/>
-              <w:start w:w="120" w:type="dxa"/>
-              <w:end w:w="120" w:type="dxa"/>
-            </w:tcMar>
+            <w:tcW w:type="dxa" w:w="4703"/>
           </w:tcPr>
           <w:p>
-            <w:pPr>
-              <w:spacing w:after="0"/>
-            </w:pPr>
             <w:r/>
             <w:r>
               <w:rPr>
                 <w:rFonts w:ascii="メイリオ" w:hAnsi="メイリオ" w:eastAsia="メイリオ"/>
                 <w:b w:val="0"/>
-                <w:sz w:val="22"/>
+                <w:sz w:val="21"/>
               </w:rPr>
               <w:t>社長、宮本、磯田、西口、西原、工場長</w:t>
-            </w:r>
-          </w:p>
-        </w:tc>
-      </w:tr>
-      <w:tr>
-        <w:tc>
-          <w:tcPr>
-            <w:tcW w:type="dxa" w:w="4986"/>
-            <w:vAlign w:val="center"/>
-            <w:shd w:val="clear" w:color="auto" w:fill="EDF2FA"/>
-            <w:tcBorders>
-              <w:top w:val="single" w:sz="4" w:color="BFBFBF"/>
-              <w:bottom w:val="single" w:sz="4" w:color="BFBFBF"/>
-              <w:left w:val="single" w:sz="4" w:color="BFBFBF"/>
-              <w:right w:val="single" w:sz="4" w:color="BFBFBF"/>
-            </w:tcBorders>
-            <w:tcMar>
-              <w:top w:w="80" w:type="dxa"/>
-              <w:bottom w:w="80" w:type="dxa"/>
-              <w:start w:w="120" w:type="dxa"/>
-              <w:end w:w="120" w:type="dxa"/>
-            </w:tcMar>
-          </w:tcPr>
-          <w:p>
-            <w:pPr>
-              <w:spacing w:after="0"/>
-            </w:pPr>
-            <w:r/>
-            <w:r>
-              <w:rPr>
-                <w:rFonts w:ascii="メイリオ" w:hAnsi="メイリオ" w:eastAsia="メイリオ"/>
-                <w:b/>
-                <w:sz w:val="22"/>
-              </w:rPr>
-              <w:t>議　　題</w:t>
-            </w:r>
-          </w:p>
-        </w:tc>
-        <w:tc>
-          <w:tcPr>
-            <w:tcW w:type="dxa" w:w="4986"/>
-            <w:vAlign w:val="center"/>
-            <w:tcBorders>
-              <w:top w:val="single" w:sz="4" w:color="BFBFBF"/>
-              <w:bottom w:val="single" w:sz="4" w:color="BFBFBF"/>
-              <w:left w:val="single" w:sz="4" w:color="BFBFBF"/>
-              <w:right w:val="single" w:sz="4" w:color="BFBFBF"/>
-            </w:tcBorders>
-            <w:tcMar>
-              <w:top w:w="80" w:type="dxa"/>
-              <w:bottom w:w="80" w:type="dxa"/>
-              <w:start w:w="120" w:type="dxa"/>
-              <w:end w:w="120" w:type="dxa"/>
-            </w:tcMar>
-          </w:tcPr>
-          <w:p>
-            <w:pPr>
-              <w:spacing w:after="0"/>
-            </w:pPr>
-            <w:r/>
-            <w:r>
-              <w:rPr>
-                <w:rFonts w:ascii="メイリオ" w:hAnsi="メイリオ" w:eastAsia="メイリオ"/>
-                <w:b w:val="0"/>
-                <w:sz w:val="22"/>
-              </w:rPr>
-              <w:t>①層間絶縁紙の調達　②鉄心工場工程　③コイル工場工程　④日鉄テックスエンジ・桑原電工　⑤懸念事項</w:t>
-            </w:r>
-          </w:p>
-        </w:tc>
-      </w:tr>
-    </w:tbl>
-    <w:p/>
-    <w:tbl>
-      <w:tblPr>
-        <w:tblW w:type="auto" w:w="0"/>
-        <w:tblLook w:firstColumn="1" w:firstRow="1" w:lastColumn="0" w:lastRow="0" w:noHBand="0" w:noVBand="1" w:val="04A0"/>
-      </w:tblPr>
-      <w:tblGrid>
-        <w:gridCol w:w="9972"/>
-      </w:tblGrid>
-      <w:tr>
-        <w:tc>
-          <w:tcPr>
-            <w:tcW w:type="dxa" w:w="9972"/>
-            <w:shd w:val="clear" w:color="auto" w:fill="FFF2CC"/>
-            <w:tcBorders>
-              <w:top w:val="single" w:sz="8" w:color="BF8F00"/>
-              <w:bottom w:val="single" w:sz="8" w:color="BF8F00"/>
-              <w:left w:val="single" w:sz="8" w:color="BF8F00"/>
-              <w:right w:val="single" w:sz="8" w:color="BF8F00"/>
-            </w:tcBorders>
-            <w:tcMar>
-              <w:top w:w="160" w:type="dxa"/>
-              <w:bottom w:w="160" w:type="dxa"/>
-              <w:start w:w="200" w:type="dxa"/>
-              <w:end w:w="200" w:type="dxa"/>
-            </w:tcMar>
-          </w:tcPr>
-          <w:p>
-            <w:pPr>
-              <w:spacing w:after="80"/>
-            </w:pPr>
-            <w:r/>
-            <w:r>
-              <w:rPr>
-                <w:rFonts w:ascii="メイリオ" w:hAnsi="メイリオ" w:eastAsia="メイリオ"/>
-                <w:b/>
-                <w:color w:val="7F6000"/>
-                <w:sz w:val="24"/>
-              </w:rPr>
-              <w:t>★ 今回の重要ポイント（サマリー）</w:t>
-            </w:r>
-          </w:p>
-          <w:p>
-            <w:pPr>
-              <w:spacing w:after="40"/>
-            </w:pPr>
-            <w:r>
-              <w:rPr>
-                <w:rFonts w:ascii="メイリオ" w:hAnsi="メイリオ" w:eastAsia="メイリオ"/>
-                <w:b/>
-                <w:color w:val="7F6000"/>
-                <w:sz w:val="21"/>
-              </w:rPr>
-              <w:t>・</w:t>
-            </w:r>
-            <w:r>
-              <w:rPr>
-                <w:rFonts w:ascii="メイリオ" w:hAnsi="メイリオ" w:eastAsia="メイリオ"/>
-                <w:b w:val="0"/>
-                <w:color w:val="403000"/>
-                <w:sz w:val="21"/>
-              </w:rPr>
-              <w:t>夜明：層間絶縁紙が材料ショート。今後の工程に影響する可能性あり</w:t>
-            </w:r>
-          </w:p>
-          <w:p>
-            <w:pPr>
-              <w:spacing w:after="40"/>
-            </w:pPr>
-            <w:r>
-              <w:rPr>
-                <w:rFonts w:ascii="メイリオ" w:hAnsi="メイリオ" w:eastAsia="メイリオ"/>
-                <w:b/>
-                <w:color w:val="7F6000"/>
-                <w:sz w:val="21"/>
-              </w:rPr>
-              <w:t>・</w:t>
-            </w:r>
-            <w:r>
-              <w:rPr>
-                <w:rFonts w:ascii="メイリオ" w:hAnsi="メイリオ" w:eastAsia="メイリオ"/>
-                <w:b w:val="0"/>
-                <w:color w:val="403000"/>
-                <w:sz w:val="21"/>
-              </w:rPr>
-              <w:t>白沢：鉄心端板が客先支給遅延中（素材完成は10月中旬予定）</w:t>
-            </w:r>
-          </w:p>
-          <w:p>
-            <w:pPr>
-              <w:spacing w:after="40"/>
-            </w:pPr>
-            <w:r>
-              <w:rPr>
-                <w:rFonts w:ascii="メイリオ" w:hAnsi="メイリオ" w:eastAsia="メイリオ"/>
-                <w:b/>
-                <w:color w:val="7F6000"/>
-                <w:sz w:val="21"/>
-              </w:rPr>
-              <w:t>・</w:t>
-            </w:r>
-            <w:r>
-              <w:rPr>
-                <w:rFonts w:ascii="メイリオ" w:hAnsi="メイリオ" w:eastAsia="メイリオ"/>
-                <w:b w:val="0"/>
-                <w:color w:val="403000"/>
-                <w:sz w:val="21"/>
-              </w:rPr>
-              <w:t>F1〜3 補極：コア板が入荷済みのはずだが現物が見当たらず、問い合わせ中</w:t>
-            </w:r>
-          </w:p>
-          <w:p>
-            <w:pPr>
-              <w:spacing w:after="40"/>
-            </w:pPr>
-            <w:r>
-              <w:rPr>
-                <w:rFonts w:ascii="メイリオ" w:hAnsi="メイリオ" w:eastAsia="メイリオ"/>
-                <w:b/>
-                <w:color w:val="7F6000"/>
-                <w:sz w:val="21"/>
-              </w:rPr>
-              <w:t>・</w:t>
-            </w:r>
-            <w:r>
-              <w:rPr>
-                <w:rFonts w:ascii="メイリオ" w:hAnsi="メイリオ" w:eastAsia="メイリオ"/>
-                <w:b w:val="0"/>
-                <w:color w:val="403000"/>
-                <w:sz w:val="21"/>
-              </w:rPr>
-              <w:t>板室組立／成瀬、志比内／白沢：それぞれ工程タイミングが重なり現場の負荷が高い見込み</w:t>
             </w:r>
           </w:p>
         </w:tc>
@@ -383,1699 +101,568 @@
     <w:p/>
     <w:p>
       <w:pPr>
-        <w:spacing w:after="80"/>
-      </w:pPr>
-      <w:r>
-        <w:rPr>
-          <w:rFonts w:ascii="メイリオ" w:hAnsi="メイリオ" w:eastAsia="メイリオ"/>
-          <w:b/>
-          <w:color w:val="FFFFFF"/>
-          <w:sz w:val="19"/>
-          <w:shd w:val="clear" w:color="auto" w:fill="8B0000"/>
-        </w:rPr>
-        <w:t xml:space="preserve">  要注意  </w:t>
-      </w:r>
-      <w:r>
-        <w:rPr>
-          <w:rFonts w:ascii="メイリオ" w:hAnsi="メイリオ" w:eastAsia="メイリオ"/>
-          <w:b w:val="0"/>
-          <w:color w:val="595959"/>
-          <w:sz w:val="19"/>
-        </w:rPr>
-        <w:t xml:space="preserve">　遅延・材料ショートなど対応が必要　　</w:t>
-      </w:r>
-      <w:r>
-        <w:rPr>
-          <w:rFonts w:ascii="メイリオ" w:hAnsi="メイリオ" w:eastAsia="メイリオ"/>
-          <w:b/>
-          <w:color w:val="FFFFFF"/>
-          <w:sz w:val="19"/>
-          <w:shd w:val="clear" w:color="auto" w:fill="C45A11"/>
-        </w:rPr>
-        <w:t xml:space="preserve">  経過観察  </w:t>
-      </w:r>
-      <w:r>
-        <w:rPr>
-          <w:rFonts w:ascii="メイリオ" w:hAnsi="メイリオ" w:eastAsia="メイリオ"/>
-          <w:b w:val="0"/>
-          <w:color w:val="595959"/>
-          <w:sz w:val="19"/>
-        </w:rPr>
-        <w:t xml:space="preserve">　負荷集中・支給待ちなど注視が必要　　</w:t>
-      </w:r>
-      <w:r>
-        <w:rPr>
-          <w:rFonts w:ascii="メイリオ" w:hAnsi="メイリオ" w:eastAsia="メイリオ"/>
-          <w:b/>
-          <w:color w:val="FFFFFF"/>
-          <w:sz w:val="19"/>
-          <w:shd w:val="clear" w:color="auto" w:fill="375623"/>
-        </w:rPr>
-        <w:t xml:space="preserve">  順調  </w:t>
-      </w:r>
-      <w:r>
-        <w:rPr>
-          <w:rFonts w:ascii="メイリオ" w:hAnsi="メイリオ" w:eastAsia="メイリオ"/>
-          <w:b w:val="0"/>
-          <w:color w:val="595959"/>
-          <w:sz w:val="19"/>
-        </w:rPr>
-        <w:t xml:space="preserve">　現状問題なし</w:t>
-      </w:r>
-    </w:p>
-    <w:p>
-      <w:pPr>
-        <w:spacing w:before="360" w:after="160"/>
-        <w:shd w:val="clear" w:color="auto" w:fill="1F4E78"/>
-        <w:ind w:left="40"/>
-      </w:pPr>
-      <w:r>
-        <w:rPr>
-          <w:rFonts w:ascii="メイリオ" w:hAnsi="メイリオ" w:eastAsia="メイリオ"/>
-          <w:b/>
-          <w:color w:val="FFFFFF"/>
-          <w:sz w:val="28"/>
-        </w:rPr>
-        <w:t xml:space="preserve">　1　層間絶縁紙について（材料調達状況）</w:t>
-      </w:r>
-    </w:p>
-    <w:p>
-      <w:pPr>
-        <w:spacing w:after="160" w:before="40"/>
-      </w:pPr>
-      <w:r>
-        <w:rPr>
-          <w:rFonts w:ascii="メイリオ" w:hAnsi="メイリオ" w:eastAsia="メイリオ"/>
-          <w:b w:val="0"/>
-          <w:color w:val="595959"/>
-          <w:sz w:val="19"/>
-        </w:rPr>
-        <w:t>太平商工と宮本さんで打ち合わせ済み。中東情勢の影響で材料調達のリードタイムが悪化（従来2〜3ヵ月 → 現在6ヵ月）。</w:t>
-      </w:r>
-    </w:p>
-    <w:tbl>
-      <w:tblPr>
-        <w:tblW w:type="auto" w:w="0"/>
-        <w:tblLook w:firstColumn="1" w:firstRow="1" w:lastColumn="0" w:lastRow="0" w:noHBand="0" w:noVBand="1" w:val="04A0"/>
-      </w:tblPr>
-      <w:tblGrid>
-        <w:gridCol w:w="1587"/>
-        <w:gridCol w:w="1417"/>
-        <w:gridCol w:w="3324"/>
-      </w:tblGrid>
-      <w:tr>
-        <w:tc>
-          <w:tcPr>
-            <w:tcW w:type="dxa" w:w="3324"/>
-            <w:vAlign w:val="center"/>
-            <w:shd w:val="clear" w:color="auto" w:fill="1F4E78"/>
-            <w:tcBorders>
-              <w:top w:val="single" w:sz="4" w:color="BFBFBF"/>
-              <w:bottom w:val="single" w:sz="4" w:color="BFBFBF"/>
-              <w:left w:val="single" w:sz="4" w:color="BFBFBF"/>
-              <w:right w:val="single" w:sz="4" w:color="BFBFBF"/>
-            </w:tcBorders>
-            <w:tcMar>
-              <w:top w:w="80" w:type="dxa"/>
-              <w:bottom w:w="80" w:type="dxa"/>
-              <w:start w:w="120" w:type="dxa"/>
-              <w:end w:w="120" w:type="dxa"/>
-            </w:tcMar>
-          </w:tcPr>
-          <w:p>
-            <w:pPr>
-              <w:spacing w:after="0"/>
-              <w:jc w:val="center"/>
-            </w:pPr>
-            <w:r/>
-            <w:r>
-              <w:rPr>
-                <w:rFonts w:ascii="メイリオ" w:hAnsi="メイリオ" w:eastAsia="メイリオ"/>
-                <w:b/>
-                <w:color w:val="FFFFFF"/>
-                <w:sz w:val="21"/>
-              </w:rPr>
-              <w:t>案件</w:t>
-            </w:r>
-          </w:p>
-        </w:tc>
-        <w:tc>
-          <w:tcPr>
-            <w:tcW w:type="dxa" w:w="3324"/>
-            <w:vAlign w:val="center"/>
-            <w:shd w:val="clear" w:color="auto" w:fill="1F4E78"/>
-            <w:tcBorders>
-              <w:top w:val="single" w:sz="4" w:color="BFBFBF"/>
-              <w:bottom w:val="single" w:sz="4" w:color="BFBFBF"/>
-              <w:left w:val="single" w:sz="4" w:color="BFBFBF"/>
-              <w:right w:val="single" w:sz="4" w:color="BFBFBF"/>
-            </w:tcBorders>
-            <w:tcMar>
-              <w:top w:w="80" w:type="dxa"/>
-              <w:bottom w:w="80" w:type="dxa"/>
-              <w:start w:w="120" w:type="dxa"/>
-              <w:end w:w="120" w:type="dxa"/>
-            </w:tcMar>
-          </w:tcPr>
-          <w:p>
-            <w:pPr>
-              <w:spacing w:after="0"/>
-              <w:jc w:val="center"/>
-            </w:pPr>
-            <w:r/>
-            <w:r>
-              <w:rPr>
-                <w:rFonts w:ascii="メイリオ" w:hAnsi="メイリオ" w:eastAsia="メイリオ"/>
-                <w:b/>
-                <w:color w:val="FFFFFF"/>
-                <w:sz w:val="21"/>
-              </w:rPr>
-              <w:t>ステータス</w:t>
-            </w:r>
-          </w:p>
-        </w:tc>
-        <w:tc>
-          <w:tcPr>
-            <w:tcW w:type="dxa" w:w="3324"/>
-            <w:vAlign w:val="center"/>
-            <w:shd w:val="clear" w:color="auto" w:fill="1F4E78"/>
-            <w:tcBorders>
-              <w:top w:val="single" w:sz="4" w:color="BFBFBF"/>
-              <w:bottom w:val="single" w:sz="4" w:color="BFBFBF"/>
-              <w:left w:val="single" w:sz="4" w:color="BFBFBF"/>
-              <w:right w:val="single" w:sz="4" w:color="BFBFBF"/>
-            </w:tcBorders>
-            <w:tcMar>
-              <w:top w:w="80" w:type="dxa"/>
-              <w:bottom w:w="80" w:type="dxa"/>
-              <w:start w:w="120" w:type="dxa"/>
-              <w:end w:w="120" w:type="dxa"/>
-            </w:tcMar>
-          </w:tcPr>
-          <w:p>
-            <w:pPr>
-              <w:spacing w:after="0"/>
-              <w:jc w:val="center"/>
-            </w:pPr>
-            <w:r/>
-            <w:r>
-              <w:rPr>
-                <w:rFonts w:ascii="メイリオ" w:hAnsi="メイリオ" w:eastAsia="メイリオ"/>
-                <w:b/>
-                <w:color w:val="FFFFFF"/>
-                <w:sz w:val="21"/>
-              </w:rPr>
-              <w:t>詳細</w:t>
-            </w:r>
-          </w:p>
-        </w:tc>
-      </w:tr>
-      <w:tr>
-        <w:tc>
-          <w:tcPr>
-            <w:tcW w:type="dxa" w:w="3324"/>
-            <w:vAlign w:val="center"/>
-            <w:tcBorders>
-              <w:top w:val="single" w:sz="4" w:color="BFBFBF"/>
-              <w:bottom w:val="single" w:sz="4" w:color="BFBFBF"/>
-              <w:left w:val="single" w:sz="4" w:color="BFBFBF"/>
-              <w:right w:val="single" w:sz="4" w:color="BFBFBF"/>
-            </w:tcBorders>
-            <w:tcMar>
-              <w:top w:w="80" w:type="dxa"/>
-              <w:bottom w:w="80" w:type="dxa"/>
-              <w:start w:w="120" w:type="dxa"/>
-              <w:end w:w="120" w:type="dxa"/>
-            </w:tcMar>
-          </w:tcPr>
-          <w:p>
-            <w:pPr>
-              <w:spacing w:after="0"/>
-            </w:pPr>
-            <w:r/>
-            <w:r>
-              <w:rPr>
-                <w:rFonts w:ascii="メイリオ" w:hAnsi="メイリオ" w:eastAsia="メイリオ"/>
-                <w:b/>
-                <w:sz w:val="21"/>
-              </w:rPr>
-              <w:t>夜明</w:t>
-            </w:r>
-          </w:p>
-        </w:tc>
-        <w:tc>
-          <w:tcPr>
-            <w:tcW w:type="dxa" w:w="3324"/>
-            <w:vAlign w:val="center"/>
-            <w:shd w:val="clear" w:color="auto" w:fill="8B0000"/>
-            <w:tcBorders>
-              <w:top w:val="single" w:sz="4" w:color="BFBFBF"/>
-              <w:bottom w:val="single" w:sz="4" w:color="BFBFBF"/>
-              <w:left w:val="single" w:sz="4" w:color="BFBFBF"/>
-              <w:right w:val="single" w:sz="4" w:color="BFBFBF"/>
-            </w:tcBorders>
-            <w:tcMar>
-              <w:top w:w="80" w:type="dxa"/>
-              <w:bottom w:w="80" w:type="dxa"/>
-              <w:start w:w="120" w:type="dxa"/>
-              <w:end w:w="120" w:type="dxa"/>
-            </w:tcMar>
-          </w:tcPr>
-          <w:p>
-            <w:pPr>
-              <w:spacing w:after="0"/>
-              <w:jc w:val="center"/>
-            </w:pPr>
-            <w:r/>
-            <w:r>
-              <w:rPr>
-                <w:rFonts w:ascii="メイリオ" w:hAnsi="メイリオ" w:eastAsia="メイリオ"/>
-                <w:b/>
-                <w:color w:val="FFFFFF"/>
-                <w:sz w:val="20"/>
-              </w:rPr>
-              <w:t>要注意</w:t>
-            </w:r>
-          </w:p>
-        </w:tc>
-        <w:tc>
-          <w:tcPr>
-            <w:tcW w:type="dxa" w:w="3324"/>
-            <w:vAlign w:val="center"/>
-            <w:tcBorders>
-              <w:top w:val="single" w:sz="4" w:color="BFBFBF"/>
-              <w:bottom w:val="single" w:sz="4" w:color="BFBFBF"/>
-              <w:left w:val="single" w:sz="4" w:color="BFBFBF"/>
-              <w:right w:val="single" w:sz="4" w:color="BFBFBF"/>
-            </w:tcBorders>
-            <w:tcMar>
-              <w:top w:w="80" w:type="dxa"/>
-              <w:bottom w:w="80" w:type="dxa"/>
-              <w:start w:w="120" w:type="dxa"/>
-              <w:end w:w="120" w:type="dxa"/>
-            </w:tcMar>
-          </w:tcPr>
-          <w:p>
-            <w:pPr>
-              <w:spacing w:after="40"/>
-            </w:pPr>
-            <w:r/>
-            <w:r>
-              <w:rPr>
-                <w:rFonts w:ascii="メイリオ" w:hAnsi="メイリオ" w:eastAsia="メイリオ"/>
-                <w:b w:val="0"/>
-                <w:sz w:val="20"/>
-              </w:rPr>
-              <w:t>ここで材料がショートする</w:t>
-            </w:r>
-          </w:p>
-        </w:tc>
-      </w:tr>
-      <w:tr>
-        <w:tc>
-          <w:tcPr>
-            <w:tcW w:type="dxa" w:w="3324"/>
-            <w:vAlign w:val="center"/>
-            <w:tcBorders>
-              <w:top w:val="single" w:sz="4" w:color="BFBFBF"/>
-              <w:bottom w:val="single" w:sz="4" w:color="BFBFBF"/>
-              <w:left w:val="single" w:sz="4" w:color="BFBFBF"/>
-              <w:right w:val="single" w:sz="4" w:color="BFBFBF"/>
-            </w:tcBorders>
-            <w:tcMar>
-              <w:top w:w="80" w:type="dxa"/>
-              <w:bottom w:w="80" w:type="dxa"/>
-              <w:start w:w="120" w:type="dxa"/>
-              <w:end w:w="120" w:type="dxa"/>
-            </w:tcMar>
-          </w:tcPr>
-          <w:p>
-            <w:pPr>
-              <w:spacing w:after="0"/>
-            </w:pPr>
-            <w:r/>
-            <w:r>
-              <w:rPr>
-                <w:rFonts w:ascii="メイリオ" w:hAnsi="メイリオ" w:eastAsia="メイリオ"/>
-                <w:b/>
-                <w:sz w:val="21"/>
-              </w:rPr>
-              <w:t>成瀬</w:t>
-            </w:r>
-          </w:p>
-        </w:tc>
-        <w:tc>
-          <w:tcPr>
-            <w:tcW w:type="dxa" w:w="3324"/>
-            <w:vAlign w:val="center"/>
-            <w:shd w:val="clear" w:color="auto" w:fill="C45A11"/>
-            <w:tcBorders>
-              <w:top w:val="single" w:sz="4" w:color="BFBFBF"/>
-              <w:bottom w:val="single" w:sz="4" w:color="BFBFBF"/>
-              <w:left w:val="single" w:sz="4" w:color="BFBFBF"/>
-              <w:right w:val="single" w:sz="4" w:color="BFBFBF"/>
-            </w:tcBorders>
-            <w:tcMar>
-              <w:top w:w="80" w:type="dxa"/>
-              <w:bottom w:w="80" w:type="dxa"/>
-              <w:start w:w="120" w:type="dxa"/>
-              <w:end w:w="120" w:type="dxa"/>
-            </w:tcMar>
-          </w:tcPr>
-          <w:p>
-            <w:pPr>
-              <w:spacing w:after="0"/>
-              <w:jc w:val="center"/>
-            </w:pPr>
-            <w:r/>
-            <w:r>
-              <w:rPr>
-                <w:rFonts w:ascii="メイリオ" w:hAnsi="メイリオ" w:eastAsia="メイリオ"/>
-                <w:b/>
-                <w:color w:val="FFFFFF"/>
-                <w:sz w:val="20"/>
-              </w:rPr>
-              <w:t>経過観察</w:t>
-            </w:r>
-          </w:p>
-        </w:tc>
-        <w:tc>
-          <w:tcPr>
-            <w:tcW w:type="dxa" w:w="3324"/>
-            <w:vAlign w:val="center"/>
-            <w:tcBorders>
-              <w:top w:val="single" w:sz="4" w:color="BFBFBF"/>
-              <w:bottom w:val="single" w:sz="4" w:color="BFBFBF"/>
-              <w:left w:val="single" w:sz="4" w:color="BFBFBF"/>
-              <w:right w:val="single" w:sz="4" w:color="BFBFBF"/>
-            </w:tcBorders>
-            <w:tcMar>
-              <w:top w:w="80" w:type="dxa"/>
-              <w:bottom w:w="80" w:type="dxa"/>
-              <w:start w:w="120" w:type="dxa"/>
-              <w:end w:w="120" w:type="dxa"/>
-            </w:tcMar>
-          </w:tcPr>
-          <w:p>
-            <w:pPr>
-              <w:spacing w:after="40"/>
-            </w:pPr>
-            <w:r/>
-            <w:r>
-              <w:rPr>
-                <w:rFonts w:ascii="メイリオ" w:hAnsi="メイリオ" w:eastAsia="メイリオ"/>
-                <w:b w:val="0"/>
-                <w:sz w:val="20"/>
-              </w:rPr>
-              <w:t>・新しい材料を手配中</w:t>
-            </w:r>
-          </w:p>
-          <w:p>
-            <w:pPr>
-              <w:spacing w:after="40"/>
-            </w:pPr>
-            <w:r>
-              <w:rPr>
-                <w:rFonts w:ascii="メイリオ" w:hAnsi="メイリオ" w:eastAsia="メイリオ"/>
-                <w:b w:val="0"/>
-                <w:sz w:val="20"/>
-              </w:rPr>
-              <w:t>・9/15に材料完成（そこから抜き加工に約2週間）</w:t>
-            </w:r>
-          </w:p>
-        </w:tc>
-      </w:tr>
-    </w:tbl>
-    <w:p>
-      <w:pPr>
-        <w:spacing w:after="160" w:before="40"/>
-      </w:pPr>
-      <w:r>
-        <w:rPr>
-          <w:rFonts w:ascii="メイリオ" w:hAnsi="メイリオ" w:eastAsia="メイリオ"/>
-          <w:b w:val="0"/>
-          <w:color w:val="595959"/>
-          <w:sz w:val="19"/>
-        </w:rPr>
-        <w:t>上記以外（シンフォ・黒川・白沢・志比内・飯豊川＃1＃2・岩本＃2＃1）は特記事項なし。</w:t>
-      </w:r>
-    </w:p>
-    <w:p>
-      <w:pPr>
-        <w:spacing w:before="360" w:after="160"/>
-        <w:shd w:val="clear" w:color="auto" w:fill="1F4E78"/>
-        <w:ind w:left="40"/>
-      </w:pPr>
-      <w:r>
-        <w:rPr>
-          <w:rFonts w:ascii="メイリオ" w:hAnsi="メイリオ" w:eastAsia="メイリオ"/>
-          <w:b/>
-          <w:color w:val="FFFFFF"/>
-          <w:sz w:val="28"/>
-        </w:rPr>
-        <w:t xml:space="preserve">　2　鉄心工場での工程（宮本　報告）</w:t>
-      </w:r>
-    </w:p>
-    <w:tbl>
-      <w:tblPr>
-        <w:tblW w:type="auto" w:w="0"/>
-        <w:tblLook w:firstColumn="1" w:firstRow="1" w:lastColumn="0" w:lastRow="0" w:noHBand="0" w:noVBand="1" w:val="04A0"/>
-      </w:tblPr>
-      <w:tblGrid>
-        <w:gridCol w:w="1984"/>
-        <w:gridCol w:w="4986"/>
-      </w:tblGrid>
-      <w:tr>
-        <w:tc>
-          <w:tcPr>
-            <w:tcW w:type="dxa" w:w="4986"/>
-            <w:vAlign w:val="center"/>
-            <w:shd w:val="clear" w:color="auto" w:fill="1F4E78"/>
-            <w:tcBorders>
-              <w:top w:val="single" w:sz="4" w:color="BFBFBF"/>
-              <w:bottom w:val="single" w:sz="4" w:color="BFBFBF"/>
-              <w:left w:val="single" w:sz="4" w:color="BFBFBF"/>
-              <w:right w:val="single" w:sz="4" w:color="BFBFBF"/>
-            </w:tcBorders>
-            <w:tcMar>
-              <w:top w:w="80" w:type="dxa"/>
-              <w:bottom w:w="80" w:type="dxa"/>
-              <w:start w:w="120" w:type="dxa"/>
-              <w:end w:w="120" w:type="dxa"/>
-            </w:tcMar>
-          </w:tcPr>
-          <w:p>
-            <w:pPr>
-              <w:spacing w:after="0"/>
-              <w:jc w:val="center"/>
-            </w:pPr>
-            <w:r/>
-            <w:r>
-              <w:rPr>
-                <w:rFonts w:ascii="メイリオ" w:hAnsi="メイリオ" w:eastAsia="メイリオ"/>
-                <w:b/>
-                <w:color w:val="FFFFFF"/>
-                <w:sz w:val="21"/>
-              </w:rPr>
-              <w:t>案件</w:t>
-            </w:r>
-          </w:p>
-        </w:tc>
-        <w:tc>
-          <w:tcPr>
-            <w:tcW w:type="dxa" w:w="4986"/>
-            <w:vAlign w:val="center"/>
-            <w:shd w:val="clear" w:color="auto" w:fill="1F4E78"/>
-            <w:tcBorders>
-              <w:top w:val="single" w:sz="4" w:color="BFBFBF"/>
-              <w:bottom w:val="single" w:sz="4" w:color="BFBFBF"/>
-              <w:left w:val="single" w:sz="4" w:color="BFBFBF"/>
-              <w:right w:val="single" w:sz="4" w:color="BFBFBF"/>
-            </w:tcBorders>
-            <w:tcMar>
-              <w:top w:w="80" w:type="dxa"/>
-              <w:bottom w:w="80" w:type="dxa"/>
-              <w:start w:w="120" w:type="dxa"/>
-              <w:end w:w="120" w:type="dxa"/>
-            </w:tcMar>
-          </w:tcPr>
-          <w:p>
-            <w:pPr>
-              <w:spacing w:after="0"/>
-              <w:jc w:val="center"/>
-            </w:pPr>
-            <w:r/>
-            <w:r>
-              <w:rPr>
-                <w:rFonts w:ascii="メイリオ" w:hAnsi="メイリオ" w:eastAsia="メイリオ"/>
-                <w:b/>
-                <w:color w:val="FFFFFF"/>
-                <w:sz w:val="21"/>
-              </w:rPr>
-              <w:t>状況</w:t>
-            </w:r>
-          </w:p>
-        </w:tc>
-      </w:tr>
-      <w:tr>
-        <w:tc>
-          <w:tcPr>
-            <w:tcW w:type="dxa" w:w="4986"/>
-            <w:vAlign w:val="center"/>
-            <w:shd w:val="clear" w:color="auto" w:fill="EDF2FA"/>
-            <w:tcBorders>
-              <w:top w:val="single" w:sz="4" w:color="BFBFBF"/>
-              <w:bottom w:val="single" w:sz="4" w:color="BFBFBF"/>
-              <w:left w:val="single" w:sz="4" w:color="BFBFBF"/>
-              <w:right w:val="single" w:sz="4" w:color="BFBFBF"/>
-            </w:tcBorders>
-            <w:tcMar>
-              <w:top w:w="80" w:type="dxa"/>
-              <w:bottom w:w="80" w:type="dxa"/>
-              <w:start w:w="120" w:type="dxa"/>
-              <w:end w:w="120" w:type="dxa"/>
-            </w:tcMar>
-          </w:tcPr>
-          <w:p>
-            <w:pPr>
-              <w:spacing w:after="0"/>
-            </w:pPr>
-            <w:r/>
-            <w:r>
-              <w:rPr>
-                <w:rFonts w:ascii="メイリオ" w:hAnsi="メイリオ" w:eastAsia="メイリオ"/>
-                <w:b/>
-                <w:sz w:val="21"/>
-              </w:rPr>
-              <w:t>平巻き用ポールピース</w:t>
-            </w:r>
-          </w:p>
-        </w:tc>
-        <w:tc>
-          <w:tcPr>
-            <w:tcW w:type="dxa" w:w="4986"/>
-            <w:vAlign w:val="center"/>
-            <w:tcBorders>
-              <w:top w:val="single" w:sz="4" w:color="BFBFBF"/>
-              <w:bottom w:val="single" w:sz="4" w:color="BFBFBF"/>
-              <w:left w:val="single" w:sz="4" w:color="BFBFBF"/>
-              <w:right w:val="single" w:sz="4" w:color="BFBFBF"/>
-            </w:tcBorders>
-            <w:tcMar>
-              <w:top w:w="80" w:type="dxa"/>
-              <w:bottom w:w="80" w:type="dxa"/>
-              <w:start w:w="120" w:type="dxa"/>
-              <w:end w:w="120" w:type="dxa"/>
-            </w:tcMar>
-          </w:tcPr>
-          <w:p>
-            <w:pPr>
-              <w:spacing w:after="40"/>
-            </w:pPr>
-            <w:r/>
-            <w:r>
-              <w:rPr>
-                <w:rFonts w:ascii="メイリオ" w:hAnsi="メイリオ" w:eastAsia="メイリオ"/>
-                <w:b w:val="0"/>
-                <w:sz w:val="20"/>
-              </w:rPr>
-              <w:t>早くやりたい</w:t>
-            </w:r>
-          </w:p>
-        </w:tc>
-      </w:tr>
-      <w:tr>
-        <w:tc>
-          <w:tcPr>
-            <w:tcW w:type="dxa" w:w="4986"/>
-            <w:vAlign w:val="center"/>
-            <w:shd w:val="clear" w:color="auto" w:fill="EDF2FA"/>
-            <w:tcBorders>
-              <w:top w:val="single" w:sz="4" w:color="BFBFBF"/>
-              <w:bottom w:val="single" w:sz="4" w:color="BFBFBF"/>
-              <w:left w:val="single" w:sz="4" w:color="BFBFBF"/>
-              <w:right w:val="single" w:sz="4" w:color="BFBFBF"/>
-            </w:tcBorders>
-            <w:tcMar>
-              <w:top w:w="80" w:type="dxa"/>
-              <w:bottom w:w="80" w:type="dxa"/>
-              <w:start w:w="120" w:type="dxa"/>
-              <w:end w:w="120" w:type="dxa"/>
-            </w:tcMar>
-          </w:tcPr>
-          <w:p>
-            <w:pPr>
-              <w:spacing w:after="0"/>
-            </w:pPr>
-            <w:r/>
-            <w:r>
-              <w:rPr>
-                <w:rFonts w:ascii="メイリオ" w:hAnsi="メイリオ" w:eastAsia="メイリオ"/>
-                <w:b/>
-                <w:sz w:val="21"/>
-              </w:rPr>
-              <w:t>夜明</w:t>
-            </w:r>
-          </w:p>
-        </w:tc>
-        <w:tc>
-          <w:tcPr>
-            <w:tcW w:type="dxa" w:w="4986"/>
-            <w:vAlign w:val="center"/>
-            <w:tcBorders>
-              <w:top w:val="single" w:sz="4" w:color="BFBFBF"/>
-              <w:bottom w:val="single" w:sz="4" w:color="BFBFBF"/>
-              <w:left w:val="single" w:sz="4" w:color="BFBFBF"/>
-              <w:right w:val="single" w:sz="4" w:color="BFBFBF"/>
-            </w:tcBorders>
-            <w:tcMar>
-              <w:top w:w="80" w:type="dxa"/>
-              <w:bottom w:w="80" w:type="dxa"/>
-              <w:start w:w="120" w:type="dxa"/>
-              <w:end w:w="120" w:type="dxa"/>
-            </w:tcMar>
-          </w:tcPr>
-          <w:p>
-            <w:pPr>
-              <w:spacing w:after="40"/>
-            </w:pPr>
-            <w:r/>
-            <w:r>
-              <w:rPr>
-                <w:rFonts w:ascii="メイリオ" w:hAnsi="メイリオ" w:eastAsia="メイリオ"/>
-                <w:b w:val="0"/>
-                <w:sz w:val="20"/>
-              </w:rPr>
-              <w:t>・端板の加工は分納でPT検査（客先納品予定）</w:t>
-            </w:r>
-          </w:p>
-          <w:p>
-            <w:pPr>
-              <w:spacing w:after="40"/>
-            </w:pPr>
-            <w:r>
-              <w:rPr>
-                <w:rFonts w:ascii="メイリオ" w:hAnsi="メイリオ" w:eastAsia="メイリオ"/>
-                <w:b w:val="0"/>
-                <w:sz w:val="20"/>
-              </w:rPr>
-              <w:t>・7/1より加工スタート予定、8/31完了予定（40日程）</w:t>
-            </w:r>
-          </w:p>
-          <w:p>
-            <w:pPr>
-              <w:spacing w:after="40"/>
-            </w:pPr>
-            <w:r>
-              <w:rPr>
-                <w:rFonts w:ascii="メイリオ" w:hAnsi="メイリオ" w:eastAsia="メイリオ"/>
-                <w:b w:val="0"/>
-                <w:sz w:val="20"/>
-              </w:rPr>
-              <w:t>・コイルに渡せるのはお盆前位</w:t>
-            </w:r>
-          </w:p>
-        </w:tc>
-      </w:tr>
-      <w:tr>
-        <w:tc>
-          <w:tcPr>
-            <w:tcW w:type="dxa" w:w="4986"/>
-            <w:vAlign w:val="center"/>
-            <w:shd w:val="clear" w:color="auto" w:fill="EDF2FA"/>
-            <w:tcBorders>
-              <w:top w:val="single" w:sz="4" w:color="BFBFBF"/>
-              <w:bottom w:val="single" w:sz="4" w:color="BFBFBF"/>
-              <w:left w:val="single" w:sz="4" w:color="BFBFBF"/>
-              <w:right w:val="single" w:sz="4" w:color="BFBFBF"/>
-            </w:tcBorders>
-            <w:tcMar>
-              <w:top w:w="80" w:type="dxa"/>
-              <w:bottom w:w="80" w:type="dxa"/>
-              <w:start w:w="120" w:type="dxa"/>
-              <w:end w:w="120" w:type="dxa"/>
-            </w:tcMar>
-          </w:tcPr>
-          <w:p>
-            <w:pPr>
-              <w:spacing w:after="0"/>
-            </w:pPr>
-            <w:r/>
-            <w:r>
-              <w:rPr>
-                <w:rFonts w:ascii="メイリオ" w:hAnsi="メイリオ" w:eastAsia="メイリオ"/>
-                <w:b/>
-                <w:sz w:val="21"/>
-              </w:rPr>
-              <w:t>黒川</w:t>
-            </w:r>
-          </w:p>
-        </w:tc>
-        <w:tc>
-          <w:tcPr>
-            <w:tcW w:type="dxa" w:w="4986"/>
-            <w:vAlign w:val="center"/>
-            <w:tcBorders>
-              <w:top w:val="single" w:sz="4" w:color="BFBFBF"/>
-              <w:bottom w:val="single" w:sz="4" w:color="BFBFBF"/>
-              <w:left w:val="single" w:sz="4" w:color="BFBFBF"/>
-              <w:right w:val="single" w:sz="4" w:color="BFBFBF"/>
-            </w:tcBorders>
-            <w:tcMar>
-              <w:top w:w="80" w:type="dxa"/>
-              <w:bottom w:w="80" w:type="dxa"/>
-              <w:start w:w="120" w:type="dxa"/>
-              <w:end w:w="120" w:type="dxa"/>
-            </w:tcMar>
-          </w:tcPr>
-          <w:p>
-            <w:pPr>
-              <w:spacing w:after="40"/>
-            </w:pPr>
-            <w:r/>
-            <w:r>
-              <w:rPr>
-                <w:rFonts w:ascii="メイリオ" w:hAnsi="メイリオ" w:eastAsia="メイリオ"/>
-                <w:b w:val="0"/>
-                <w:sz w:val="20"/>
-              </w:rPr>
-              <w:t>端板の再支給待ち</w:t>
-            </w:r>
-          </w:p>
-        </w:tc>
-      </w:tr>
-      <w:tr>
-        <w:tc>
-          <w:tcPr>
-            <w:tcW w:type="dxa" w:w="4986"/>
-            <w:vAlign w:val="center"/>
-            <w:shd w:val="clear" w:color="auto" w:fill="EDF2FA"/>
-            <w:tcBorders>
-              <w:top w:val="single" w:sz="4" w:color="BFBFBF"/>
-              <w:bottom w:val="single" w:sz="4" w:color="BFBFBF"/>
-              <w:left w:val="single" w:sz="4" w:color="BFBFBF"/>
-              <w:right w:val="single" w:sz="4" w:color="BFBFBF"/>
-            </w:tcBorders>
-            <w:tcMar>
-              <w:top w:w="80" w:type="dxa"/>
-              <w:bottom w:w="80" w:type="dxa"/>
-              <w:start w:w="120" w:type="dxa"/>
-              <w:end w:w="120" w:type="dxa"/>
-            </w:tcMar>
-          </w:tcPr>
-          <w:p>
-            <w:pPr>
-              <w:spacing w:after="0"/>
-            </w:pPr>
-            <w:r/>
-            <w:r>
-              <w:rPr>
-                <w:rFonts w:ascii="メイリオ" w:hAnsi="メイリオ" w:eastAsia="メイリオ"/>
-                <w:b/>
-                <w:sz w:val="21"/>
-              </w:rPr>
-              <w:t>成瀬</w:t>
-            </w:r>
-          </w:p>
-        </w:tc>
-        <w:tc>
-          <w:tcPr>
-            <w:tcW w:type="dxa" w:w="4986"/>
-            <w:vAlign w:val="center"/>
-            <w:tcBorders>
-              <w:top w:val="single" w:sz="4" w:color="BFBFBF"/>
-              <w:bottom w:val="single" w:sz="4" w:color="BFBFBF"/>
-              <w:left w:val="single" w:sz="4" w:color="BFBFBF"/>
-              <w:right w:val="single" w:sz="4" w:color="BFBFBF"/>
-            </w:tcBorders>
-            <w:tcMar>
-              <w:top w:w="80" w:type="dxa"/>
-              <w:bottom w:w="80" w:type="dxa"/>
-              <w:start w:w="120" w:type="dxa"/>
-              <w:end w:w="120" w:type="dxa"/>
-            </w:tcMar>
-          </w:tcPr>
-          <w:p>
-            <w:pPr>
-              <w:spacing w:after="40"/>
-            </w:pPr>
-            <w:r/>
-            <w:r>
-              <w:rPr>
-                <w:rFonts w:ascii="メイリオ" w:hAnsi="メイリオ" w:eastAsia="メイリオ"/>
-                <w:b w:val="0"/>
-                <w:sz w:val="20"/>
-              </w:rPr>
-              <w:t>両ねじボルト待ち</w:t>
-            </w:r>
-          </w:p>
-        </w:tc>
-      </w:tr>
-      <w:tr>
-        <w:tc>
-          <w:tcPr>
-            <w:tcW w:type="dxa" w:w="4986"/>
-            <w:vAlign w:val="center"/>
-            <w:shd w:val="clear" w:color="auto" w:fill="EDF2FA"/>
-            <w:tcBorders>
-              <w:top w:val="single" w:sz="4" w:color="BFBFBF"/>
-              <w:bottom w:val="single" w:sz="4" w:color="BFBFBF"/>
-              <w:left w:val="single" w:sz="4" w:color="BFBFBF"/>
-              <w:right w:val="single" w:sz="4" w:color="BFBFBF"/>
-            </w:tcBorders>
-            <w:tcMar>
-              <w:top w:w="80" w:type="dxa"/>
-              <w:bottom w:w="80" w:type="dxa"/>
-              <w:start w:w="120" w:type="dxa"/>
-              <w:end w:w="120" w:type="dxa"/>
-            </w:tcMar>
-          </w:tcPr>
-          <w:p>
-            <w:pPr>
-              <w:spacing w:after="0"/>
-            </w:pPr>
-            <w:r/>
-            <w:r>
-              <w:rPr>
-                <w:rFonts w:ascii="メイリオ" w:hAnsi="メイリオ" w:eastAsia="メイリオ"/>
-                <w:b/>
-                <w:sz w:val="21"/>
-              </w:rPr>
-              <w:t>岩本＃1・志比内</w:t>
-            </w:r>
-          </w:p>
-        </w:tc>
-        <w:tc>
-          <w:tcPr>
-            <w:tcW w:type="dxa" w:w="4986"/>
-            <w:vAlign w:val="center"/>
-            <w:tcBorders>
-              <w:top w:val="single" w:sz="4" w:color="BFBFBF"/>
-              <w:bottom w:val="single" w:sz="4" w:color="BFBFBF"/>
-              <w:left w:val="single" w:sz="4" w:color="BFBFBF"/>
-              <w:right w:val="single" w:sz="4" w:color="BFBFBF"/>
-            </w:tcBorders>
-            <w:tcMar>
-              <w:top w:w="80" w:type="dxa"/>
-              <w:bottom w:w="80" w:type="dxa"/>
-              <w:start w:w="120" w:type="dxa"/>
-              <w:end w:w="120" w:type="dxa"/>
-            </w:tcMar>
-          </w:tcPr>
-          <w:p>
-            <w:pPr>
-              <w:spacing w:after="40"/>
-            </w:pPr>
-            <w:r/>
-            <w:r>
-              <w:rPr>
-                <w:rFonts w:ascii="メイリオ" w:hAnsi="メイリオ" w:eastAsia="メイリオ"/>
-                <w:b w:val="0"/>
-                <w:sz w:val="20"/>
-              </w:rPr>
-              <w:t>11月頃に進めたい</w:t>
-            </w:r>
-          </w:p>
-        </w:tc>
-      </w:tr>
-      <w:tr>
-        <w:tc>
-          <w:tcPr>
-            <w:tcW w:type="dxa" w:w="4986"/>
-            <w:vAlign w:val="center"/>
-            <w:tcBorders>
-              <w:top w:val="single" w:sz="4" w:color="BFBFBF"/>
-              <w:bottom w:val="single" w:sz="4" w:color="BFBFBF"/>
-              <w:left w:val="single" w:sz="4" w:color="BFBFBF"/>
-              <w:right w:val="single" w:sz="4" w:color="BFBFBF"/>
-            </w:tcBorders>
-            <w:tcMar>
-              <w:top w:w="80" w:type="dxa"/>
-              <w:bottom w:w="80" w:type="dxa"/>
-              <w:start w:w="120" w:type="dxa"/>
-              <w:end w:w="120" w:type="dxa"/>
-            </w:tcMar>
-          </w:tcPr>
-          <w:p>
-            <w:pPr>
-              <w:spacing w:after="0"/>
-            </w:pPr>
-            <w:r/>
-            <w:r>
-              <w:rPr>
-                <w:rFonts w:ascii="メイリオ" w:hAnsi="メイリオ" w:eastAsia="メイリオ"/>
-                <w:b/>
-                <w:sz w:val="21"/>
-              </w:rPr>
-              <w:t>白沢</w:t>
-            </w:r>
-          </w:p>
-        </w:tc>
-        <w:tc>
-          <w:tcPr>
-            <w:tcW w:type="dxa" w:w="4986"/>
-            <w:vAlign w:val="center"/>
-            <w:shd w:val="clear" w:color="auto" w:fill="8B0000"/>
-            <w:tcBorders>
-              <w:top w:val="single" w:sz="4" w:color="BFBFBF"/>
-              <w:bottom w:val="single" w:sz="4" w:color="BFBFBF"/>
-              <w:left w:val="single" w:sz="4" w:color="BFBFBF"/>
-              <w:right w:val="single" w:sz="4" w:color="BFBFBF"/>
-            </w:tcBorders>
-            <w:tcMar>
-              <w:top w:w="80" w:type="dxa"/>
-              <w:bottom w:w="80" w:type="dxa"/>
-              <w:start w:w="120" w:type="dxa"/>
-              <w:end w:w="120" w:type="dxa"/>
-            </w:tcMar>
-          </w:tcPr>
-          <w:p>
-            <w:pPr>
-              <w:spacing w:after="40"/>
-            </w:pPr>
-            <w:r/>
-            <w:r>
-              <w:rPr>
-                <w:rFonts w:ascii="メイリオ" w:hAnsi="メイリオ" w:eastAsia="メイリオ"/>
-                <w:b w:val="0"/>
-                <w:color w:val="FFFFFF"/>
-                <w:sz w:val="20"/>
-              </w:rPr>
-              <w:t>端板素材の客先支給遅延（素材完成は10月中旬ごろ）</w:t>
-            </w:r>
-          </w:p>
-        </w:tc>
-      </w:tr>
-    </w:tbl>
-    <w:p>
-      <w:pPr>
-        <w:spacing w:after="160" w:before="40"/>
-      </w:pPr>
-      <w:r>
-        <w:rPr>
-          <w:rFonts w:ascii="メイリオ" w:hAnsi="メイリオ" w:eastAsia="メイリオ"/>
-          <w:b w:val="0"/>
-          <w:color w:val="595959"/>
-          <w:sz w:val="19"/>
-        </w:rPr>
-        <w:t>岩本＃2は特記事項なし。</w:t>
-      </w:r>
-    </w:p>
-    <w:p>
-      <w:pPr>
-        <w:spacing w:before="360" w:after="160"/>
-        <w:shd w:val="clear" w:color="auto" w:fill="1F4E78"/>
-        <w:ind w:left="40"/>
-      </w:pPr>
-      <w:r>
-        <w:rPr>
-          <w:rFonts w:ascii="メイリオ" w:hAnsi="メイリオ" w:eastAsia="メイリオ"/>
-          <w:b/>
-          <w:color w:val="FFFFFF"/>
-          <w:sz w:val="28"/>
-        </w:rPr>
-        <w:t xml:space="preserve">　3　コイル工場での工程（西村　報告）</w:t>
-      </w:r>
-    </w:p>
-    <w:tbl>
-      <w:tblPr>
-        <w:tblW w:type="auto" w:w="0"/>
-        <w:tblLook w:firstColumn="1" w:firstRow="1" w:lastColumn="0" w:lastRow="0" w:noHBand="0" w:noVBand="1" w:val="04A0"/>
-      </w:tblPr>
-      <w:tblGrid>
-        <w:gridCol w:w="1984"/>
-        <w:gridCol w:w="4986"/>
-      </w:tblGrid>
-      <w:tr>
-        <w:tc>
-          <w:tcPr>
-            <w:tcW w:type="dxa" w:w="4986"/>
-            <w:vAlign w:val="center"/>
-            <w:shd w:val="clear" w:color="auto" w:fill="1F4E78"/>
-            <w:tcBorders>
-              <w:top w:val="single" w:sz="4" w:color="BFBFBF"/>
-              <w:bottom w:val="single" w:sz="4" w:color="BFBFBF"/>
-              <w:left w:val="single" w:sz="4" w:color="BFBFBF"/>
-              <w:right w:val="single" w:sz="4" w:color="BFBFBF"/>
-            </w:tcBorders>
-            <w:tcMar>
-              <w:top w:w="80" w:type="dxa"/>
-              <w:bottom w:w="80" w:type="dxa"/>
-              <w:start w:w="120" w:type="dxa"/>
-              <w:end w:w="120" w:type="dxa"/>
-            </w:tcMar>
-          </w:tcPr>
-          <w:p>
-            <w:pPr>
-              <w:spacing w:after="0"/>
-              <w:jc w:val="center"/>
-            </w:pPr>
-            <w:r/>
-            <w:r>
-              <w:rPr>
-                <w:rFonts w:ascii="メイリオ" w:hAnsi="メイリオ" w:eastAsia="メイリオ"/>
-                <w:b/>
-                <w:color w:val="FFFFFF"/>
-                <w:sz w:val="21"/>
-              </w:rPr>
-              <w:t>案件</w:t>
-            </w:r>
-          </w:p>
-        </w:tc>
-        <w:tc>
-          <w:tcPr>
-            <w:tcW w:type="dxa" w:w="4986"/>
-            <w:vAlign w:val="center"/>
-            <w:shd w:val="clear" w:color="auto" w:fill="1F4E78"/>
-            <w:tcBorders>
-              <w:top w:val="single" w:sz="4" w:color="BFBFBF"/>
-              <w:bottom w:val="single" w:sz="4" w:color="BFBFBF"/>
-              <w:left w:val="single" w:sz="4" w:color="BFBFBF"/>
-              <w:right w:val="single" w:sz="4" w:color="BFBFBF"/>
-            </w:tcBorders>
-            <w:tcMar>
-              <w:top w:w="80" w:type="dxa"/>
-              <w:bottom w:w="80" w:type="dxa"/>
-              <w:start w:w="120" w:type="dxa"/>
-              <w:end w:w="120" w:type="dxa"/>
-            </w:tcMar>
-          </w:tcPr>
-          <w:p>
-            <w:pPr>
-              <w:spacing w:after="0"/>
-              <w:jc w:val="center"/>
-            </w:pPr>
-            <w:r/>
-            <w:r>
-              <w:rPr>
-                <w:rFonts w:ascii="メイリオ" w:hAnsi="メイリオ" w:eastAsia="メイリオ"/>
-                <w:b/>
-                <w:color w:val="FFFFFF"/>
-                <w:sz w:val="21"/>
-              </w:rPr>
-              <w:t>状況</w:t>
-            </w:r>
-          </w:p>
-        </w:tc>
-      </w:tr>
-      <w:tr>
-        <w:tc>
-          <w:tcPr>
-            <w:tcW w:type="dxa" w:w="4986"/>
-            <w:vAlign w:val="center"/>
-            <w:shd w:val="clear" w:color="auto" w:fill="EDF2FA"/>
-            <w:tcBorders>
-              <w:top w:val="single" w:sz="4" w:color="BFBFBF"/>
-              <w:bottom w:val="single" w:sz="4" w:color="BFBFBF"/>
-              <w:left w:val="single" w:sz="4" w:color="BFBFBF"/>
-              <w:right w:val="single" w:sz="4" w:color="BFBFBF"/>
-            </w:tcBorders>
-            <w:tcMar>
-              <w:top w:w="80" w:type="dxa"/>
-              <w:bottom w:w="80" w:type="dxa"/>
-              <w:start w:w="120" w:type="dxa"/>
-              <w:end w:w="120" w:type="dxa"/>
-            </w:tcMar>
-          </w:tcPr>
-          <w:p>
-            <w:pPr>
-              <w:spacing w:after="0"/>
-            </w:pPr>
-            <w:r/>
-            <w:r>
-              <w:rPr>
-                <w:rFonts w:ascii="メイリオ" w:hAnsi="メイリオ" w:eastAsia="メイリオ"/>
-                <w:b/>
-                <w:sz w:val="21"/>
-              </w:rPr>
-              <w:t>明電舎・板室コイル</w:t>
-            </w:r>
-          </w:p>
-        </w:tc>
-        <w:tc>
-          <w:tcPr>
-            <w:tcW w:type="dxa" w:w="4986"/>
-            <w:vAlign w:val="center"/>
-            <w:tcBorders>
-              <w:top w:val="single" w:sz="4" w:color="BFBFBF"/>
-              <w:bottom w:val="single" w:sz="4" w:color="BFBFBF"/>
-              <w:left w:val="single" w:sz="4" w:color="BFBFBF"/>
-              <w:right w:val="single" w:sz="4" w:color="BFBFBF"/>
-            </w:tcBorders>
-            <w:tcMar>
-              <w:top w:w="80" w:type="dxa"/>
-              <w:bottom w:w="80" w:type="dxa"/>
-              <w:start w:w="120" w:type="dxa"/>
-              <w:end w:w="120" w:type="dxa"/>
-            </w:tcMar>
-          </w:tcPr>
-          <w:p>
-            <w:pPr>
-              <w:spacing w:after="40"/>
-            </w:pPr>
-            <w:r/>
-            <w:r>
-              <w:rPr>
-                <w:rFonts w:ascii="メイリオ" w:hAnsi="メイリオ" w:eastAsia="メイリオ"/>
-                <w:b w:val="0"/>
-                <w:sz w:val="20"/>
-              </w:rPr>
-              <w:t>進んでる</w:t>
-            </w:r>
-          </w:p>
-        </w:tc>
-      </w:tr>
-      <w:tr>
-        <w:tc>
-          <w:tcPr>
-            <w:tcW w:type="dxa" w:w="4986"/>
-            <w:vAlign w:val="center"/>
-            <w:shd w:val="clear" w:color="auto" w:fill="EDF2FA"/>
-            <w:tcBorders>
-              <w:top w:val="single" w:sz="4" w:color="BFBFBF"/>
-              <w:bottom w:val="single" w:sz="4" w:color="BFBFBF"/>
-              <w:left w:val="single" w:sz="4" w:color="BFBFBF"/>
-              <w:right w:val="single" w:sz="4" w:color="BFBFBF"/>
-            </w:tcBorders>
-            <w:tcMar>
-              <w:top w:w="80" w:type="dxa"/>
-              <w:bottom w:w="80" w:type="dxa"/>
-              <w:start w:w="120" w:type="dxa"/>
-              <w:end w:w="120" w:type="dxa"/>
-            </w:tcMar>
-          </w:tcPr>
-          <w:p>
-            <w:pPr>
-              <w:spacing w:after="0"/>
-            </w:pPr>
-            <w:r/>
-            <w:r>
-              <w:rPr>
-                <w:rFonts w:ascii="メイリオ" w:hAnsi="メイリオ" w:eastAsia="メイリオ"/>
-                <w:b/>
-                <w:sz w:val="21"/>
-              </w:rPr>
-              <w:t>神鋼加古川</w:t>
-            </w:r>
-          </w:p>
-        </w:tc>
-        <w:tc>
-          <w:tcPr>
-            <w:tcW w:type="dxa" w:w="4986"/>
-            <w:vAlign w:val="center"/>
-            <w:tcBorders>
-              <w:top w:val="single" w:sz="4" w:color="BFBFBF"/>
-              <w:bottom w:val="single" w:sz="4" w:color="BFBFBF"/>
-              <w:left w:val="single" w:sz="4" w:color="BFBFBF"/>
-              <w:right w:val="single" w:sz="4" w:color="BFBFBF"/>
-            </w:tcBorders>
-            <w:tcMar>
-              <w:top w:w="80" w:type="dxa"/>
-              <w:bottom w:w="80" w:type="dxa"/>
-              <w:start w:w="120" w:type="dxa"/>
-              <w:end w:w="120" w:type="dxa"/>
-            </w:tcMar>
-          </w:tcPr>
-          <w:p>
-            <w:pPr>
-              <w:spacing w:after="40"/>
-            </w:pPr>
-            <w:r/>
-            <w:r>
-              <w:rPr>
-                <w:rFonts w:ascii="メイリオ" w:hAnsi="メイリオ" w:eastAsia="メイリオ"/>
-                <w:b w:val="0"/>
-                <w:sz w:val="20"/>
-              </w:rPr>
-              <w:t>巻いてもらっている</w:t>
-            </w:r>
-          </w:p>
-        </w:tc>
-      </w:tr>
-      <w:tr>
-        <w:tc>
-          <w:tcPr>
-            <w:tcW w:type="dxa" w:w="4986"/>
-            <w:vAlign w:val="center"/>
-            <w:shd w:val="clear" w:color="auto" w:fill="EDF2FA"/>
-            <w:tcBorders>
-              <w:top w:val="single" w:sz="4" w:color="BFBFBF"/>
-              <w:bottom w:val="single" w:sz="4" w:color="BFBFBF"/>
-              <w:left w:val="single" w:sz="4" w:color="BFBFBF"/>
-              <w:right w:val="single" w:sz="4" w:color="BFBFBF"/>
-            </w:tcBorders>
-            <w:tcMar>
-              <w:top w:w="80" w:type="dxa"/>
-              <w:bottom w:w="80" w:type="dxa"/>
-              <w:start w:w="120" w:type="dxa"/>
-              <w:end w:w="120" w:type="dxa"/>
-            </w:tcMar>
-          </w:tcPr>
-          <w:p>
-            <w:pPr>
-              <w:spacing w:after="0"/>
-            </w:pPr>
-            <w:r/>
-            <w:r>
-              <w:rPr>
-                <w:rFonts w:ascii="メイリオ" w:hAnsi="メイリオ" w:eastAsia="メイリオ"/>
-                <w:b/>
-                <w:sz w:val="21"/>
-              </w:rPr>
-              <w:t>シンフォニア</w:t>
-            </w:r>
-          </w:p>
-        </w:tc>
-        <w:tc>
-          <w:tcPr>
-            <w:tcW w:type="dxa" w:w="4986"/>
-            <w:vAlign w:val="center"/>
-            <w:tcBorders>
-              <w:top w:val="single" w:sz="4" w:color="BFBFBF"/>
-              <w:bottom w:val="single" w:sz="4" w:color="BFBFBF"/>
-              <w:left w:val="single" w:sz="4" w:color="BFBFBF"/>
-              <w:right w:val="single" w:sz="4" w:color="BFBFBF"/>
-            </w:tcBorders>
-            <w:tcMar>
-              <w:top w:w="80" w:type="dxa"/>
-              <w:bottom w:w="80" w:type="dxa"/>
-              <w:start w:w="120" w:type="dxa"/>
-              <w:end w:w="120" w:type="dxa"/>
-            </w:tcMar>
-          </w:tcPr>
-          <w:p>
-            <w:pPr>
-              <w:spacing w:after="40"/>
-            </w:pPr>
-            <w:r/>
-            <w:r>
-              <w:rPr>
-                <w:rFonts w:ascii="メイリオ" w:hAnsi="メイリオ" w:eastAsia="メイリオ"/>
-                <w:b w:val="0"/>
-                <w:sz w:val="20"/>
-              </w:rPr>
-              <w:t>7/1または7/2に材料が入荷し巻ける</w:t>
-            </w:r>
-          </w:p>
-        </w:tc>
-      </w:tr>
-      <w:tr>
-        <w:tc>
-          <w:tcPr>
-            <w:tcW w:type="dxa" w:w="4986"/>
-            <w:vAlign w:val="center"/>
-            <w:shd w:val="clear" w:color="auto" w:fill="EDF2FA"/>
-            <w:tcBorders>
-              <w:top w:val="single" w:sz="4" w:color="BFBFBF"/>
-              <w:bottom w:val="single" w:sz="4" w:color="BFBFBF"/>
-              <w:left w:val="single" w:sz="4" w:color="BFBFBF"/>
-              <w:right w:val="single" w:sz="4" w:color="BFBFBF"/>
-            </w:tcBorders>
-            <w:tcMar>
-              <w:top w:w="80" w:type="dxa"/>
-              <w:bottom w:w="80" w:type="dxa"/>
-              <w:start w:w="120" w:type="dxa"/>
-              <w:end w:w="120" w:type="dxa"/>
-            </w:tcMar>
-          </w:tcPr>
-          <w:p>
-            <w:pPr>
-              <w:spacing w:after="0"/>
-            </w:pPr>
-            <w:r/>
-            <w:r>
-              <w:rPr>
-                <w:rFonts w:ascii="メイリオ" w:hAnsi="メイリオ" w:eastAsia="メイリオ"/>
-                <w:b/>
-                <w:sz w:val="21"/>
-              </w:rPr>
-              <w:t>夜明</w:t>
-            </w:r>
-          </w:p>
-        </w:tc>
-        <w:tc>
-          <w:tcPr>
-            <w:tcW w:type="dxa" w:w="4986"/>
-            <w:vAlign w:val="center"/>
-            <w:tcBorders>
-              <w:top w:val="single" w:sz="4" w:color="BFBFBF"/>
-              <w:bottom w:val="single" w:sz="4" w:color="BFBFBF"/>
-              <w:left w:val="single" w:sz="4" w:color="BFBFBF"/>
-              <w:right w:val="single" w:sz="4" w:color="BFBFBF"/>
-            </w:tcBorders>
-            <w:tcMar>
-              <w:top w:w="80" w:type="dxa"/>
-              <w:bottom w:w="80" w:type="dxa"/>
-              <w:start w:w="120" w:type="dxa"/>
-              <w:end w:w="120" w:type="dxa"/>
-            </w:tcMar>
-          </w:tcPr>
-          <w:p>
-            <w:pPr>
-              <w:spacing w:after="40"/>
-            </w:pPr>
-            <w:r/>
-            <w:r>
-              <w:rPr>
-                <w:rFonts w:ascii="メイリオ" w:hAnsi="メイリオ" w:eastAsia="メイリオ"/>
-                <w:b w:val="0"/>
-                <w:sz w:val="20"/>
-              </w:rPr>
-              <w:t>・端子が工程通りに入るか要確認（コイル単品では工程通り）</w:t>
-            </w:r>
-          </w:p>
-          <w:p>
-            <w:pPr>
-              <w:spacing w:after="40"/>
-            </w:pPr>
-            <w:r>
-              <w:rPr>
-                <w:rFonts w:ascii="メイリオ" w:hAnsi="メイリオ" w:eastAsia="メイリオ"/>
-                <w:b w:val="0"/>
-                <w:sz w:val="20"/>
-              </w:rPr>
-              <w:t>・絶縁物が8/28頃入荷</w:t>
-            </w:r>
-          </w:p>
-        </w:tc>
-      </w:tr>
-      <w:tr>
-        <w:tc>
-          <w:tcPr>
-            <w:tcW w:type="dxa" w:w="4986"/>
-            <w:vAlign w:val="center"/>
-            <w:shd w:val="clear" w:color="auto" w:fill="EDF2FA"/>
-            <w:tcBorders>
-              <w:top w:val="single" w:sz="4" w:color="BFBFBF"/>
-              <w:bottom w:val="single" w:sz="4" w:color="BFBFBF"/>
-              <w:left w:val="single" w:sz="4" w:color="BFBFBF"/>
-              <w:right w:val="single" w:sz="4" w:color="BFBFBF"/>
-            </w:tcBorders>
-            <w:tcMar>
-              <w:top w:w="80" w:type="dxa"/>
-              <w:bottom w:w="80" w:type="dxa"/>
-              <w:start w:w="120" w:type="dxa"/>
-              <w:end w:w="120" w:type="dxa"/>
-            </w:tcMar>
-          </w:tcPr>
-          <w:p>
-            <w:pPr>
-              <w:spacing w:after="0"/>
-            </w:pPr>
-            <w:r/>
-            <w:r>
-              <w:rPr>
-                <w:rFonts w:ascii="メイリオ" w:hAnsi="メイリオ" w:eastAsia="メイリオ"/>
-                <w:b/>
-                <w:sz w:val="21"/>
-              </w:rPr>
-              <w:t>黒川</w:t>
-            </w:r>
-          </w:p>
-        </w:tc>
-        <w:tc>
-          <w:tcPr>
-            <w:tcW w:type="dxa" w:w="4986"/>
-            <w:vAlign w:val="center"/>
-            <w:tcBorders>
-              <w:top w:val="single" w:sz="4" w:color="BFBFBF"/>
-              <w:bottom w:val="single" w:sz="4" w:color="BFBFBF"/>
-              <w:left w:val="single" w:sz="4" w:color="BFBFBF"/>
-              <w:right w:val="single" w:sz="4" w:color="BFBFBF"/>
-            </w:tcBorders>
-            <w:tcMar>
-              <w:top w:w="80" w:type="dxa"/>
-              <w:bottom w:w="80" w:type="dxa"/>
-              <w:start w:w="120" w:type="dxa"/>
-              <w:end w:w="120" w:type="dxa"/>
-            </w:tcMar>
-          </w:tcPr>
-          <w:p>
-            <w:pPr>
-              <w:spacing w:after="40"/>
-            </w:pPr>
-            <w:r/>
-            <w:r>
-              <w:rPr>
-                <w:rFonts w:ascii="メイリオ" w:hAnsi="メイリオ" w:eastAsia="メイリオ"/>
-                <w:b w:val="0"/>
-                <w:sz w:val="20"/>
-              </w:rPr>
-              <w:t>・端子が工程通りに入るか要確認（コイル単品では工程通り）</w:t>
-            </w:r>
-          </w:p>
-          <w:p>
-            <w:pPr>
-              <w:spacing w:after="40"/>
-            </w:pPr>
-            <w:r>
-              <w:rPr>
-                <w:rFonts w:ascii="メイリオ" w:hAnsi="メイリオ" w:eastAsia="メイリオ"/>
-                <w:b w:val="0"/>
-                <w:sz w:val="20"/>
-              </w:rPr>
-              <w:t>・絶縁物が7/15頃入荷</w:t>
-            </w:r>
-          </w:p>
-        </w:tc>
-      </w:tr>
-      <w:tr>
-        <w:tc>
-          <w:tcPr>
-            <w:tcW w:type="dxa" w:w="4986"/>
-            <w:vAlign w:val="center"/>
-            <w:tcBorders>
-              <w:top w:val="single" w:sz="4" w:color="BFBFBF"/>
-              <w:bottom w:val="single" w:sz="4" w:color="BFBFBF"/>
-              <w:left w:val="single" w:sz="4" w:color="BFBFBF"/>
-              <w:right w:val="single" w:sz="4" w:color="BFBFBF"/>
-            </w:tcBorders>
-            <w:tcMar>
-              <w:top w:w="80" w:type="dxa"/>
-              <w:bottom w:w="80" w:type="dxa"/>
-              <w:start w:w="120" w:type="dxa"/>
-              <w:end w:w="120" w:type="dxa"/>
-            </w:tcMar>
-          </w:tcPr>
-          <w:p>
-            <w:pPr>
-              <w:spacing w:after="0"/>
-            </w:pPr>
-            <w:r/>
-            <w:r>
-              <w:rPr>
-                <w:rFonts w:ascii="メイリオ" w:hAnsi="メイリオ" w:eastAsia="メイリオ"/>
-                <w:b/>
-                <w:sz w:val="21"/>
-              </w:rPr>
-              <w:t>板室組立</w:t>
-            </w:r>
-          </w:p>
-        </w:tc>
-        <w:tc>
-          <w:tcPr>
-            <w:tcW w:type="dxa" w:w="4986"/>
-            <w:vAlign w:val="center"/>
-            <w:shd w:val="clear" w:color="auto" w:fill="C45A11"/>
-            <w:tcBorders>
-              <w:top w:val="single" w:sz="4" w:color="BFBFBF"/>
-              <w:bottom w:val="single" w:sz="4" w:color="BFBFBF"/>
-              <w:left w:val="single" w:sz="4" w:color="BFBFBF"/>
-              <w:right w:val="single" w:sz="4" w:color="BFBFBF"/>
-            </w:tcBorders>
-            <w:tcMar>
-              <w:top w:w="80" w:type="dxa"/>
-              <w:bottom w:w="80" w:type="dxa"/>
-              <w:start w:w="120" w:type="dxa"/>
-              <w:end w:w="120" w:type="dxa"/>
-            </w:tcMar>
-          </w:tcPr>
-          <w:p>
-            <w:pPr>
-              <w:spacing w:after="40"/>
-            </w:pPr>
-            <w:r/>
-            <w:r>
-              <w:rPr>
-                <w:rFonts w:ascii="メイリオ" w:hAnsi="メイリオ" w:eastAsia="メイリオ"/>
-                <w:b w:val="0"/>
-                <w:color w:val="FFFFFF"/>
-                <w:sz w:val="20"/>
-              </w:rPr>
-              <w:t>成瀬とほぼ同じタイミング（負荷集中）</w:t>
-            </w:r>
-          </w:p>
-        </w:tc>
-      </w:tr>
-      <w:tr>
-        <w:tc>
-          <w:tcPr>
-            <w:tcW w:type="dxa" w:w="4986"/>
-            <w:vAlign w:val="center"/>
-            <w:shd w:val="clear" w:color="auto" w:fill="EDF2FA"/>
-            <w:tcBorders>
-              <w:top w:val="single" w:sz="4" w:color="BFBFBF"/>
-              <w:bottom w:val="single" w:sz="4" w:color="BFBFBF"/>
-              <w:left w:val="single" w:sz="4" w:color="BFBFBF"/>
-              <w:right w:val="single" w:sz="4" w:color="BFBFBF"/>
-            </w:tcBorders>
-            <w:tcMar>
-              <w:top w:w="80" w:type="dxa"/>
-              <w:bottom w:w="80" w:type="dxa"/>
-              <w:start w:w="120" w:type="dxa"/>
-              <w:end w:w="120" w:type="dxa"/>
-            </w:tcMar>
-          </w:tcPr>
-          <w:p>
-            <w:pPr>
-              <w:spacing w:after="0"/>
-            </w:pPr>
-            <w:r/>
-            <w:r>
-              <w:rPr>
-                <w:rFonts w:ascii="メイリオ" w:hAnsi="メイリオ" w:eastAsia="メイリオ"/>
-                <w:b/>
-                <w:sz w:val="21"/>
-              </w:rPr>
-              <w:t>成瀬</w:t>
-            </w:r>
-          </w:p>
-        </w:tc>
-        <w:tc>
-          <w:tcPr>
-            <w:tcW w:type="dxa" w:w="4986"/>
-            <w:vAlign w:val="center"/>
-            <w:tcBorders>
-              <w:top w:val="single" w:sz="4" w:color="BFBFBF"/>
-              <w:bottom w:val="single" w:sz="4" w:color="BFBFBF"/>
-              <w:left w:val="single" w:sz="4" w:color="BFBFBF"/>
-              <w:right w:val="single" w:sz="4" w:color="BFBFBF"/>
-            </w:tcBorders>
-            <w:tcMar>
-              <w:top w:w="80" w:type="dxa"/>
-              <w:bottom w:w="80" w:type="dxa"/>
-              <w:start w:w="120" w:type="dxa"/>
-              <w:end w:w="120" w:type="dxa"/>
-            </w:tcMar>
-          </w:tcPr>
-          <w:p>
-            <w:pPr>
-              <w:spacing w:after="40"/>
-            </w:pPr>
-            <w:r/>
-            <w:r>
-              <w:rPr>
-                <w:rFonts w:ascii="メイリオ" w:hAnsi="メイリオ" w:eastAsia="メイリオ"/>
-                <w:b w:val="0"/>
-                <w:sz w:val="20"/>
-              </w:rPr>
-              <w:t>・巻き成型・フィン切まで（仕上げまで）はいける</w:t>
-            </w:r>
-          </w:p>
-          <w:p>
-            <w:pPr>
-              <w:spacing w:after="40"/>
-            </w:pPr>
-            <w:r>
-              <w:rPr>
-                <w:rFonts w:ascii="メイリオ" w:hAnsi="メイリオ" w:eastAsia="メイリオ"/>
-                <w:b w:val="0"/>
-                <w:sz w:val="20"/>
-              </w:rPr>
-              <w:t>・その後、層間紙待ち</w:t>
-            </w:r>
-          </w:p>
-        </w:tc>
-      </w:tr>
-      <w:tr>
-        <w:tc>
-          <w:tcPr>
-            <w:tcW w:type="dxa" w:w="4986"/>
-            <w:vAlign w:val="center"/>
-            <w:tcBorders>
-              <w:top w:val="single" w:sz="4" w:color="BFBFBF"/>
-              <w:bottom w:val="single" w:sz="4" w:color="BFBFBF"/>
-              <w:left w:val="single" w:sz="4" w:color="BFBFBF"/>
-              <w:right w:val="single" w:sz="4" w:color="BFBFBF"/>
-            </w:tcBorders>
-            <w:tcMar>
-              <w:top w:w="80" w:type="dxa"/>
-              <w:bottom w:w="80" w:type="dxa"/>
-              <w:start w:w="120" w:type="dxa"/>
-              <w:end w:w="120" w:type="dxa"/>
-            </w:tcMar>
-          </w:tcPr>
-          <w:p>
-            <w:pPr>
-              <w:spacing w:after="0"/>
-            </w:pPr>
-            <w:r/>
-            <w:r>
-              <w:rPr>
-                <w:rFonts w:ascii="メイリオ" w:hAnsi="メイリオ" w:eastAsia="メイリオ"/>
-                <w:b/>
-                <w:sz w:val="21"/>
-              </w:rPr>
-              <w:t>志比内</w:t>
-            </w:r>
-          </w:p>
-        </w:tc>
-        <w:tc>
-          <w:tcPr>
-            <w:tcW w:type="dxa" w:w="4986"/>
-            <w:vAlign w:val="center"/>
-            <w:shd w:val="clear" w:color="auto" w:fill="C45A11"/>
-            <w:tcBorders>
-              <w:top w:val="single" w:sz="4" w:color="BFBFBF"/>
-              <w:bottom w:val="single" w:sz="4" w:color="BFBFBF"/>
-              <w:left w:val="single" w:sz="4" w:color="BFBFBF"/>
-              <w:right w:val="single" w:sz="4" w:color="BFBFBF"/>
-            </w:tcBorders>
-            <w:tcMar>
-              <w:top w:w="80" w:type="dxa"/>
-              <w:bottom w:w="80" w:type="dxa"/>
-              <w:start w:w="120" w:type="dxa"/>
-              <w:end w:w="120" w:type="dxa"/>
-            </w:tcMar>
-          </w:tcPr>
-          <w:p>
-            <w:pPr>
-              <w:spacing w:after="40"/>
-            </w:pPr>
-            <w:r/>
-            <w:r>
-              <w:rPr>
-                <w:rFonts w:ascii="メイリオ" w:hAnsi="メイリオ" w:eastAsia="メイリオ"/>
-                <w:b w:val="0"/>
-                <w:color w:val="FFFFFF"/>
-                <w:sz w:val="20"/>
-              </w:rPr>
-              <w:t>白沢とタイミングがラップする（負荷集中）</w:t>
-            </w:r>
-          </w:p>
-        </w:tc>
-      </w:tr>
-    </w:tbl>
-    <w:p>
-      <w:pPr>
-        <w:spacing w:after="160" w:before="40"/>
-      </w:pPr>
-      <w:r>
-        <w:rPr>
-          <w:rFonts w:ascii="メイリオ" w:hAnsi="メイリオ" w:eastAsia="メイリオ"/>
-          <w:b w:val="0"/>
-          <w:color w:val="595959"/>
-          <w:sz w:val="19"/>
-        </w:rPr>
-        <w:t>岩本＃1・白沢・岩本＃2は特記事項なし。</w:t>
-      </w:r>
-    </w:p>
-    <w:p>
-      <w:pPr>
-        <w:spacing w:before="360" w:after="160"/>
-        <w:shd w:val="clear" w:color="auto" w:fill="1F4E78"/>
-        <w:ind w:left="40"/>
-      </w:pPr>
-      <w:r>
-        <w:rPr>
-          <w:rFonts w:ascii="メイリオ" w:hAnsi="メイリオ" w:eastAsia="メイリオ"/>
-          <w:b/>
-          <w:color w:val="FFFFFF"/>
-          <w:sz w:val="28"/>
-        </w:rPr>
-        <w:t xml:space="preserve">　4　日鉄テックスエンジ・桑原電工について</w:t>
-      </w:r>
-    </w:p>
-    <w:p>
-      <w:pPr>
-        <w:spacing w:after="80" w:before="200"/>
+        <w:spacing w:after="120" w:before="240"/>
+        <w:pBdr>
+          <w:bottom w:val="single" w:sz="6" w:space="1" w:color="1F497D"/>
+        </w:pBdr>
       </w:pPr>
       <w:r>
         <w:rPr>
           <w:rFonts w:ascii="メイリオ" w:hAnsi="メイリオ" w:eastAsia="メイリオ"/>
           <w:b/>
           <w:color w:val="1F497D"/>
-          <w:sz w:val="24"/>
+          <w:sz w:val="26"/>
+        </w:rPr>
+        <w:t>1．層間絶縁紙について</w:t>
+      </w:r>
+    </w:p>
+    <w:p>
+      <w:pPr>
+        <w:spacing w:after="40"/>
+      </w:pPr>
+      <w:r>
+        <w:rPr>
+          <w:rFonts w:ascii="メイリオ" w:hAnsi="メイリオ" w:eastAsia="メイリオ"/>
+          <w:b w:val="0"/>
+          <w:sz w:val="21"/>
+        </w:rPr>
+        <w:t>（太平商工と宮本さん打ち合わせ済み）</w:t>
+      </w:r>
+    </w:p>
+    <w:p>
+      <w:pPr>
+        <w:spacing w:after="40"/>
+      </w:pPr>
+      <w:r>
+        <w:rPr>
+          <w:rFonts w:ascii="メイリオ" w:hAnsi="メイリオ" w:eastAsia="メイリオ"/>
+          <w:b w:val="0"/>
+          <w:sz w:val="21"/>
+        </w:rPr>
+        <w:t>※中東情勢の影響によるリードタイム過多</w:t>
+      </w:r>
+    </w:p>
+    <w:p>
+      <w:pPr>
+        <w:spacing w:after="40"/>
+      </w:pPr>
+      <w:r>
+        <w:rPr>
+          <w:rFonts w:ascii="メイリオ" w:hAnsi="メイリオ" w:eastAsia="メイリオ"/>
+          <w:b w:val="0"/>
+          <w:sz w:val="21"/>
+        </w:rPr>
+        <w:t>材料の入手は、今まで2〜3ヵ月 → 今6ヵ月</w:t>
+      </w:r>
+    </w:p>
+    <w:p>
+      <w:pPr>
+        <w:pStyle w:val="ListBullet"/>
+        <w:spacing w:after="40" w:before="0"/>
+      </w:pPr>
+      <w:r>
+        <w:rPr>
+          <w:rFonts w:ascii="メイリオ" w:hAnsi="メイリオ" w:eastAsia="メイリオ"/>
+          <w:b w:val="0"/>
+          <w:sz w:val="21"/>
+        </w:rPr>
+        <w:t>1　シンフォ</w:t>
+      </w:r>
+    </w:p>
+    <w:p>
+      <w:pPr>
+        <w:pStyle w:val="ListBullet"/>
+        <w:spacing w:after="40" w:before="0"/>
+      </w:pPr>
+      <w:r>
+        <w:rPr>
+          <w:rFonts w:ascii="メイリオ" w:hAnsi="メイリオ" w:eastAsia="メイリオ"/>
+          <w:b w:val="0"/>
+          <w:sz w:val="21"/>
+        </w:rPr>
+        <w:t>2　黒川</w:t>
+      </w:r>
+    </w:p>
+    <w:p>
+      <w:pPr>
+        <w:pStyle w:val="ListBullet"/>
+        <w:spacing w:after="40" w:before="0"/>
+      </w:pPr>
+      <w:r>
+        <w:rPr>
+          <w:rFonts w:ascii="メイリオ" w:hAnsi="メイリオ" w:eastAsia="メイリオ"/>
+          <w:b w:val="0"/>
+          <w:sz w:val="21"/>
+        </w:rPr>
+        <w:t>3　夜明　← ここで材料がショートする</w:t>
+      </w:r>
+    </w:p>
+    <w:p>
+      <w:pPr>
+        <w:pStyle w:val="ListBullet"/>
+        <w:spacing w:after="40" w:before="0"/>
+      </w:pPr>
+      <w:r>
+        <w:rPr>
+          <w:rFonts w:ascii="メイリオ" w:hAnsi="メイリオ" w:eastAsia="メイリオ"/>
+          <w:b w:val="0"/>
+          <w:sz w:val="21"/>
+        </w:rPr>
+        <w:t>4　成瀬　← 新しい材料手配中　9/15に材料完成（そこから抜き約2週間）</w:t>
+      </w:r>
+    </w:p>
+    <w:p>
+      <w:pPr>
+        <w:pStyle w:val="ListBullet"/>
+        <w:spacing w:after="40" w:before="0"/>
+      </w:pPr>
+      <w:r>
+        <w:rPr>
+          <w:rFonts w:ascii="メイリオ" w:hAnsi="メイリオ" w:eastAsia="メイリオ"/>
+          <w:b w:val="0"/>
+          <w:sz w:val="21"/>
+        </w:rPr>
+        <w:t>5　白沢</w:t>
+      </w:r>
+    </w:p>
+    <w:p>
+      <w:pPr>
+        <w:pStyle w:val="ListBullet"/>
+        <w:spacing w:after="40" w:before="0"/>
+      </w:pPr>
+      <w:r>
+        <w:rPr>
+          <w:rFonts w:ascii="メイリオ" w:hAnsi="メイリオ" w:eastAsia="メイリオ"/>
+          <w:b w:val="0"/>
+          <w:sz w:val="21"/>
+        </w:rPr>
+        <w:t>6　志比内</w:t>
+      </w:r>
+    </w:p>
+    <w:p>
+      <w:pPr>
+        <w:pStyle w:val="ListBullet"/>
+        <w:spacing w:after="40" w:before="0"/>
+      </w:pPr>
+      <w:r>
+        <w:rPr>
+          <w:rFonts w:ascii="メイリオ" w:hAnsi="メイリオ" w:eastAsia="メイリオ"/>
+          <w:b w:val="0"/>
+          <w:sz w:val="21"/>
+        </w:rPr>
+        <w:t>7　飯豊川＃1＃2</w:t>
+      </w:r>
+    </w:p>
+    <w:p>
+      <w:pPr>
+        <w:pStyle w:val="ListBullet"/>
+        <w:spacing w:after="40" w:before="0"/>
+      </w:pPr>
+      <w:r>
+        <w:rPr>
+          <w:rFonts w:ascii="メイリオ" w:hAnsi="メイリオ" w:eastAsia="メイリオ"/>
+          <w:b w:val="0"/>
+          <w:sz w:val="21"/>
+        </w:rPr>
+        <w:t>8　岩本＃2＃1</w:t>
+      </w:r>
+    </w:p>
+    <w:p>
+      <w:pPr>
+        <w:spacing w:after="120" w:before="240"/>
+        <w:pBdr>
+          <w:bottom w:val="single" w:sz="6" w:space="1" w:color="1F497D"/>
+        </w:pBdr>
+      </w:pPr>
+      <w:r>
+        <w:rPr>
+          <w:rFonts w:ascii="メイリオ" w:hAnsi="メイリオ" w:eastAsia="メイリオ"/>
+          <w:b/>
+          <w:color w:val="1F497D"/>
+          <w:sz w:val="26"/>
+        </w:rPr>
+        <w:t>2．鉄心工場での工程について（宮本）</w:t>
+      </w:r>
+    </w:p>
+    <w:p>
+      <w:pPr>
+        <w:pStyle w:val="ListBullet"/>
+        <w:spacing w:after="40" w:before="0"/>
+      </w:pPr>
+      <w:r>
+        <w:rPr>
+          <w:rFonts w:ascii="メイリオ" w:hAnsi="メイリオ" w:eastAsia="メイリオ"/>
+          <w:b w:val="0"/>
+          <w:sz w:val="21"/>
+        </w:rPr>
+        <w:t>1　平巻き用のポールピース　→　早くやりたい</w:t>
+      </w:r>
+    </w:p>
+    <w:p>
+      <w:pPr>
+        <w:pStyle w:val="ListBullet"/>
+        <w:spacing w:after="40" w:before="0"/>
+      </w:pPr>
+      <w:r>
+        <w:rPr>
+          <w:rFonts w:ascii="メイリオ" w:hAnsi="メイリオ" w:eastAsia="メイリオ"/>
+          <w:b w:val="0"/>
+          <w:sz w:val="21"/>
+        </w:rPr>
+        <w:t>2　夜明　→　端板の加工は分納でPT検査（客先納品予定）</w:t>
+      </w:r>
+    </w:p>
+    <w:p>
+      <w:pPr>
+        <w:spacing w:after="40"/>
+        <w:ind w:left="283"/>
+      </w:pPr>
+      <w:r>
+        <w:rPr>
+          <w:rFonts w:ascii="メイリオ" w:hAnsi="メイリオ" w:eastAsia="メイリオ"/>
+          <w:b w:val="0"/>
+          <w:sz w:val="21"/>
+        </w:rPr>
+        <w:t>※7/1より加工スタート予定　8/31完了予定（40日程）</w:t>
+      </w:r>
+    </w:p>
+    <w:p>
+      <w:pPr>
+        <w:spacing w:after="40"/>
+        <w:ind w:left="283"/>
+      </w:pPr>
+      <w:r>
+        <w:rPr>
+          <w:rFonts w:ascii="メイリオ" w:hAnsi="メイリオ" w:eastAsia="メイリオ"/>
+          <w:b w:val="0"/>
+          <w:sz w:val="21"/>
+        </w:rPr>
+        <w:t>コイルに渡せるのはお盆前位</w:t>
+      </w:r>
+    </w:p>
+    <w:p>
+      <w:pPr>
+        <w:pStyle w:val="ListBullet"/>
+        <w:spacing w:after="40" w:before="0"/>
+      </w:pPr>
+      <w:r>
+        <w:rPr>
+          <w:rFonts w:ascii="メイリオ" w:hAnsi="メイリオ" w:eastAsia="メイリオ"/>
+          <w:b w:val="0"/>
+          <w:sz w:val="21"/>
+        </w:rPr>
+        <w:t>3　黒川　→　端板の再支給待ち</w:t>
+      </w:r>
+    </w:p>
+    <w:p>
+      <w:pPr>
+        <w:pStyle w:val="ListBullet"/>
+        <w:spacing w:after="40" w:before="0"/>
+      </w:pPr>
+      <w:r>
+        <w:rPr>
+          <w:rFonts w:ascii="メイリオ" w:hAnsi="メイリオ" w:eastAsia="メイリオ"/>
+          <w:b w:val="0"/>
+          <w:sz w:val="21"/>
+        </w:rPr>
+        <w:t>4　成瀬　→　両ねじボルト待ち</w:t>
+      </w:r>
+    </w:p>
+    <w:p>
+      <w:pPr>
+        <w:pStyle w:val="ListBullet"/>
+        <w:spacing w:after="40" w:before="0"/>
+      </w:pPr>
+      <w:r>
+        <w:rPr>
+          <w:rFonts w:ascii="メイリオ" w:hAnsi="メイリオ" w:eastAsia="メイリオ"/>
+          <w:b w:val="0"/>
+          <w:sz w:val="21"/>
+        </w:rPr>
+        <w:t>5　岩本＃1　→　11月頃に進めたい</w:t>
+      </w:r>
+    </w:p>
+    <w:p>
+      <w:pPr>
+        <w:pStyle w:val="ListBullet"/>
+        <w:spacing w:after="40" w:before="0"/>
+      </w:pPr>
+      <w:r>
+        <w:rPr>
+          <w:rFonts w:ascii="メイリオ" w:hAnsi="メイリオ" w:eastAsia="メイリオ"/>
+          <w:b w:val="0"/>
+          <w:sz w:val="21"/>
+        </w:rPr>
+        <w:t>6　志比内　→　11月頃に進めたい</w:t>
+      </w:r>
+    </w:p>
+    <w:p>
+      <w:pPr>
+        <w:pStyle w:val="ListBullet"/>
+        <w:spacing w:after="40" w:before="0"/>
+      </w:pPr>
+      <w:r>
+        <w:rPr>
+          <w:rFonts w:ascii="メイリオ" w:hAnsi="メイリオ" w:eastAsia="メイリオ"/>
+          <w:b w:val="0"/>
+          <w:sz w:val="21"/>
+        </w:rPr>
+        <w:t>7　白沢　→　端板素材の客先支給遅延（素材完成は10月中旬ごろ）</w:t>
+      </w:r>
+    </w:p>
+    <w:p>
+      <w:pPr>
+        <w:pStyle w:val="ListBullet"/>
+        <w:spacing w:after="40" w:before="0"/>
+      </w:pPr>
+      <w:r>
+        <w:rPr>
+          <w:rFonts w:ascii="メイリオ" w:hAnsi="メイリオ" w:eastAsia="メイリオ"/>
+          <w:b w:val="0"/>
+          <w:sz w:val="21"/>
+        </w:rPr>
+        <w:t>8　岩本＃2</w:t>
+      </w:r>
+    </w:p>
+    <w:p>
+      <w:pPr>
+        <w:spacing w:after="120" w:before="240"/>
+        <w:pBdr>
+          <w:bottom w:val="single" w:sz="6" w:space="1" w:color="1F497D"/>
+        </w:pBdr>
+      </w:pPr>
+      <w:r>
+        <w:rPr>
+          <w:rFonts w:ascii="メイリオ" w:hAnsi="メイリオ" w:eastAsia="メイリオ"/>
+          <w:b/>
+          <w:color w:val="1F497D"/>
+          <w:sz w:val="26"/>
+        </w:rPr>
+        <w:t>3．コイル工場での工程について（西村）</w:t>
+      </w:r>
+    </w:p>
+    <w:p>
+      <w:pPr>
+        <w:pStyle w:val="ListBullet"/>
+        <w:spacing w:after="40" w:before="0"/>
+      </w:pPr>
+      <w:r>
+        <w:rPr>
+          <w:rFonts w:ascii="メイリオ" w:hAnsi="メイリオ" w:eastAsia="メイリオ"/>
+          <w:b w:val="0"/>
+          <w:sz w:val="21"/>
+        </w:rPr>
+        <w:t>1　明電舎　→　進んでる</w:t>
+      </w:r>
+    </w:p>
+    <w:p>
+      <w:pPr>
+        <w:pStyle w:val="ListBullet"/>
+        <w:spacing w:after="40" w:before="0"/>
+      </w:pPr>
+      <w:r>
+        <w:rPr>
+          <w:rFonts w:ascii="メイリオ" w:hAnsi="メイリオ" w:eastAsia="メイリオ"/>
+          <w:b w:val="0"/>
+          <w:sz w:val="21"/>
+        </w:rPr>
+        <w:t>2　板室コイル　→　進んでる</w:t>
+      </w:r>
+    </w:p>
+    <w:p>
+      <w:pPr>
+        <w:pStyle w:val="ListBullet"/>
+        <w:spacing w:after="40" w:before="0"/>
+      </w:pPr>
+      <w:r>
+        <w:rPr>
+          <w:rFonts w:ascii="メイリオ" w:hAnsi="メイリオ" w:eastAsia="メイリオ"/>
+          <w:b w:val="0"/>
+          <w:sz w:val="21"/>
+        </w:rPr>
+        <w:t>3　神鋼加古川　→　巻いてもらっている</w:t>
+      </w:r>
+    </w:p>
+    <w:p>
+      <w:pPr>
+        <w:pStyle w:val="ListBullet"/>
+        <w:spacing w:after="40" w:before="0"/>
+      </w:pPr>
+      <w:r>
+        <w:rPr>
+          <w:rFonts w:ascii="メイリオ" w:hAnsi="メイリオ" w:eastAsia="メイリオ"/>
+          <w:b w:val="0"/>
+          <w:sz w:val="21"/>
+        </w:rPr>
+        <w:t>4　シンフォニア　→　7/1or2に材料が入荷し巻ける</w:t>
+      </w:r>
+    </w:p>
+    <w:p>
+      <w:pPr>
+        <w:pStyle w:val="ListBullet"/>
+        <w:spacing w:after="40" w:before="0"/>
+      </w:pPr>
+      <w:r>
+        <w:rPr>
+          <w:rFonts w:ascii="メイリオ" w:hAnsi="メイリオ" w:eastAsia="メイリオ"/>
+          <w:b w:val="0"/>
+          <w:sz w:val="21"/>
+        </w:rPr>
+        <w:t>5　夜明　→　端子が工程通りに入るか　コイル単品では工程通り</w:t>
+      </w:r>
+    </w:p>
+    <w:p>
+      <w:pPr>
+        <w:spacing w:after="40"/>
+        <w:ind w:left="283"/>
+      </w:pPr>
+      <w:r>
+        <w:rPr>
+          <w:rFonts w:ascii="メイリオ" w:hAnsi="メイリオ" w:eastAsia="メイリオ"/>
+          <w:b w:val="0"/>
+          <w:sz w:val="21"/>
+        </w:rPr>
+        <w:t>絶縁物が8/28頃入荷</w:t>
+      </w:r>
+    </w:p>
+    <w:p>
+      <w:pPr>
+        <w:pStyle w:val="ListBullet"/>
+        <w:spacing w:after="40" w:before="0"/>
+      </w:pPr>
+      <w:r>
+        <w:rPr>
+          <w:rFonts w:ascii="メイリオ" w:hAnsi="メイリオ" w:eastAsia="メイリオ"/>
+          <w:b w:val="0"/>
+          <w:sz w:val="21"/>
+        </w:rPr>
+        <w:t>6　黒川　→　端子が工程通りに入るか　コイル単品では工程通り</w:t>
+      </w:r>
+    </w:p>
+    <w:p>
+      <w:pPr>
+        <w:spacing w:after="40"/>
+        <w:ind w:left="283"/>
+      </w:pPr>
+      <w:r>
+        <w:rPr>
+          <w:rFonts w:ascii="メイリオ" w:hAnsi="メイリオ" w:eastAsia="メイリオ"/>
+          <w:b w:val="0"/>
+          <w:sz w:val="21"/>
+        </w:rPr>
+        <w:t>絶縁物が7/15頃入荷</w:t>
+      </w:r>
+    </w:p>
+    <w:p>
+      <w:pPr>
+        <w:pStyle w:val="ListBullet"/>
+        <w:spacing w:after="40" w:before="0"/>
+      </w:pPr>
+      <w:r>
+        <w:rPr>
+          <w:rFonts w:ascii="メイリオ" w:hAnsi="メイリオ" w:eastAsia="メイリオ"/>
+          <w:b w:val="0"/>
+          <w:sz w:val="21"/>
+        </w:rPr>
+        <w:t>7　板室組立　→　成瀬とほぼ同じタイミング（しんどい）</w:t>
+      </w:r>
+    </w:p>
+    <w:p>
+      <w:pPr>
+        <w:pStyle w:val="ListBullet"/>
+        <w:spacing w:after="40" w:before="0"/>
+      </w:pPr>
+      <w:r>
+        <w:rPr>
+          <w:rFonts w:ascii="メイリオ" w:hAnsi="メイリオ" w:eastAsia="メイリオ"/>
+          <w:b w:val="0"/>
+          <w:sz w:val="21"/>
+        </w:rPr>
+        <w:t>8　成瀬　→　巻き成型フィン切まで（仕上げまで）はいける。その後層間紙待ち</w:t>
+      </w:r>
+    </w:p>
+    <w:p>
+      <w:pPr>
+        <w:pStyle w:val="ListBullet"/>
+        <w:spacing w:after="40" w:before="0"/>
+      </w:pPr>
+      <w:r>
+        <w:rPr>
+          <w:rFonts w:ascii="メイリオ" w:hAnsi="メイリオ" w:eastAsia="メイリオ"/>
+          <w:b w:val="0"/>
+          <w:sz w:val="21"/>
+        </w:rPr>
+        <w:t>9　岩本＃1</w:t>
+      </w:r>
+    </w:p>
+    <w:p>
+      <w:pPr>
+        <w:pStyle w:val="ListBullet"/>
+        <w:spacing w:after="40" w:before="0"/>
+      </w:pPr>
+      <w:r>
+        <w:rPr>
+          <w:rFonts w:ascii="メイリオ" w:hAnsi="メイリオ" w:eastAsia="メイリオ"/>
+          <w:b w:val="0"/>
+          <w:sz w:val="21"/>
+        </w:rPr>
+        <w:t>10　白沢</w:t>
+      </w:r>
+    </w:p>
+    <w:p>
+      <w:pPr>
+        <w:pStyle w:val="ListBullet"/>
+        <w:spacing w:after="40" w:before="0"/>
+      </w:pPr>
+      <w:r>
+        <w:rPr>
+          <w:rFonts w:ascii="メイリオ" w:hAnsi="メイリオ" w:eastAsia="メイリオ"/>
+          <w:b w:val="0"/>
+          <w:sz w:val="21"/>
+        </w:rPr>
+        <w:t>11　志比内　→　白沢とタイミングがラップする（しんどい）</w:t>
+      </w:r>
+    </w:p>
+    <w:p>
+      <w:pPr>
+        <w:pStyle w:val="ListBullet"/>
+        <w:spacing w:after="40" w:before="0"/>
+      </w:pPr>
+      <w:r>
+        <w:rPr>
+          <w:rFonts w:ascii="メイリオ" w:hAnsi="メイリオ" w:eastAsia="メイリオ"/>
+          <w:b w:val="0"/>
+          <w:sz w:val="21"/>
+        </w:rPr>
+        <w:t>12　岩本＃2</w:t>
+      </w:r>
+    </w:p>
+    <w:p>
+      <w:pPr>
+        <w:spacing w:after="120" w:before="240"/>
+        <w:pBdr>
+          <w:bottom w:val="single" w:sz="6" w:space="1" w:color="1F497D"/>
+        </w:pBdr>
+      </w:pPr>
+      <w:r>
+        <w:rPr>
+          <w:rFonts w:ascii="メイリオ" w:hAnsi="メイリオ" w:eastAsia="メイリオ"/>
+          <w:b/>
+          <w:color w:val="1F497D"/>
+          <w:sz w:val="26"/>
+        </w:rPr>
+        <w:t>4．日鉄テックスエンジ・桑原電工について</w:t>
+      </w:r>
+    </w:p>
+    <w:p>
+      <w:pPr>
+        <w:spacing w:after="40" w:before="160"/>
+      </w:pPr>
+      <w:r>
+        <w:rPr>
+          <w:rFonts w:ascii="メイリオ" w:hAnsi="メイリオ" w:eastAsia="メイリオ"/>
+          <w:b/>
+          <w:sz w:val="22"/>
         </w:rPr>
         <w:t>神鋼加古川　主極（鉄心・コンペン）</w:t>
       </w:r>
@@ -2083,7 +670,7 @@
     <w:p>
       <w:pPr>
         <w:pStyle w:val="ListBullet"/>
-        <w:spacing w:after="60" w:before="0" w:line="276" w:lineRule="auto"/>
+        <w:spacing w:after="40" w:before="0"/>
       </w:pPr>
       <w:r>
         <w:rPr>
@@ -2091,19 +678,18 @@
           <w:b w:val="0"/>
           <w:sz w:val="21"/>
         </w:rPr>
-        <w:t>三谷での作業は終了（現在、電研にて製作中）</w:t>
+        <w:t>三谷作業は終了（現在、電研で製作中）</w:t>
       </w:r>
     </w:p>
     <w:p>
       <w:pPr>
-        <w:spacing w:after="80" w:before="200"/>
+        <w:spacing w:after="40" w:before="160"/>
       </w:pPr>
       <w:r>
         <w:rPr>
           <w:rFonts w:ascii="メイリオ" w:hAnsi="メイリオ" w:eastAsia="メイリオ"/>
           <w:b/>
-          <w:color w:val="1F497D"/>
-          <w:sz w:val="24"/>
+          <w:sz w:val="22"/>
         </w:rPr>
         <w:t>神鋼加古川　補極　2極</w:t>
       </w:r>
@@ -2111,7 +697,7 @@
     <w:p>
       <w:pPr>
         <w:pStyle w:val="ListBullet"/>
-        <w:spacing w:after="60" w:before="0" w:line="276" w:lineRule="auto"/>
+        <w:spacing w:after="40" w:before="0"/>
       </w:pPr>
       <w:r>
         <w:rPr>
@@ -2125,7 +711,7 @@
     <w:p>
       <w:pPr>
         <w:pStyle w:val="ListBullet"/>
-        <w:spacing w:after="60" w:before="0" w:line="276" w:lineRule="auto"/>
+        <w:spacing w:after="40" w:before="0"/>
       </w:pPr>
       <w:r>
         <w:rPr>
@@ -2139,7 +725,7 @@
     <w:p>
       <w:pPr>
         <w:pStyle w:val="ListBullet"/>
-        <w:spacing w:after="60" w:before="0" w:line="276" w:lineRule="auto"/>
+        <w:spacing w:after="40" w:before="0"/>
       </w:pPr>
       <w:r>
         <w:rPr>
@@ -2147,28 +733,13 @@
           <w:b w:val="0"/>
           <w:sz w:val="21"/>
         </w:rPr>
-        <w:t>組立：7/16よりポール組み立て開始予定（7月上旬）</w:t>
-      </w:r>
-    </w:p>
-    <w:p>
-      <w:pPr>
-        <w:pStyle w:val="ListBullet2"/>
-        <w:spacing w:after="60" w:before="0" w:line="276" w:lineRule="auto"/>
-      </w:pPr>
-      <w:r>
-        <w:rPr>
-          <w:rFonts w:ascii="メイリオ" w:hAnsi="メイリオ" w:eastAsia="メイリオ"/>
-          <w:b/>
-          <w:color w:val="C45A11"/>
-          <w:sz w:val="21"/>
-        </w:rPr>
-        <w:t xml:space="preserve">　→ マット6に間に合うか、磯田さんが確認</w:t>
+        <w:t>組立　7/16よりポール組み立て開始　マット6に間に合うか？（磯田確認）　7月上旬予定</w:t>
       </w:r>
     </w:p>
     <w:p>
       <w:pPr>
         <w:pStyle w:val="ListBullet"/>
-        <w:spacing w:after="60" w:before="0" w:line="276" w:lineRule="auto"/>
+        <w:spacing w:after="40" w:before="0"/>
       </w:pPr>
       <w:r>
         <w:rPr>
@@ -2176,52 +747,26 @@
           <w:b w:val="0"/>
           <w:sz w:val="21"/>
         </w:rPr>
-        <w:t>細かい部品が入っているか、西原さんが確認</w:t>
+        <w:t>細かい部品が入っているか確認（西原）</w:t>
       </w:r>
     </w:p>
-    <w:p/>
     <w:p>
       <w:pPr>
-        <w:spacing w:after="120"/>
+        <w:spacing w:after="40" w:before="160"/>
       </w:pPr>
       <w:r>
         <w:rPr>
           <w:rFonts w:ascii="メイリオ" w:hAnsi="メイリオ" w:eastAsia="メイリオ"/>
           <w:b/>
-          <w:color w:val="1F497D"/>
-          <w:sz w:val="21"/>
+          <w:sz w:val="22"/>
         </w:rPr>
-        <w:t>以下、F1〜F5の主極・補極　共通納期：2026年9月25日</w:t>
-      </w:r>
-    </w:p>
-    <w:p>
-      <w:pPr>
-        <w:spacing w:before="200" w:after="60"/>
-      </w:pPr>
-      <w:r>
-        <w:rPr>
-          <w:rFonts w:ascii="メイリオ" w:hAnsi="メイリオ" w:eastAsia="メイリオ"/>
-          <w:b/>
-          <w:color w:val="1F497D"/>
-          <w:sz w:val="23"/>
-        </w:rPr>
-        <w:t xml:space="preserve">F1〜3　主極　2極　</w:t>
-      </w:r>
-      <w:r>
-        <w:rPr>
-          <w:rFonts w:ascii="メイリオ" w:hAnsi="メイリオ" w:eastAsia="メイリオ"/>
-          <w:b/>
-          <w:color w:val="FFFFFF"/>
-          <w:sz w:val="19"/>
-          <w:shd w:val="clear" w:color="auto" w:fill="C45A11"/>
-        </w:rPr>
-        <w:t xml:space="preserve">  経過観察  </w:t>
+        <w:t>F1〜3　主極　2極　納期：2026/9/25</w:t>
       </w:r>
     </w:p>
     <w:p>
       <w:pPr>
         <w:pStyle w:val="ListBullet"/>
-        <w:spacing w:after="60" w:before="0" w:line="276" w:lineRule="auto"/>
+        <w:spacing w:after="40" w:before="0"/>
       </w:pPr>
       <w:r>
         <w:rPr>
@@ -2229,13 +774,13 @@
           <w:b w:val="0"/>
           <w:sz w:val="21"/>
         </w:rPr>
-        <w:t>コンペンは入荷済み（検査未・明日検査予定）。バリがあれば鉄心で手仕上げ</w:t>
+        <w:t>コンペンは入荷済み　検査未、明日検査予定</w:t>
       </w:r>
     </w:p>
     <w:p>
       <w:pPr>
-        <w:pStyle w:val="ListBullet"/>
-        <w:spacing w:after="60" w:before="0" w:line="276" w:lineRule="auto"/>
+        <w:pStyle w:val="ListBullet2"/>
+        <w:spacing w:after="40" w:before="0"/>
       </w:pPr>
       <w:r>
         <w:rPr>
@@ -2243,13 +788,55 @@
           <w:b w:val="0"/>
           <w:sz w:val="21"/>
         </w:rPr>
-        <w:t>コイル巻き材料・巻き治具・コア板は入荷済み（治具待ち）</w:t>
+        <w:t>バリの確認　バリ有れば鉄心で手仕上げ</w:t>
       </w:r>
     </w:p>
     <w:p>
       <w:pPr>
         <w:pStyle w:val="ListBullet"/>
-        <w:spacing w:after="60" w:before="0" w:line="276" w:lineRule="auto"/>
+        <w:spacing w:after="40" w:before="0"/>
+      </w:pPr>
+      <w:r>
+        <w:rPr>
+          <w:rFonts w:ascii="メイリオ" w:hAnsi="メイリオ" w:eastAsia="メイリオ"/>
+          <w:b w:val="0"/>
+          <w:sz w:val="21"/>
+        </w:rPr>
+        <w:t>コイル巻きの材料入荷済み</w:t>
+      </w:r>
+    </w:p>
+    <w:p>
+      <w:pPr>
+        <w:pStyle w:val="ListBullet"/>
+        <w:spacing w:after="40" w:before="0"/>
+      </w:pPr>
+      <w:r>
+        <w:rPr>
+          <w:rFonts w:ascii="メイリオ" w:hAnsi="メイリオ" w:eastAsia="メイリオ"/>
+          <w:b w:val="0"/>
+          <w:sz w:val="21"/>
+        </w:rPr>
+        <w:t>巻き治具入荷済み（一部加工先手直し中）</w:t>
+      </w:r>
+    </w:p>
+    <w:p>
+      <w:pPr>
+        <w:pStyle w:val="ListBullet"/>
+        <w:spacing w:after="40" w:before="0"/>
+      </w:pPr>
+      <w:r>
+        <w:rPr>
+          <w:rFonts w:ascii="メイリオ" w:hAnsi="メイリオ" w:eastAsia="メイリオ"/>
+          <w:b w:val="0"/>
+          <w:sz w:val="21"/>
+        </w:rPr>
+        <w:t>コア板入荷済み　→　治具待ち</w:t>
+      </w:r>
+    </w:p>
+    <w:p>
+      <w:pPr>
+        <w:pStyle w:val="ListBullet"/>
+        <w:spacing w:after="40" w:before="0"/>
       </w:pPr>
       <w:r>
         <w:rPr>
@@ -2262,32 +849,21 @@
     </w:p>
     <w:p>
       <w:pPr>
-        <w:spacing w:before="200" w:after="60"/>
+        <w:spacing w:after="40" w:before="160"/>
       </w:pPr>
       <w:r>
         <w:rPr>
           <w:rFonts w:ascii="メイリオ" w:hAnsi="メイリオ" w:eastAsia="メイリオ"/>
           <w:b/>
-          <w:color w:val="1F497D"/>
-          <w:sz w:val="23"/>
+          <w:sz w:val="22"/>
         </w:rPr>
-        <w:t xml:space="preserve">F1〜3　補極　1極　</w:t>
-      </w:r>
-      <w:r>
-        <w:rPr>
-          <w:rFonts w:ascii="メイリオ" w:hAnsi="メイリオ" w:eastAsia="メイリオ"/>
-          <w:b/>
-          <w:color w:val="FFFFFF"/>
-          <w:sz w:val="19"/>
-          <w:shd w:val="clear" w:color="auto" w:fill="8B0000"/>
-        </w:rPr>
-        <w:t xml:space="preserve">  要注意  </w:t>
+        <w:t>F1〜3　補極　1極　納期：2026/9/25</w:t>
       </w:r>
     </w:p>
     <w:p>
       <w:pPr>
         <w:pStyle w:val="ListBullet"/>
-        <w:spacing w:after="60" w:before="0" w:line="276" w:lineRule="auto"/>
+        <w:spacing w:after="40" w:before="0"/>
       </w:pPr>
       <w:r>
         <w:rPr>
@@ -2295,13 +871,13 @@
           <w:b w:val="0"/>
           <w:sz w:val="21"/>
         </w:rPr>
-        <w:t>コア板：数量の懸念は問題なしと確認済みだが、入荷済みのはずの現物が行方不明のため問い合わせ中</w:t>
+        <w:t>インターのコア板の数量が少ないのでは？と疑問あり。→ 問題なし → 入荷済みだが現物行方不明 → 問い合わせ中</w:t>
       </w:r>
     </w:p>
     <w:p>
       <w:pPr>
         <w:pStyle w:val="ListBullet"/>
-        <w:spacing w:after="60" w:before="0" w:line="276" w:lineRule="auto"/>
+        <w:spacing w:after="40" w:before="0"/>
       </w:pPr>
       <w:r>
         <w:rPr>
@@ -2309,27 +885,13 @@
           <w:b w:val="0"/>
           <w:sz w:val="21"/>
         </w:rPr>
-        <w:t>コイル材料は7/中旬入荷予定、治具は7/13入荷予定</w:t>
-      </w:r>
-    </w:p>
-    <w:p>
-      <w:pPr>
-        <w:spacing w:before="200" w:after="60"/>
-      </w:pPr>
-      <w:r>
-        <w:rPr>
-          <w:rFonts w:ascii="メイリオ" w:hAnsi="メイリオ" w:eastAsia="メイリオ"/>
-          <w:b/>
-          <w:color w:val="1F497D"/>
-          <w:sz w:val="23"/>
-        </w:rPr>
-        <w:t xml:space="preserve">F4　主極　</w:t>
+        <w:t>コイル材料7/中旬入荷　治具7/13</w:t>
       </w:r>
     </w:p>
     <w:p>
       <w:pPr>
         <w:pStyle w:val="ListBullet"/>
-        <w:spacing w:after="60" w:before="0" w:line="276" w:lineRule="auto"/>
+        <w:spacing w:after="40" w:before="0"/>
       </w:pPr>
       <w:r>
         <w:rPr>
@@ -2337,13 +899,26 @@
           <w:b w:val="0"/>
           <w:sz w:val="21"/>
         </w:rPr>
-        <w:t>コア板は7/3入荷予定</w:t>
+        <w:t>コア板　問い合わせ中</w:t>
+      </w:r>
+    </w:p>
+    <w:p>
+      <w:pPr>
+        <w:spacing w:after="40" w:before="160"/>
+      </w:pPr>
+      <w:r>
+        <w:rPr>
+          <w:rFonts w:ascii="メイリオ" w:hAnsi="メイリオ" w:eastAsia="メイリオ"/>
+          <w:b/>
+          <w:sz w:val="22"/>
+        </w:rPr>
+        <w:t>F4　主極　納期：2026/9/25</w:t>
       </w:r>
     </w:p>
     <w:p>
       <w:pPr>
         <w:pStyle w:val="ListBullet"/>
-        <w:spacing w:after="60" w:before="0" w:line="276" w:lineRule="auto"/>
+        <w:spacing w:after="40" w:before="0"/>
       </w:pPr>
       <w:r>
         <w:rPr>
@@ -2351,37 +926,13 @@
           <w:b w:val="0"/>
           <w:sz w:val="21"/>
         </w:rPr>
-        <w:t>コイル巻き材料は入荷済み</w:t>
-      </w:r>
-    </w:p>
-    <w:p>
-      <w:pPr>
-        <w:spacing w:before="200" w:after="60"/>
-      </w:pPr>
-      <w:r>
-        <w:rPr>
-          <w:rFonts w:ascii="メイリオ" w:hAnsi="メイリオ" w:eastAsia="メイリオ"/>
-          <w:b/>
-          <w:color w:val="1F497D"/>
-          <w:sz w:val="23"/>
-        </w:rPr>
-        <w:t xml:space="preserve">F4　補極　</w:t>
-      </w:r>
-      <w:r>
-        <w:rPr>
-          <w:rFonts w:ascii="メイリオ" w:hAnsi="メイリオ" w:eastAsia="メイリオ"/>
-          <w:b/>
-          <w:color w:val="FFFFFF"/>
-          <w:sz w:val="19"/>
-          <w:shd w:val="clear" w:color="auto" w:fill="C45A11"/>
-        </w:rPr>
-        <w:t xml:space="preserve">  経過観察  </w:t>
+        <w:t>コア板　7/3予定</w:t>
       </w:r>
     </w:p>
     <w:p>
       <w:pPr>
         <w:pStyle w:val="ListBullet"/>
-        <w:spacing w:after="60" w:before="0" w:line="276" w:lineRule="auto"/>
+        <w:spacing w:after="40" w:before="0"/>
       </w:pPr>
       <w:r>
         <w:rPr>
@@ -2389,13 +940,26 @@
           <w:b w:val="0"/>
           <w:sz w:val="21"/>
         </w:rPr>
-        <w:t>コア板はまだ入荷していない</w:t>
+        <w:t>コイル巻きの材料入荷済み</w:t>
+      </w:r>
+    </w:p>
+    <w:p>
+      <w:pPr>
+        <w:spacing w:after="40" w:before="160"/>
+      </w:pPr>
+      <w:r>
+        <w:rPr>
+          <w:rFonts w:ascii="メイリオ" w:hAnsi="メイリオ" w:eastAsia="メイリオ"/>
+          <w:b/>
+          <w:sz w:val="22"/>
+        </w:rPr>
+        <w:t>F4　補極　納期：2026/9/25</w:t>
       </w:r>
     </w:p>
     <w:p>
       <w:pPr>
         <w:pStyle w:val="ListBullet"/>
-        <w:spacing w:after="60" w:before="0" w:line="276" w:lineRule="auto"/>
+        <w:spacing w:after="40" w:before="0"/>
       </w:pPr>
       <w:r>
         <w:rPr>
@@ -2403,13 +967,13 @@
           <w:b w:val="0"/>
           <w:sz w:val="21"/>
         </w:rPr>
-        <w:t>補助コミュコイル材（支給品）が未着</w:t>
+        <w:t>コア板まだ</w:t>
       </w:r>
     </w:p>
     <w:p>
       <w:pPr>
         <w:pStyle w:val="ListBullet"/>
-        <w:spacing w:after="60" w:before="0" w:line="276" w:lineRule="auto"/>
+        <w:spacing w:after="40" w:before="0"/>
       </w:pPr>
       <w:r>
         <w:rPr>
@@ -2417,37 +981,13 @@
           <w:b w:val="0"/>
           <w:sz w:val="21"/>
         </w:rPr>
-        <w:t>コイル材料は7/中旬入荷予定、治具は7/13入荷予定</w:t>
-      </w:r>
-    </w:p>
-    <w:p>
-      <w:pPr>
-        <w:spacing w:before="200" w:after="60"/>
-      </w:pPr>
-      <w:r>
-        <w:rPr>
-          <w:rFonts w:ascii="メイリオ" w:hAnsi="メイリオ" w:eastAsia="メイリオ"/>
-          <w:b/>
-          <w:color w:val="1F497D"/>
-          <w:sz w:val="23"/>
-        </w:rPr>
-        <w:t xml:space="preserve">F5　主極　</w:t>
-      </w:r>
-      <w:r>
-        <w:rPr>
-          <w:rFonts w:ascii="メイリオ" w:hAnsi="メイリオ" w:eastAsia="メイリオ"/>
-          <w:b/>
-          <w:color w:val="FFFFFF"/>
-          <w:sz w:val="19"/>
-          <w:shd w:val="clear" w:color="auto" w:fill="C45A11"/>
-        </w:rPr>
-        <w:t xml:space="preserve">  経過観察  </w:t>
+        <w:t>補助コミュコイル材　未着（支給品）</w:t>
       </w:r>
     </w:p>
     <w:p>
       <w:pPr>
         <w:pStyle w:val="ListBullet"/>
-        <w:spacing w:after="60" w:before="0" w:line="276" w:lineRule="auto"/>
+        <w:spacing w:after="40" w:before="0"/>
       </w:pPr>
       <w:r>
         <w:rPr>
@@ -2455,13 +995,26 @@
           <w:b w:val="0"/>
           <w:sz w:val="21"/>
         </w:rPr>
-        <w:t>コア板はまだ入荷していない</w:t>
+        <w:t>コイル材料7/中旬入荷　治具7/13</w:t>
+      </w:r>
+    </w:p>
+    <w:p>
+      <w:pPr>
+        <w:spacing w:after="40" w:before="160"/>
+      </w:pPr>
+      <w:r>
+        <w:rPr>
+          <w:rFonts w:ascii="メイリオ" w:hAnsi="メイリオ" w:eastAsia="メイリオ"/>
+          <w:b/>
+          <w:sz w:val="22"/>
+        </w:rPr>
+        <w:t>F5　主極　納期：2026/9/25</w:t>
       </w:r>
     </w:p>
     <w:p>
       <w:pPr>
         <w:pStyle w:val="ListBullet"/>
-        <w:spacing w:after="60" w:before="0" w:line="276" w:lineRule="auto"/>
+        <w:spacing w:after="40" w:before="0"/>
       </w:pPr>
       <w:r>
         <w:rPr>
@@ -2469,37 +1022,13 @@
           <w:b w:val="0"/>
           <w:sz w:val="21"/>
         </w:rPr>
-        <w:t>コイル巻き材料は入荷済み</w:t>
-      </w:r>
-    </w:p>
-    <w:p>
-      <w:pPr>
-        <w:spacing w:before="200" w:after="60"/>
-      </w:pPr>
-      <w:r>
-        <w:rPr>
-          <w:rFonts w:ascii="メイリオ" w:hAnsi="メイリオ" w:eastAsia="メイリオ"/>
-          <w:b/>
-          <w:color w:val="1F497D"/>
-          <w:sz w:val="23"/>
-        </w:rPr>
-        <w:t xml:space="preserve">F5　補極　</w:t>
-      </w:r>
-      <w:r>
-        <w:rPr>
-          <w:rFonts w:ascii="メイリオ" w:hAnsi="メイリオ" w:eastAsia="メイリオ"/>
-          <w:b/>
-          <w:color w:val="FFFFFF"/>
-          <w:sz w:val="19"/>
-          <w:shd w:val="clear" w:color="auto" w:fill="C45A11"/>
-        </w:rPr>
-        <w:t xml:space="preserve">  経過観察  </w:t>
+        <w:t>コア板まだ</w:t>
       </w:r>
     </w:p>
     <w:p>
       <w:pPr>
         <w:pStyle w:val="ListBullet"/>
-        <w:spacing w:after="60" w:before="0" w:line="276" w:lineRule="auto"/>
+        <w:spacing w:after="40" w:before="0"/>
       </w:pPr>
       <w:r>
         <w:rPr>
@@ -2507,13 +1036,26 @@
           <w:b w:val="0"/>
           <w:sz w:val="21"/>
         </w:rPr>
-        <w:t>コア板はまだ入荷していない</w:t>
+        <w:t>コイル巻きの材料入荷済み</w:t>
+      </w:r>
+    </w:p>
+    <w:p>
+      <w:pPr>
+        <w:spacing w:after="40" w:before="160"/>
+      </w:pPr>
+      <w:r>
+        <w:rPr>
+          <w:rFonts w:ascii="メイリオ" w:hAnsi="メイリオ" w:eastAsia="メイリオ"/>
+          <w:b/>
+          <w:sz w:val="22"/>
+        </w:rPr>
+        <w:t>F5　補極　納期：2026/9/25</w:t>
       </w:r>
     </w:p>
     <w:p>
       <w:pPr>
         <w:pStyle w:val="ListBullet"/>
-        <w:spacing w:after="60" w:before="0" w:line="276" w:lineRule="auto"/>
+        <w:spacing w:after="40" w:before="0"/>
       </w:pPr>
       <w:r>
         <w:rPr>
@@ -2521,44 +1063,13 @@
           <w:b w:val="0"/>
           <w:sz w:val="21"/>
         </w:rPr>
-        <w:t>コイル材料は7/中旬入荷予定、治具は7/13入荷予定</w:t>
-      </w:r>
-    </w:p>
-    <w:p>
-      <w:pPr>
-        <w:spacing w:before="360" w:after="160"/>
-        <w:shd w:val="clear" w:color="auto" w:fill="1F4E78"/>
-        <w:ind w:left="40"/>
-      </w:pPr>
-      <w:r>
-        <w:rPr>
-          <w:rFonts w:ascii="メイリオ" w:hAnsi="メイリオ" w:eastAsia="メイリオ"/>
-          <w:b/>
-          <w:color w:val="FFFFFF"/>
-          <w:sz w:val="28"/>
-        </w:rPr>
-        <w:t xml:space="preserve">　5　気になること（懸念事項・今後のアクション）</w:t>
+        <w:t>コア板まだ</w:t>
       </w:r>
     </w:p>
     <w:p>
       <w:pPr>
         <w:pStyle w:val="ListBullet"/>
-        <w:spacing w:after="60" w:before="0" w:line="276" w:lineRule="auto"/>
-      </w:pPr>
-      <w:r>
-        <w:rPr>
-          <w:rFonts w:ascii="メイリオ" w:hAnsi="メイリオ" w:eastAsia="メイリオ"/>
-          <w:b/>
-          <w:color w:val="C00000"/>
-          <w:sz w:val="21"/>
-        </w:rPr>
-        <w:t>上記の問題は、いずれもまだ解決していない</w:t>
-      </w:r>
-    </w:p>
-    <w:p>
-      <w:pPr>
-        <w:pStyle w:val="ListBullet"/>
-        <w:spacing w:after="60" w:before="0" w:line="276" w:lineRule="auto"/>
+        <w:spacing w:after="40" w:before="0"/>
       </w:pPr>
       <w:r>
         <w:rPr>
@@ -2566,13 +1077,30 @@
           <w:b w:val="0"/>
           <w:sz w:val="21"/>
         </w:rPr>
-        <w:t>成瀬の工程をどこまで後ろにずらせるか、検討が必要</w:t>
+        <w:t>コイル材料7/中旬入荷　治具7/13</w:t>
+      </w:r>
+    </w:p>
+    <w:p>
+      <w:pPr>
+        <w:spacing w:after="120" w:before="240"/>
+        <w:pBdr>
+          <w:bottom w:val="single" w:sz="6" w:space="1" w:color="1F497D"/>
+        </w:pBdr>
+      </w:pPr>
+      <w:r>
+        <w:rPr>
+          <w:rFonts w:ascii="メイリオ" w:hAnsi="メイリオ" w:eastAsia="メイリオ"/>
+          <w:b/>
+          <w:color w:val="1F497D"/>
+          <w:sz w:val="26"/>
+        </w:rPr>
+        <w:t>5．気になること</w:t>
       </w:r>
     </w:p>
     <w:p>
       <w:pPr>
         <w:pStyle w:val="ListBullet"/>
-        <w:spacing w:after="60" w:before="0" w:line="276" w:lineRule="auto"/>
+        <w:spacing w:after="40" w:before="0"/>
       </w:pPr>
       <w:r>
         <w:rPr>
@@ -2580,13 +1108,13 @@
           <w:b w:val="0"/>
           <w:sz w:val="21"/>
         </w:rPr>
-        <w:t>TMEIC平巻き用ポールピースが入荷したら、速やかに製造計画会議を開催する</w:t>
+        <w:t>問題解決はしていない</w:t>
       </w:r>
     </w:p>
     <w:p>
       <w:pPr>
         <w:pStyle w:val="ListBullet"/>
-        <w:spacing w:after="60" w:before="0" w:line="276" w:lineRule="auto"/>
+        <w:spacing w:after="40" w:before="0"/>
       </w:pPr>
       <w:r>
         <w:rPr>
@@ -2594,7 +1122,35 @@
           <w:b w:val="0"/>
           <w:sz w:val="21"/>
         </w:rPr>
-        <w:t>志比内についても、図面入手後すぐに着手する</w:t>
+        <w:t>成瀬をどこまでずらしていくか？</w:t>
+      </w:r>
+    </w:p>
+    <w:p>
+      <w:pPr>
+        <w:pStyle w:val="ListBullet"/>
+        <w:spacing w:after="40" w:before="0"/>
+      </w:pPr>
+      <w:r>
+        <w:rPr>
+          <w:rFonts w:ascii="メイリオ" w:hAnsi="メイリオ" w:eastAsia="メイリオ"/>
+          <w:b w:val="0"/>
+          <w:sz w:val="21"/>
+        </w:rPr>
+        <w:t>TMEIC平巻きのポールピース来たら製造計画会議をすぐする</w:t>
+      </w:r>
+    </w:p>
+    <w:p>
+      <w:pPr>
+        <w:pStyle w:val="ListBullet"/>
+        <w:spacing w:after="40" w:before="0"/>
+      </w:pPr>
+      <w:r>
+        <w:rPr>
+          <w:rFonts w:ascii="メイリオ" w:hAnsi="メイリオ" w:eastAsia="メイリオ"/>
+          <w:b w:val="0"/>
+          <w:sz w:val="21"/>
+        </w:rPr>
+        <w:t>志比内も図面入手次第進める</w:t>
       </w:r>
     </w:p>
     <w:p/>
@@ -2613,7 +1169,7 @@
     </w:p>
     <w:sectPr>
       <w:pgSz w:w="12240" w:h="15840"/>
-      <w:pgMar w:top="1020" w:right="1134" w:bottom="1020" w:left="1134" w:header="720" w:footer="720" w:gutter="0"/>
+      <w:pgMar w:top="1134" w:right="1417" w:bottom="1134" w:left="1417" w:header="720" w:footer="720" w:gutter="0"/>
       <w:cols w:space="720"/>
       <w:docGrid w:linePitch="360"/>
     </w:sectPr>
@@ -2984,12 +1540,9 @@
     <w:name w:val="Normal"/>
     <w:qFormat/>
     <w:rsid w:val="00FC693F"/>
-    <w:pPr>
-      <w:spacing w:line="276" w:lineRule="auto"/>
-    </w:pPr>
     <w:rPr>
       <w:rFonts w:ascii="メイリオ" w:hAnsi="メイリオ" w:eastAsia="メイリオ"/>
-      <w:sz w:val="22"/>
+      <w:sz w:val="21"/>
     </w:rPr>
   </w:style>
   <w:style w:type="paragraph" w:styleId="Header">

</xml_diff>

<commit_message>
Align arrow columns in sections 1-2 using borderless tables
https://claude.ai/code/session_01HBPuJMpmbrXasqyXKTkHjP
</commit_message>
<xml_diff>
--- a/議事録_工程会議_20260629.docx
+++ b/議事録_工程会議_20260629.docx
@@ -157,116 +157,406 @@
     </w:p>
     <w:p>
       <w:pPr>
-        <w:pStyle w:val="ListBullet"/>
-        <w:spacing w:after="40" w:before="0"/>
+        <w:spacing w:after="40"/>
       </w:pPr>
-      <w:r>
-        <w:rPr>
-          <w:rFonts w:ascii="メイリオ" w:hAnsi="メイリオ" w:eastAsia="メイリオ"/>
-          <w:b w:val="0"/>
-          <w:sz w:val="21"/>
-        </w:rPr>
-        <w:t>1　シンフォ</w:t>
-      </w:r>
     </w:p>
-    <w:p>
-      <w:pPr>
-        <w:pStyle w:val="ListBullet"/>
-        <w:spacing w:after="40" w:before="0"/>
-      </w:pPr>
-      <w:r>
-        <w:rPr>
-          <w:rFonts w:ascii="メイリオ" w:hAnsi="メイリオ" w:eastAsia="メイリオ"/>
-          <w:b w:val="0"/>
-          <w:sz w:val="21"/>
-        </w:rPr>
-        <w:t>2　黒川</w:t>
-      </w:r>
-    </w:p>
-    <w:p>
-      <w:pPr>
-        <w:pStyle w:val="ListBullet"/>
-        <w:spacing w:after="40" w:before="0"/>
-      </w:pPr>
-      <w:r>
-        <w:rPr>
-          <w:rFonts w:ascii="メイリオ" w:hAnsi="メイリオ" w:eastAsia="メイリオ"/>
-          <w:b w:val="0"/>
-          <w:sz w:val="21"/>
-        </w:rPr>
-        <w:t>3　夜明　← ここで材料がショートする</w:t>
-      </w:r>
-    </w:p>
-    <w:p>
-      <w:pPr>
-        <w:pStyle w:val="ListBullet"/>
-        <w:spacing w:after="40" w:before="0"/>
-      </w:pPr>
-      <w:r>
-        <w:rPr>
-          <w:rFonts w:ascii="メイリオ" w:hAnsi="メイリオ" w:eastAsia="メイリオ"/>
-          <w:b w:val="0"/>
-          <w:sz w:val="21"/>
-        </w:rPr>
-        <w:t>4　成瀬　← 新しい材料手配中　9/15に材料完成（そこから抜き約2週間）</w:t>
-      </w:r>
-    </w:p>
-    <w:p>
-      <w:pPr>
-        <w:pStyle w:val="ListBullet"/>
-        <w:spacing w:after="40" w:before="0"/>
-      </w:pPr>
-      <w:r>
-        <w:rPr>
-          <w:rFonts w:ascii="メイリオ" w:hAnsi="メイリオ" w:eastAsia="メイリオ"/>
-          <w:b w:val="0"/>
-          <w:sz w:val="21"/>
-        </w:rPr>
-        <w:t>5　白沢</w:t>
-      </w:r>
-    </w:p>
-    <w:p>
-      <w:pPr>
-        <w:pStyle w:val="ListBullet"/>
-        <w:spacing w:after="40" w:before="0"/>
-      </w:pPr>
-      <w:r>
-        <w:rPr>
-          <w:rFonts w:ascii="メイリオ" w:hAnsi="メイリオ" w:eastAsia="メイリオ"/>
-          <w:b w:val="0"/>
-          <w:sz w:val="21"/>
-        </w:rPr>
-        <w:t>6　志比内</w:t>
-      </w:r>
-    </w:p>
-    <w:p>
-      <w:pPr>
-        <w:pStyle w:val="ListBullet"/>
-        <w:spacing w:after="40" w:before="0"/>
-      </w:pPr>
-      <w:r>
-        <w:rPr>
-          <w:rFonts w:ascii="メイリオ" w:hAnsi="メイリオ" w:eastAsia="メイリオ"/>
-          <w:b w:val="0"/>
-          <w:sz w:val="21"/>
-        </w:rPr>
-        <w:t>7　飯豊川＃1＃2</w:t>
-      </w:r>
-    </w:p>
-    <w:p>
-      <w:pPr>
-        <w:pStyle w:val="ListBullet"/>
-        <w:spacing w:after="40" w:before="0"/>
-      </w:pPr>
-      <w:r>
-        <w:rPr>
-          <w:rFonts w:ascii="メイリオ" w:hAnsi="メイリオ" w:eastAsia="メイリオ"/>
-          <w:b w:val="0"/>
-          <w:sz w:val="21"/>
-        </w:rPr>
-        <w:t>8　岩本＃2＃1</w:t>
-      </w:r>
-    </w:p>
+    <w:tbl>
+      <w:tblPr>
+        <w:tblW w:type="auto" w:w="0"/>
+        <w:tblLayout w:type="fixed"/>
+        <w:tblLook w:firstColumn="1" w:firstRow="1" w:lastColumn="0" w:lastRow="0" w:noHBand="0" w:noVBand="1" w:val="04A0"/>
+        <w:tblBorders>
+          <w:top w:val="nil"/>
+          <w:left w:val="nil"/>
+          <w:bottom w:val="nil"/>
+          <w:right w:val="nil"/>
+          <w:insideH w:val="nil"/>
+          <w:insideV w:val="nil"/>
+        </w:tblBorders>
+      </w:tblPr>
+      <w:tblGrid>
+        <w:gridCol w:w="2268"/>
+        <w:gridCol w:w="6520"/>
+      </w:tblGrid>
+      <w:tr>
+        <w:tc>
+          <w:tcPr>
+            <w:tcW w:type="dxa" w:w="2268"/>
+            <w:tcMar>
+              <w:top w:w="20" w:type="dxa"/>
+              <w:bottom w:w="20" w:type="dxa"/>
+              <w:start w:w="0" w:type="dxa"/>
+              <w:end w:w="0" w:type="dxa"/>
+            </w:tcMar>
+            <w:vAlign w:val="top"/>
+          </w:tcPr>
+          <w:p>
+            <w:r/>
+            <w:r>
+              <w:rPr>
+                <w:rFonts w:ascii="メイリオ" w:hAnsi="メイリオ" w:eastAsia="メイリオ"/>
+                <w:b w:val="0"/>
+                <w:sz w:val="21"/>
+              </w:rPr>
+              <w:t>1　シンフォ</w:t>
+            </w:r>
+          </w:p>
+        </w:tc>
+        <w:tc>
+          <w:tcPr>
+            <w:tcW w:type="dxa" w:w="6520"/>
+            <w:tcMar>
+              <w:top w:w="20" w:type="dxa"/>
+              <w:bottom w:w="20" w:type="dxa"/>
+              <w:start w:w="0" w:type="dxa"/>
+              <w:end w:w="0" w:type="dxa"/>
+            </w:tcMar>
+            <w:vAlign w:val="top"/>
+          </w:tcPr>
+          <w:p>
+            <w:r/>
+            <w:r>
+              <w:rPr>
+                <w:rFonts w:ascii="メイリオ" w:hAnsi="メイリオ" w:eastAsia="メイリオ"/>
+                <w:b w:val="0"/>
+                <w:sz w:val="21"/>
+              </w:rPr>
+            </w:r>
+          </w:p>
+        </w:tc>
+      </w:tr>
+      <w:tr>
+        <w:tc>
+          <w:tcPr>
+            <w:tcW w:type="dxa" w:w="2268"/>
+            <w:tcMar>
+              <w:top w:w="20" w:type="dxa"/>
+              <w:bottom w:w="20" w:type="dxa"/>
+              <w:start w:w="0" w:type="dxa"/>
+              <w:end w:w="0" w:type="dxa"/>
+            </w:tcMar>
+            <w:vAlign w:val="top"/>
+          </w:tcPr>
+          <w:p>
+            <w:r/>
+            <w:r>
+              <w:rPr>
+                <w:rFonts w:ascii="メイリオ" w:hAnsi="メイリオ" w:eastAsia="メイリオ"/>
+                <w:b w:val="0"/>
+                <w:sz w:val="21"/>
+              </w:rPr>
+              <w:t>2　黒川</w:t>
+            </w:r>
+          </w:p>
+        </w:tc>
+        <w:tc>
+          <w:tcPr>
+            <w:tcW w:type="dxa" w:w="6520"/>
+            <w:tcMar>
+              <w:top w:w="20" w:type="dxa"/>
+              <w:bottom w:w="20" w:type="dxa"/>
+              <w:start w:w="0" w:type="dxa"/>
+              <w:end w:w="0" w:type="dxa"/>
+            </w:tcMar>
+            <w:vAlign w:val="top"/>
+          </w:tcPr>
+          <w:p>
+            <w:r/>
+            <w:r>
+              <w:rPr>
+                <w:rFonts w:ascii="メイリオ" w:hAnsi="メイリオ" w:eastAsia="メイリオ"/>
+                <w:b w:val="0"/>
+                <w:sz w:val="21"/>
+              </w:rPr>
+            </w:r>
+          </w:p>
+        </w:tc>
+      </w:tr>
+      <w:tr>
+        <w:tc>
+          <w:tcPr>
+            <w:tcW w:type="dxa" w:w="2268"/>
+            <w:tcMar>
+              <w:top w:w="20" w:type="dxa"/>
+              <w:bottom w:w="20" w:type="dxa"/>
+              <w:start w:w="0" w:type="dxa"/>
+              <w:end w:w="0" w:type="dxa"/>
+            </w:tcMar>
+            <w:vAlign w:val="top"/>
+          </w:tcPr>
+          <w:p>
+            <w:r/>
+            <w:r>
+              <w:rPr>
+                <w:rFonts w:ascii="メイリオ" w:hAnsi="メイリオ" w:eastAsia="メイリオ"/>
+                <w:b w:val="0"/>
+                <w:sz w:val="21"/>
+              </w:rPr>
+              <w:t>3　夜明</w:t>
+            </w:r>
+          </w:p>
+        </w:tc>
+        <w:tc>
+          <w:tcPr>
+            <w:tcW w:type="dxa" w:w="6520"/>
+            <w:tcMar>
+              <w:top w:w="20" w:type="dxa"/>
+              <w:bottom w:w="20" w:type="dxa"/>
+              <w:start w:w="0" w:type="dxa"/>
+              <w:end w:w="0" w:type="dxa"/>
+            </w:tcMar>
+            <w:vAlign w:val="top"/>
+          </w:tcPr>
+          <w:p>
+            <w:r/>
+            <w:r>
+              <w:rPr>
+                <w:rFonts w:ascii="メイリオ" w:hAnsi="メイリオ" w:eastAsia="メイリオ"/>
+                <w:b w:val="0"/>
+                <w:sz w:val="21"/>
+              </w:rPr>
+              <w:t>←　ここで材料がショートする</w:t>
+            </w:r>
+          </w:p>
+        </w:tc>
+      </w:tr>
+      <w:tr>
+        <w:tc>
+          <w:tcPr>
+            <w:tcW w:type="dxa" w:w="2268"/>
+            <w:tcMar>
+              <w:top w:w="20" w:type="dxa"/>
+              <w:bottom w:w="20" w:type="dxa"/>
+              <w:start w:w="0" w:type="dxa"/>
+              <w:end w:w="0" w:type="dxa"/>
+            </w:tcMar>
+            <w:vAlign w:val="top"/>
+          </w:tcPr>
+          <w:p>
+            <w:r/>
+            <w:r>
+              <w:rPr>
+                <w:rFonts w:ascii="メイリオ" w:hAnsi="メイリオ" w:eastAsia="メイリオ"/>
+                <w:b w:val="0"/>
+                <w:sz w:val="21"/>
+              </w:rPr>
+              <w:t>4　成瀬</w:t>
+            </w:r>
+          </w:p>
+        </w:tc>
+        <w:tc>
+          <w:tcPr>
+            <w:tcW w:type="dxa" w:w="6520"/>
+            <w:tcMar>
+              <w:top w:w="20" w:type="dxa"/>
+              <w:bottom w:w="20" w:type="dxa"/>
+              <w:start w:w="0" w:type="dxa"/>
+              <w:end w:w="0" w:type="dxa"/>
+            </w:tcMar>
+            <w:vAlign w:val="top"/>
+          </w:tcPr>
+          <w:p>
+            <w:r/>
+            <w:r>
+              <w:rPr>
+                <w:rFonts w:ascii="メイリオ" w:hAnsi="メイリオ" w:eastAsia="メイリオ"/>
+                <w:b w:val="0"/>
+                <w:sz w:val="21"/>
+              </w:rPr>
+              <w:t>←　新しい材料手配中　9/15に材料完成（そこから抜き約2週間）</w:t>
+            </w:r>
+          </w:p>
+        </w:tc>
+      </w:tr>
+      <w:tr>
+        <w:tc>
+          <w:tcPr>
+            <w:tcW w:type="dxa" w:w="2268"/>
+            <w:tcMar>
+              <w:top w:w="20" w:type="dxa"/>
+              <w:bottom w:w="20" w:type="dxa"/>
+              <w:start w:w="0" w:type="dxa"/>
+              <w:end w:w="0" w:type="dxa"/>
+            </w:tcMar>
+            <w:vAlign w:val="top"/>
+          </w:tcPr>
+          <w:p>
+            <w:r/>
+            <w:r>
+              <w:rPr>
+                <w:rFonts w:ascii="メイリオ" w:hAnsi="メイリオ" w:eastAsia="メイリオ"/>
+                <w:b w:val="0"/>
+                <w:sz w:val="21"/>
+              </w:rPr>
+              <w:t>5　白沢</w:t>
+            </w:r>
+          </w:p>
+        </w:tc>
+        <w:tc>
+          <w:tcPr>
+            <w:tcW w:type="dxa" w:w="6520"/>
+            <w:tcMar>
+              <w:top w:w="20" w:type="dxa"/>
+              <w:bottom w:w="20" w:type="dxa"/>
+              <w:start w:w="0" w:type="dxa"/>
+              <w:end w:w="0" w:type="dxa"/>
+            </w:tcMar>
+            <w:vAlign w:val="top"/>
+          </w:tcPr>
+          <w:p>
+            <w:r/>
+            <w:r>
+              <w:rPr>
+                <w:rFonts w:ascii="メイリオ" w:hAnsi="メイリオ" w:eastAsia="メイリオ"/>
+                <w:b w:val="0"/>
+                <w:sz w:val="21"/>
+              </w:rPr>
+            </w:r>
+          </w:p>
+        </w:tc>
+      </w:tr>
+      <w:tr>
+        <w:tc>
+          <w:tcPr>
+            <w:tcW w:type="dxa" w:w="2268"/>
+            <w:tcMar>
+              <w:top w:w="20" w:type="dxa"/>
+              <w:bottom w:w="20" w:type="dxa"/>
+              <w:start w:w="0" w:type="dxa"/>
+              <w:end w:w="0" w:type="dxa"/>
+            </w:tcMar>
+            <w:vAlign w:val="top"/>
+          </w:tcPr>
+          <w:p>
+            <w:r/>
+            <w:r>
+              <w:rPr>
+                <w:rFonts w:ascii="メイリオ" w:hAnsi="メイリオ" w:eastAsia="メイリオ"/>
+                <w:b w:val="0"/>
+                <w:sz w:val="21"/>
+              </w:rPr>
+              <w:t>6　志比内</w:t>
+            </w:r>
+          </w:p>
+        </w:tc>
+        <w:tc>
+          <w:tcPr>
+            <w:tcW w:type="dxa" w:w="6520"/>
+            <w:tcMar>
+              <w:top w:w="20" w:type="dxa"/>
+              <w:bottom w:w="20" w:type="dxa"/>
+              <w:start w:w="0" w:type="dxa"/>
+              <w:end w:w="0" w:type="dxa"/>
+            </w:tcMar>
+            <w:vAlign w:val="top"/>
+          </w:tcPr>
+          <w:p>
+            <w:r/>
+            <w:r>
+              <w:rPr>
+                <w:rFonts w:ascii="メイリオ" w:hAnsi="メイリオ" w:eastAsia="メイリオ"/>
+                <w:b w:val="0"/>
+                <w:sz w:val="21"/>
+              </w:rPr>
+            </w:r>
+          </w:p>
+        </w:tc>
+      </w:tr>
+      <w:tr>
+        <w:tc>
+          <w:tcPr>
+            <w:tcW w:type="dxa" w:w="2268"/>
+            <w:tcMar>
+              <w:top w:w="20" w:type="dxa"/>
+              <w:bottom w:w="20" w:type="dxa"/>
+              <w:start w:w="0" w:type="dxa"/>
+              <w:end w:w="0" w:type="dxa"/>
+            </w:tcMar>
+            <w:vAlign w:val="top"/>
+          </w:tcPr>
+          <w:p>
+            <w:r/>
+            <w:r>
+              <w:rPr>
+                <w:rFonts w:ascii="メイリオ" w:hAnsi="メイリオ" w:eastAsia="メイリオ"/>
+                <w:b w:val="0"/>
+                <w:sz w:val="21"/>
+              </w:rPr>
+              <w:t>7　飯豊川＃1＃2</w:t>
+            </w:r>
+          </w:p>
+        </w:tc>
+        <w:tc>
+          <w:tcPr>
+            <w:tcW w:type="dxa" w:w="6520"/>
+            <w:tcMar>
+              <w:top w:w="20" w:type="dxa"/>
+              <w:bottom w:w="20" w:type="dxa"/>
+              <w:start w:w="0" w:type="dxa"/>
+              <w:end w:w="0" w:type="dxa"/>
+            </w:tcMar>
+            <w:vAlign w:val="top"/>
+          </w:tcPr>
+          <w:p>
+            <w:r/>
+            <w:r>
+              <w:rPr>
+                <w:rFonts w:ascii="メイリオ" w:hAnsi="メイリオ" w:eastAsia="メイリオ"/>
+                <w:b w:val="0"/>
+                <w:sz w:val="21"/>
+              </w:rPr>
+            </w:r>
+          </w:p>
+        </w:tc>
+      </w:tr>
+      <w:tr>
+        <w:tc>
+          <w:tcPr>
+            <w:tcW w:type="dxa" w:w="2268"/>
+            <w:tcMar>
+              <w:top w:w="20" w:type="dxa"/>
+              <w:bottom w:w="20" w:type="dxa"/>
+              <w:start w:w="0" w:type="dxa"/>
+              <w:end w:w="0" w:type="dxa"/>
+            </w:tcMar>
+            <w:vAlign w:val="top"/>
+          </w:tcPr>
+          <w:p>
+            <w:r/>
+            <w:r>
+              <w:rPr>
+                <w:rFonts w:ascii="メイリオ" w:hAnsi="メイリオ" w:eastAsia="メイリオ"/>
+                <w:b w:val="0"/>
+                <w:sz w:val="21"/>
+              </w:rPr>
+              <w:t>8　岩本＃2＃1</w:t>
+            </w:r>
+          </w:p>
+        </w:tc>
+        <w:tc>
+          <w:tcPr>
+            <w:tcW w:type="dxa" w:w="6520"/>
+            <w:tcMar>
+              <w:top w:w="20" w:type="dxa"/>
+              <w:bottom w:w="20" w:type="dxa"/>
+              <w:start w:w="0" w:type="dxa"/>
+              <w:end w:w="0" w:type="dxa"/>
+            </w:tcMar>
+            <w:vAlign w:val="top"/>
+          </w:tcPr>
+          <w:p>
+            <w:r/>
+            <w:r>
+              <w:rPr>
+                <w:rFonts w:ascii="メイリオ" w:hAnsi="メイリオ" w:eastAsia="メイリオ"/>
+                <w:b w:val="0"/>
+                <w:sz w:val="21"/>
+              </w:rPr>
+            </w:r>
+          </w:p>
+        </w:tc>
+      </w:tr>
+    </w:tbl>
     <w:p>
       <w:pPr>
         <w:spacing w:after="120" w:before="240"/>
@@ -284,146 +574,502 @@
         <w:t>2．鉄心工場での工程について（宮本）</w:t>
       </w:r>
     </w:p>
-    <w:p>
-      <w:pPr>
-        <w:pStyle w:val="ListBullet"/>
-        <w:spacing w:after="40" w:before="0"/>
-      </w:pPr>
-      <w:r>
-        <w:rPr>
-          <w:rFonts w:ascii="メイリオ" w:hAnsi="メイリオ" w:eastAsia="メイリオ"/>
-          <w:b w:val="0"/>
-          <w:sz w:val="21"/>
-        </w:rPr>
-        <w:t>1　平巻き用のポールピース　→　早くやりたい</w:t>
-      </w:r>
-    </w:p>
-    <w:p>
-      <w:pPr>
-        <w:pStyle w:val="ListBullet"/>
-        <w:spacing w:after="40" w:before="0"/>
-      </w:pPr>
-      <w:r>
-        <w:rPr>
-          <w:rFonts w:ascii="メイリオ" w:hAnsi="メイリオ" w:eastAsia="メイリオ"/>
-          <w:b w:val="0"/>
-          <w:sz w:val="21"/>
-        </w:rPr>
-        <w:t>2　夜明　→　端板の加工は分納でPT検査（客先納品予定）</w:t>
-      </w:r>
-    </w:p>
-    <w:p>
-      <w:pPr>
-        <w:spacing w:after="40"/>
-        <w:ind w:left="283"/>
-      </w:pPr>
-      <w:r>
-        <w:rPr>
-          <w:rFonts w:ascii="メイリオ" w:hAnsi="メイリオ" w:eastAsia="メイリオ"/>
-          <w:b w:val="0"/>
-          <w:sz w:val="21"/>
-        </w:rPr>
-        <w:t>※7/1より加工スタート予定　8/31完了予定（40日程）</w:t>
-      </w:r>
-    </w:p>
-    <w:p>
-      <w:pPr>
-        <w:spacing w:after="40"/>
-        <w:ind w:left="283"/>
-      </w:pPr>
-      <w:r>
-        <w:rPr>
-          <w:rFonts w:ascii="メイリオ" w:hAnsi="メイリオ" w:eastAsia="メイリオ"/>
-          <w:b w:val="0"/>
-          <w:sz w:val="21"/>
-        </w:rPr>
-        <w:t>コイルに渡せるのはお盆前位</w:t>
-      </w:r>
-    </w:p>
-    <w:p>
-      <w:pPr>
-        <w:pStyle w:val="ListBullet"/>
-        <w:spacing w:after="40" w:before="0"/>
-      </w:pPr>
-      <w:r>
-        <w:rPr>
-          <w:rFonts w:ascii="メイリオ" w:hAnsi="メイリオ" w:eastAsia="メイリオ"/>
-          <w:b w:val="0"/>
-          <w:sz w:val="21"/>
-        </w:rPr>
-        <w:t>3　黒川　→　端板の再支給待ち</w:t>
-      </w:r>
-    </w:p>
-    <w:p>
-      <w:pPr>
-        <w:pStyle w:val="ListBullet"/>
-        <w:spacing w:after="40" w:before="0"/>
-      </w:pPr>
-      <w:r>
-        <w:rPr>
-          <w:rFonts w:ascii="メイリオ" w:hAnsi="メイリオ" w:eastAsia="メイリオ"/>
-          <w:b w:val="0"/>
-          <w:sz w:val="21"/>
-        </w:rPr>
-        <w:t>4　成瀬　→　両ねじボルト待ち</w:t>
-      </w:r>
-    </w:p>
-    <w:p>
-      <w:pPr>
-        <w:pStyle w:val="ListBullet"/>
-        <w:spacing w:after="40" w:before="0"/>
-      </w:pPr>
-      <w:r>
-        <w:rPr>
-          <w:rFonts w:ascii="メイリオ" w:hAnsi="メイリオ" w:eastAsia="メイリオ"/>
-          <w:b w:val="0"/>
-          <w:sz w:val="21"/>
-        </w:rPr>
-        <w:t>5　岩本＃1　→　11月頃に進めたい</w:t>
-      </w:r>
-    </w:p>
-    <w:p>
-      <w:pPr>
-        <w:pStyle w:val="ListBullet"/>
-        <w:spacing w:after="40" w:before="0"/>
-      </w:pPr>
-      <w:r>
-        <w:rPr>
-          <w:rFonts w:ascii="メイリオ" w:hAnsi="メイリオ" w:eastAsia="メイリオ"/>
-          <w:b w:val="0"/>
-          <w:sz w:val="21"/>
-        </w:rPr>
-        <w:t>6　志比内　→　11月頃に進めたい</w:t>
-      </w:r>
-    </w:p>
-    <w:p>
-      <w:pPr>
-        <w:pStyle w:val="ListBullet"/>
-        <w:spacing w:after="40" w:before="0"/>
-      </w:pPr>
-      <w:r>
-        <w:rPr>
-          <w:rFonts w:ascii="メイリオ" w:hAnsi="メイリオ" w:eastAsia="メイリオ"/>
-          <w:b w:val="0"/>
-          <w:sz w:val="21"/>
-        </w:rPr>
-        <w:t>7　白沢　→　端板素材の客先支給遅延（素材完成は10月中旬ごろ）</w:t>
-      </w:r>
-    </w:p>
-    <w:p>
-      <w:pPr>
-        <w:pStyle w:val="ListBullet"/>
-        <w:spacing w:after="40" w:before="0"/>
-      </w:pPr>
-      <w:r>
-        <w:rPr>
-          <w:rFonts w:ascii="メイリオ" w:hAnsi="メイリオ" w:eastAsia="メイリオ"/>
-          <w:b w:val="0"/>
-          <w:sz w:val="21"/>
-        </w:rPr>
-        <w:t>8　岩本＃2</w:t>
-      </w:r>
-    </w:p>
+    <w:tbl>
+      <w:tblPr>
+        <w:tblW w:type="auto" w:w="0"/>
+        <w:tblLayout w:type="fixed"/>
+        <w:tblLook w:firstColumn="1" w:firstRow="1" w:lastColumn="0" w:lastRow="0" w:noHBand="0" w:noVBand="1" w:val="04A0"/>
+        <w:tblBorders>
+          <w:top w:val="nil"/>
+          <w:left w:val="nil"/>
+          <w:bottom w:val="nil"/>
+          <w:right w:val="nil"/>
+          <w:insideH w:val="nil"/>
+          <w:insideV w:val="nil"/>
+        </w:tblBorders>
+      </w:tblPr>
+      <w:tblGrid>
+        <w:gridCol w:w="2948"/>
+        <w:gridCol w:w="5839"/>
+      </w:tblGrid>
+      <w:tr>
+        <w:tc>
+          <w:tcPr>
+            <w:tcW w:type="dxa" w:w="2948"/>
+            <w:tcMar>
+              <w:top w:w="20" w:type="dxa"/>
+              <w:bottom w:w="20" w:type="dxa"/>
+              <w:start w:w="0" w:type="dxa"/>
+              <w:end w:w="0" w:type="dxa"/>
+            </w:tcMar>
+            <w:vAlign w:val="top"/>
+          </w:tcPr>
+          <w:p>
+            <w:r/>
+            <w:r>
+              <w:rPr>
+                <w:rFonts w:ascii="メイリオ" w:hAnsi="メイリオ" w:eastAsia="メイリオ"/>
+                <w:b w:val="0"/>
+                <w:sz w:val="21"/>
+              </w:rPr>
+              <w:t>1　平巻き用のポールピース</w:t>
+            </w:r>
+          </w:p>
+        </w:tc>
+        <w:tc>
+          <w:tcPr>
+            <w:tcW w:type="dxa" w:w="5839"/>
+            <w:tcMar>
+              <w:top w:w="20" w:type="dxa"/>
+              <w:bottom w:w="20" w:type="dxa"/>
+              <w:start w:w="0" w:type="dxa"/>
+              <w:end w:w="0" w:type="dxa"/>
+            </w:tcMar>
+            <w:vAlign w:val="top"/>
+          </w:tcPr>
+          <w:p>
+            <w:r/>
+            <w:r>
+              <w:rPr>
+                <w:rFonts w:ascii="メイリオ" w:hAnsi="メイリオ" w:eastAsia="メイリオ"/>
+                <w:b w:val="0"/>
+                <w:sz w:val="21"/>
+              </w:rPr>
+              <w:t>→　早くやりたい</w:t>
+            </w:r>
+          </w:p>
+        </w:tc>
+      </w:tr>
+      <w:tr>
+        <w:tc>
+          <w:tcPr>
+            <w:tcW w:type="dxa" w:w="2948"/>
+            <w:tcMar>
+              <w:top w:w="20" w:type="dxa"/>
+              <w:bottom w:w="20" w:type="dxa"/>
+              <w:start w:w="0" w:type="dxa"/>
+              <w:end w:w="0" w:type="dxa"/>
+            </w:tcMar>
+            <w:vAlign w:val="top"/>
+          </w:tcPr>
+          <w:p>
+            <w:r/>
+            <w:r>
+              <w:rPr>
+                <w:rFonts w:ascii="メイリオ" w:hAnsi="メイリオ" w:eastAsia="メイリオ"/>
+                <w:b w:val="0"/>
+                <w:sz w:val="21"/>
+              </w:rPr>
+              <w:t>2　夜明</w:t>
+            </w:r>
+          </w:p>
+        </w:tc>
+        <w:tc>
+          <w:tcPr>
+            <w:tcW w:type="dxa" w:w="5839"/>
+            <w:tcMar>
+              <w:top w:w="20" w:type="dxa"/>
+              <w:bottom w:w="20" w:type="dxa"/>
+              <w:start w:w="0" w:type="dxa"/>
+              <w:end w:w="0" w:type="dxa"/>
+            </w:tcMar>
+            <w:vAlign w:val="top"/>
+          </w:tcPr>
+          <w:p>
+            <w:r/>
+            <w:r>
+              <w:rPr>
+                <w:rFonts w:ascii="メイリオ" w:hAnsi="メイリオ" w:eastAsia="メイリオ"/>
+                <w:b w:val="0"/>
+                <w:sz w:val="21"/>
+              </w:rPr>
+              <w:t>→　端板の加工は分納でPT検査（客先納品予定）</w:t>
+            </w:r>
+          </w:p>
+        </w:tc>
+      </w:tr>
+      <w:tr>
+        <w:tc>
+          <w:tcPr>
+            <w:tcW w:type="dxa" w:w="2948"/>
+            <w:tcMar>
+              <w:top w:w="20" w:type="dxa"/>
+              <w:bottom w:w="20" w:type="dxa"/>
+              <w:start w:w="0" w:type="dxa"/>
+              <w:end w:w="0" w:type="dxa"/>
+            </w:tcMar>
+            <w:vAlign w:val="top"/>
+          </w:tcPr>
+          <w:p>
+            <w:r/>
+            <w:r>
+              <w:rPr>
+                <w:rFonts w:ascii="メイリオ" w:hAnsi="メイリオ" w:eastAsia="メイリオ"/>
+                <w:b w:val="0"/>
+                <w:sz w:val="21"/>
+              </w:rPr>
+            </w:r>
+          </w:p>
+        </w:tc>
+        <w:tc>
+          <w:tcPr>
+            <w:tcW w:type="dxa" w:w="5839"/>
+            <w:tcMar>
+              <w:top w:w="20" w:type="dxa"/>
+              <w:bottom w:w="20" w:type="dxa"/>
+              <w:start w:w="0" w:type="dxa"/>
+              <w:end w:w="0" w:type="dxa"/>
+            </w:tcMar>
+            <w:vAlign w:val="top"/>
+          </w:tcPr>
+          <w:p>
+            <w:r/>
+            <w:r>
+              <w:rPr>
+                <w:rFonts w:ascii="メイリオ" w:hAnsi="メイリオ" w:eastAsia="メイリオ"/>
+                <w:b w:val="0"/>
+                <w:sz w:val="21"/>
+              </w:rPr>
+              <w:t xml:space="preserve">　　※7/1より加工スタート予定　8/31完了予定（40日程）</w:t>
+            </w:r>
+          </w:p>
+        </w:tc>
+      </w:tr>
+      <w:tr>
+        <w:tc>
+          <w:tcPr>
+            <w:tcW w:type="dxa" w:w="2948"/>
+            <w:tcMar>
+              <w:top w:w="20" w:type="dxa"/>
+              <w:bottom w:w="20" w:type="dxa"/>
+              <w:start w:w="0" w:type="dxa"/>
+              <w:end w:w="0" w:type="dxa"/>
+            </w:tcMar>
+            <w:vAlign w:val="top"/>
+          </w:tcPr>
+          <w:p>
+            <w:r/>
+            <w:r>
+              <w:rPr>
+                <w:rFonts w:ascii="メイリオ" w:hAnsi="メイリオ" w:eastAsia="メイリオ"/>
+                <w:b w:val="0"/>
+                <w:sz w:val="21"/>
+              </w:rPr>
+            </w:r>
+          </w:p>
+        </w:tc>
+        <w:tc>
+          <w:tcPr>
+            <w:tcW w:type="dxa" w:w="5839"/>
+            <w:tcMar>
+              <w:top w:w="20" w:type="dxa"/>
+              <w:bottom w:w="20" w:type="dxa"/>
+              <w:start w:w="0" w:type="dxa"/>
+              <w:end w:w="0" w:type="dxa"/>
+            </w:tcMar>
+            <w:vAlign w:val="top"/>
+          </w:tcPr>
+          <w:p>
+            <w:r/>
+            <w:r>
+              <w:rPr>
+                <w:rFonts w:ascii="メイリオ" w:hAnsi="メイリオ" w:eastAsia="メイリオ"/>
+                <w:b w:val="0"/>
+                <w:sz w:val="21"/>
+              </w:rPr>
+              <w:t xml:space="preserve">　　コイルに渡せるのはお盆前位</w:t>
+            </w:r>
+          </w:p>
+        </w:tc>
+      </w:tr>
+      <w:tr>
+        <w:tc>
+          <w:tcPr>
+            <w:tcW w:type="dxa" w:w="2948"/>
+            <w:tcMar>
+              <w:top w:w="20" w:type="dxa"/>
+              <w:bottom w:w="20" w:type="dxa"/>
+              <w:start w:w="0" w:type="dxa"/>
+              <w:end w:w="0" w:type="dxa"/>
+            </w:tcMar>
+            <w:vAlign w:val="top"/>
+          </w:tcPr>
+          <w:p>
+            <w:r/>
+            <w:r>
+              <w:rPr>
+                <w:rFonts w:ascii="メイリオ" w:hAnsi="メイリオ" w:eastAsia="メイリオ"/>
+                <w:b w:val="0"/>
+                <w:sz w:val="21"/>
+              </w:rPr>
+              <w:t>3　黒川</w:t>
+            </w:r>
+          </w:p>
+        </w:tc>
+        <w:tc>
+          <w:tcPr>
+            <w:tcW w:type="dxa" w:w="5839"/>
+            <w:tcMar>
+              <w:top w:w="20" w:type="dxa"/>
+              <w:bottom w:w="20" w:type="dxa"/>
+              <w:start w:w="0" w:type="dxa"/>
+              <w:end w:w="0" w:type="dxa"/>
+            </w:tcMar>
+            <w:vAlign w:val="top"/>
+          </w:tcPr>
+          <w:p>
+            <w:r/>
+            <w:r>
+              <w:rPr>
+                <w:rFonts w:ascii="メイリオ" w:hAnsi="メイリオ" w:eastAsia="メイリオ"/>
+                <w:b w:val="0"/>
+                <w:sz w:val="21"/>
+              </w:rPr>
+              <w:t>→　端板の再支給待ち</w:t>
+            </w:r>
+          </w:p>
+        </w:tc>
+      </w:tr>
+      <w:tr>
+        <w:tc>
+          <w:tcPr>
+            <w:tcW w:type="dxa" w:w="2948"/>
+            <w:tcMar>
+              <w:top w:w="20" w:type="dxa"/>
+              <w:bottom w:w="20" w:type="dxa"/>
+              <w:start w:w="0" w:type="dxa"/>
+              <w:end w:w="0" w:type="dxa"/>
+            </w:tcMar>
+            <w:vAlign w:val="top"/>
+          </w:tcPr>
+          <w:p>
+            <w:r/>
+            <w:r>
+              <w:rPr>
+                <w:rFonts w:ascii="メイリオ" w:hAnsi="メイリオ" w:eastAsia="メイリオ"/>
+                <w:b w:val="0"/>
+                <w:sz w:val="21"/>
+              </w:rPr>
+              <w:t>4　成瀬</w:t>
+            </w:r>
+          </w:p>
+        </w:tc>
+        <w:tc>
+          <w:tcPr>
+            <w:tcW w:type="dxa" w:w="5839"/>
+            <w:tcMar>
+              <w:top w:w="20" w:type="dxa"/>
+              <w:bottom w:w="20" w:type="dxa"/>
+              <w:start w:w="0" w:type="dxa"/>
+              <w:end w:w="0" w:type="dxa"/>
+            </w:tcMar>
+            <w:vAlign w:val="top"/>
+          </w:tcPr>
+          <w:p>
+            <w:r/>
+            <w:r>
+              <w:rPr>
+                <w:rFonts w:ascii="メイリオ" w:hAnsi="メイリオ" w:eastAsia="メイリオ"/>
+                <w:b w:val="0"/>
+                <w:sz w:val="21"/>
+              </w:rPr>
+              <w:t>→　両ねじボルト待ち</w:t>
+            </w:r>
+          </w:p>
+        </w:tc>
+      </w:tr>
+      <w:tr>
+        <w:tc>
+          <w:tcPr>
+            <w:tcW w:type="dxa" w:w="2948"/>
+            <w:tcMar>
+              <w:top w:w="20" w:type="dxa"/>
+              <w:bottom w:w="20" w:type="dxa"/>
+              <w:start w:w="0" w:type="dxa"/>
+              <w:end w:w="0" w:type="dxa"/>
+            </w:tcMar>
+            <w:vAlign w:val="top"/>
+          </w:tcPr>
+          <w:p>
+            <w:r/>
+            <w:r>
+              <w:rPr>
+                <w:rFonts w:ascii="メイリオ" w:hAnsi="メイリオ" w:eastAsia="メイリオ"/>
+                <w:b w:val="0"/>
+                <w:sz w:val="21"/>
+              </w:rPr>
+              <w:t>5　岩本＃1</w:t>
+            </w:r>
+          </w:p>
+        </w:tc>
+        <w:tc>
+          <w:tcPr>
+            <w:tcW w:type="dxa" w:w="5839"/>
+            <w:tcMar>
+              <w:top w:w="20" w:type="dxa"/>
+              <w:bottom w:w="20" w:type="dxa"/>
+              <w:start w:w="0" w:type="dxa"/>
+              <w:end w:w="0" w:type="dxa"/>
+            </w:tcMar>
+            <w:vAlign w:val="top"/>
+          </w:tcPr>
+          <w:p>
+            <w:r/>
+            <w:r>
+              <w:rPr>
+                <w:rFonts w:ascii="メイリオ" w:hAnsi="メイリオ" w:eastAsia="メイリオ"/>
+                <w:b w:val="0"/>
+                <w:sz w:val="21"/>
+              </w:rPr>
+              <w:t>→　11月頃に進めたい</w:t>
+            </w:r>
+          </w:p>
+        </w:tc>
+      </w:tr>
+      <w:tr>
+        <w:tc>
+          <w:tcPr>
+            <w:tcW w:type="dxa" w:w="2948"/>
+            <w:tcMar>
+              <w:top w:w="20" w:type="dxa"/>
+              <w:bottom w:w="20" w:type="dxa"/>
+              <w:start w:w="0" w:type="dxa"/>
+              <w:end w:w="0" w:type="dxa"/>
+            </w:tcMar>
+            <w:vAlign w:val="top"/>
+          </w:tcPr>
+          <w:p>
+            <w:r/>
+            <w:r>
+              <w:rPr>
+                <w:rFonts w:ascii="メイリオ" w:hAnsi="メイリオ" w:eastAsia="メイリオ"/>
+                <w:b w:val="0"/>
+                <w:sz w:val="21"/>
+              </w:rPr>
+              <w:t>6　志比内</w:t>
+            </w:r>
+          </w:p>
+        </w:tc>
+        <w:tc>
+          <w:tcPr>
+            <w:tcW w:type="dxa" w:w="5839"/>
+            <w:tcMar>
+              <w:top w:w="20" w:type="dxa"/>
+              <w:bottom w:w="20" w:type="dxa"/>
+              <w:start w:w="0" w:type="dxa"/>
+              <w:end w:w="0" w:type="dxa"/>
+            </w:tcMar>
+            <w:vAlign w:val="top"/>
+          </w:tcPr>
+          <w:p>
+            <w:r/>
+            <w:r>
+              <w:rPr>
+                <w:rFonts w:ascii="メイリオ" w:hAnsi="メイリオ" w:eastAsia="メイリオ"/>
+                <w:b w:val="0"/>
+                <w:sz w:val="21"/>
+              </w:rPr>
+              <w:t>→　11月頃に進めたい</w:t>
+            </w:r>
+          </w:p>
+        </w:tc>
+      </w:tr>
+      <w:tr>
+        <w:tc>
+          <w:tcPr>
+            <w:tcW w:type="dxa" w:w="2948"/>
+            <w:tcMar>
+              <w:top w:w="20" w:type="dxa"/>
+              <w:bottom w:w="20" w:type="dxa"/>
+              <w:start w:w="0" w:type="dxa"/>
+              <w:end w:w="0" w:type="dxa"/>
+            </w:tcMar>
+            <w:vAlign w:val="top"/>
+          </w:tcPr>
+          <w:p>
+            <w:r/>
+            <w:r>
+              <w:rPr>
+                <w:rFonts w:ascii="メイリオ" w:hAnsi="メイリオ" w:eastAsia="メイリオ"/>
+                <w:b w:val="0"/>
+                <w:sz w:val="21"/>
+              </w:rPr>
+              <w:t>7　白沢</w:t>
+            </w:r>
+          </w:p>
+        </w:tc>
+        <w:tc>
+          <w:tcPr>
+            <w:tcW w:type="dxa" w:w="5839"/>
+            <w:tcMar>
+              <w:top w:w="20" w:type="dxa"/>
+              <w:bottom w:w="20" w:type="dxa"/>
+              <w:start w:w="0" w:type="dxa"/>
+              <w:end w:w="0" w:type="dxa"/>
+            </w:tcMar>
+            <w:vAlign w:val="top"/>
+          </w:tcPr>
+          <w:p>
+            <w:r/>
+            <w:r>
+              <w:rPr>
+                <w:rFonts w:ascii="メイリオ" w:hAnsi="メイリオ" w:eastAsia="メイリオ"/>
+                <w:b w:val="0"/>
+                <w:sz w:val="21"/>
+              </w:rPr>
+              <w:t>→　端板素材の客先支給遅延（素材完成は10月中旬ごろ）</w:t>
+            </w:r>
+          </w:p>
+        </w:tc>
+      </w:tr>
+      <w:tr>
+        <w:tc>
+          <w:tcPr>
+            <w:tcW w:type="dxa" w:w="2948"/>
+            <w:tcMar>
+              <w:top w:w="20" w:type="dxa"/>
+              <w:bottom w:w="20" w:type="dxa"/>
+              <w:start w:w="0" w:type="dxa"/>
+              <w:end w:w="0" w:type="dxa"/>
+            </w:tcMar>
+            <w:vAlign w:val="top"/>
+          </w:tcPr>
+          <w:p>
+            <w:r/>
+            <w:r>
+              <w:rPr>
+                <w:rFonts w:ascii="メイリオ" w:hAnsi="メイリオ" w:eastAsia="メイリオ"/>
+                <w:b w:val="0"/>
+                <w:sz w:val="21"/>
+              </w:rPr>
+              <w:t>8　岩本＃2</w:t>
+            </w:r>
+          </w:p>
+        </w:tc>
+        <w:tc>
+          <w:tcPr>
+            <w:tcW w:type="dxa" w:w="5839"/>
+            <w:tcMar>
+              <w:top w:w="20" w:type="dxa"/>
+              <w:bottom w:w="20" w:type="dxa"/>
+              <w:start w:w="0" w:type="dxa"/>
+              <w:end w:w="0" w:type="dxa"/>
+            </w:tcMar>
+            <w:vAlign w:val="top"/>
+          </w:tcPr>
+          <w:p>
+            <w:r/>
+            <w:r>
+              <w:rPr>
+                <w:rFonts w:ascii="メイリオ" w:hAnsi="メイリオ" w:eastAsia="メイリオ"/>
+                <w:b w:val="0"/>
+                <w:sz w:val="21"/>
+              </w:rPr>
+            </w:r>
+          </w:p>
+        </w:tc>
+      </w:tr>
+    </w:tbl>
     <w:p>
       <w:pPr>
         <w:spacing w:after="120" w:before="240"/>

</xml_diff>